<commit_message>
L'audit de cohérence appliqué : la contre-épreuve 2023 dit ce qu'elle dit, et quatorze retouches
Le contraste entre propriétaires est robuste d'une saison à l'autre, la gratuité
exacte de la voie simple chez VIA ne l'est pas : le texte le dit maintenant.
Aussi : 162 km de courbes rectifiables (cœur seulement), 3 804 contrôles
d'invariant (le vrai compte), 536+442+185+270 = 1 433, la note de population de
la table du biais, la réconciliation des deux marges mesurées, Québec-Toronto
7 h 07 dans la synthèse, et les 328 passages équipés qui ne sont pas « finis ».

Co-Authored-By: Claude Fable 5 <noreply@anthropic.com>
</commit_message>
<xml_diff>
--- a/livrables/rapport_corridor.docx
+++ b/livrables/rapport_corridor.docx
@@ -296,7 +296,7 @@
         <w:t xml:space="preserve"> </w:t>
       </w:r>
       <w:r>
-        <w:t xml:space="preserve">sur Montréal-Toronto (539 km : 5 h 18 à l’horaire) et la perd nettement sur</w:t>
+        <w:t xml:space="preserve">sur Montréal-Toronto (536 km : 5 h 18 à l’horaire) et la perd nettement sur</w:t>
       </w:r>
       <w:r>
         <w:t xml:space="preserve"> </w:t>
@@ -344,7 +344,19 @@
         <w:t xml:space="preserve"> </w:t>
       </w:r>
       <w:r>
-        <w:t xml:space="preserve">au moins jeu égal sur Montréal-Québec (2 h 30 à 3 h 03, soit 88 à 108 pour cent).</w:t>
+        <w:t xml:space="preserve">au moins jeu égal sur Montréal-Québec (2 h 30 à 3 h 03, soit 88 à 108 pour cent). Bout</w:t>
+      </w:r>
+      <w:r>
+        <w:t xml:space="preserve"> </w:t>
+      </w:r>
+      <w:r>
+        <w:t xml:space="preserve">en bout, Québec-Toronto par Montréal passe de 8 h 50 à l’horaire actuel à 7 h 07, arrêt</w:t>
+      </w:r>
+      <w:r>
+        <w:t xml:space="preserve"> </w:t>
+      </w:r>
+      <w:r>
+        <w:t xml:space="preserve">à Montréal compris, si la marge est tenue à la borne normative (figure suivante).</w:t>
       </w:r>
     </w:p>
     <w:p>
@@ -628,7 +640,13 @@
         <w:t xml:space="preserve"> </w:t>
       </w:r>
       <w:r>
-        <w:t xml:space="preserve">voies physiques, parcourues en 1 433 km de trajets) peut donner, ainsi que les cinq</w:t>
+        <w:t xml:space="preserve">voies physiques, les troncs communs à deux trajets comptés une fois, parcourus en</w:t>
+      </w:r>
+      <w:r>
+        <w:t xml:space="preserve"> </w:t>
+      </w:r>
+      <w:r>
+        <w:t xml:space="preserve">1 433 km de trajets) peut donner, ainsi que les cinq</w:t>
       </w:r>
       <w:r>
         <w:t xml:space="preserve"> </w:t>
@@ -2035,7 +2053,7 @@
         <w:t xml:space="preserve"> </w:t>
       </w:r>
       <w:r>
-        <w:t xml:space="preserve">80 points d’une fenêtre glissante de 900 mètres : moyenner autant de points efface le</w:t>
+        <w:t xml:space="preserve">90 points d’une fenêtre glissante de 900 mètres : moyenner autant de points efface le</w:t>
       </w:r>
       <w:r>
         <w:t xml:space="preserve"> </w:t>
@@ -2143,19 +2161,25 @@
         <w:t xml:space="preserve"> </w:t>
       </w:r>
       <w:r>
-        <w:t xml:space="preserve">dans OpenStreetMap, corroborée par les rapports du Bureau de la sécurité des transports</w:t>
-      </w:r>
-      <w:r>
-        <w:t xml:space="preserve"> </w:t>
-      </w:r>
-      <w:r>
-        <w:t xml:space="preserve">(l’écart entre un tronçon double détecté et le même tronçon documenté par le BST est de</w:t>
-      </w:r>
-      <w:r>
-        <w:t xml:space="preserve"> </w:t>
-      </w:r>
-      <w:r>
-        <w:t xml:space="preserve">0,1 km sur 25) ; passages à niveau par l’inventaire officiel ouvert de Transports</w:t>
+        <w:t xml:space="preserve">dans OpenStreetMap, corroborée par recoupement systématique</w:t>
+      </w:r>
+      <w:r>
+        <w:t xml:space="preserve"> </w:t>
+      </w:r>
+      <w:r>
+        <w:t xml:space="preserve">(91 pour cent d’accord sur la partie couverte par les documents d’exploitation publics)</w:t>
+      </w:r>
+      <w:r>
+        <w:t xml:space="preserve"> </w:t>
+      </w:r>
+      <w:r>
+        <w:t xml:space="preserve">et par un contrôle ponctuel contre un rapport du Bureau de la sécurité des transports</w:t>
+      </w:r>
+      <w:r>
+        <w:t xml:space="preserve"> </w:t>
+      </w:r>
+      <w:r>
+        <w:t xml:space="preserve">(0,1 km d’écart sur un tronçon double de 25 km) ; passages à niveau par l’inventaire officiel ouvert de Transports</w:t>
       </w:r>
       <w:r>
         <w:t xml:space="preserve"> </w:t>
@@ -2261,7 +2285,7 @@
         <w:t xml:space="preserve"> </w:t>
       </w:r>
       <w:r>
-        <w:t xml:space="preserve">à niveau (section 6) : les marges mesurées sont donc possiblement gonflées, ce qui est</w:t>
+        <w:t xml:space="preserve">à niveau (section 5) : les marges mesurées sont donc possiblement gonflées, ce qui est</w:t>
       </w:r>
       <w:r>
         <w:t xml:space="preserve"> </w:t>
@@ -2743,7 +2767,7 @@
               <w:pStyle w:val="Compact"/>
             </w:pPr>
             <w:r>
-              <w:t xml:space="preserve">94 km</w:t>
+              <w:t xml:space="preserve">95 km</w:t>
             </w:r>
           </w:p>
         </w:tc>
@@ -3591,7 +3615,31 @@
         <w:t xml:space="preserve"> </w:t>
       </w:r>
       <w:r>
-        <w:t xml:space="preserve">précisément ce que le doublement seul ne change pas.</w:t>
+        <w:t xml:space="preserve">précisément ce que le doublement seul ne change pas. Seconde réserve : cette lecture est</w:t>
+      </w:r>
+      <w:r>
+        <w:t xml:space="preserve"> </w:t>
+      </w:r>
+      <w:r>
+        <w:t xml:space="preserve">celle des horaires courants ; sur les horaires de janvier 2023, les mêmes paires VIA</w:t>
+      </w:r>
+      <w:r>
+        <w:t xml:space="preserve"> </w:t>
+      </w:r>
+      <w:r>
+        <w:t xml:space="preserve">portaient davantage de marge (49 pour cent), sans jamais approcher la voie simple du CN.</w:t>
+      </w:r>
+      <w:r>
+        <w:t xml:space="preserve"> </w:t>
+      </w:r>
+      <w:r>
+        <w:t xml:space="preserve">Le contraste entre propriétaires est robuste d’une saison à l’autre ; la gratuité exacte</w:t>
+      </w:r>
+      <w:r>
+        <w:t xml:space="preserve"> </w:t>
+      </w:r>
+      <w:r>
+        <w:t xml:space="preserve">de la voie simple chez VIA ne l’est pas (section 8).</w:t>
       </w:r>
     </w:p>
     <w:p>
@@ -3887,7 +3935,31 @@
         <w:t xml:space="preserve"> </w:t>
       </w:r>
       <w:r>
-        <w:t xml:space="preserve">Le corridor porte aujourd’hui de 34 à 68 pour cent de marge selon la cellule (table ci-dessus). L’écart entre les deux bornes n’est pas de la</w:t>
+        <w:t xml:space="preserve">Le corridor porte aujourd’hui de 34 à 68 pour cent de marge selon la cellule (table ci-dessus). Ces marges par cellule ne sont pas les marges par</w:t>
+      </w:r>
+      <w:r>
+        <w:t xml:space="preserve"> </w:t>
+      </w:r>
+      <w:r>
+        <w:t xml:space="preserve">tronçon de la section 7 (11 à 32 pour cent) : ici la référence est le temps que la</w:t>
+      </w:r>
+      <w:r>
+        <w:t xml:space="preserve"> </w:t>
+      </w:r>
+      <w:r>
+        <w:t xml:space="preserve">géométrie permet en profil fluide, paires contaminées exclues ; là, le temps de base</w:t>
+      </w:r>
+      <w:r>
+        <w:t xml:space="preserve"> </w:t>
+      </w:r>
+      <w:r>
+        <w:t xml:space="preserve">inclut les blocs urbains figés à l’horaire, qui portent déjà leur propre marge. Le même</w:t>
+      </w:r>
+      <w:r>
+        <w:t xml:space="preserve"> </w:t>
+      </w:r>
+      <w:r>
+        <w:t xml:space="preserve">mot mesure deux références, et chacune sert son usage. L’écart entre les deux bornes n’est pas de la</w:t>
       </w:r>
       <w:r>
         <w:t xml:space="preserve"> </w:t>
@@ -4526,13 +4598,13 @@
         <w:t xml:space="preserve"> </w:t>
       </w:r>
       <w:r>
-        <w:t xml:space="preserve">installé, ce qui change tout son coût en temps [ordres de grandeur 15 vs 45-50 mi/h, soit 24 vs 72-80 km/h,</w:t>
-      </w:r>
-      <w:r>
-        <w:t xml:space="preserve"> </w:t>
-      </w:r>
-      <w:r>
-        <w:t xml:space="preserve">À VÉRIFIER en étude de circulation]) et les sections de</w:t>
+        <w:t xml:space="preserve">installé, ce qui change tout son coût en temps : ordres de grandeur 15 contre</w:t>
+      </w:r>
+      <w:r>
+        <w:t xml:space="preserve"> </w:t>
+      </w:r>
+      <w:r>
+        <w:t xml:space="preserve">45-50 mi/h, soit 24 contre 72-80 km/h, à vérifier en étude de circulation) et les sections de</w:t>
       </w:r>
       <w:r>
         <w:t xml:space="preserve"> </w:t>
@@ -5024,7 +5096,31 @@
         <w:t xml:space="preserve">563 restent à équiper</w:t>
       </w:r>
       <w:r>
-        <w:t xml:space="preserve">. Le tri</w:t>
+        <w:t xml:space="preserve">. Les 328 équipés ne</w:t>
+      </w:r>
+      <w:r>
+        <w:t xml:space="preserve"> </w:t>
+      </w:r>
+      <w:r>
+        <w:t xml:space="preserve">sont pas finis pour autant : leurs barrières sont à deux quadrants (elles ne ferment que</w:t>
+      </w:r>
+      <w:r>
+        <w:t xml:space="preserve"> </w:t>
+      </w:r>
+      <w:r>
+        <w:t xml:space="preserve">les voies d’entrée), et le corridor scellé leur ajoute les bras de sortie, les</w:t>
+      </w:r>
+      <w:r>
+        <w:t xml:space="preserve"> </w:t>
+      </w:r>
+      <w:r>
+        <w:t xml:space="preserve">terre-pleins et la détection ; les 563 autres partent de plus loin (475 passages</w:t>
+      </w:r>
+      <w:r>
+        <w:t xml:space="preserve"> </w:t>
+      </w:r>
+      <w:r>
+        <w:t xml:space="preserve">passifs, 60 avec feux et cloches sans barrières). Le tri</w:t>
       </w:r>
       <w:r>
         <w:t xml:space="preserve"> </w:t>
@@ -5646,7 +5742,7 @@
               <w:pStyle w:val="Compact"/>
             </w:pPr>
             <w:r>
-              <w:t xml:space="preserve">Ottawa-Toronto (444 km)</w:t>
+              <w:t xml:space="preserve">Ottawa-Toronto (442 km)</w:t>
             </w:r>
           </w:p>
         </w:tc>
@@ -5681,7 +5777,7 @@
               <w:pStyle w:val="Compact"/>
             </w:pPr>
             <w:r>
-              <w:t xml:space="preserve">Montréal-Toronto (539 km)</w:t>
+              <w:t xml:space="preserve">Montréal-Toronto (536 km)</w:t>
             </w:r>
           </w:p>
         </w:tc>
@@ -5942,7 +6038,31 @@
         <w:t xml:space="preserve"> </w:t>
       </w:r>
       <w:r>
-        <w:t xml:space="preserve">fourchette) est attribué à ses trois leviers. Les parts « relèvement du plafond » et</w:t>
+        <w:t xml:space="preserve">fourchette) est attribué à ses leviers : quatre parts dans la table jointe, que la</w:t>
+      </w:r>
+      <w:r>
+        <w:t xml:space="preserve"> </w:t>
+      </w:r>
+      <w:r>
+        <w:t xml:space="preserve">figure regroupe en trois tranches (le relèvement du plafond et le train pendulaire y</w:t>
+      </w:r>
+      <w:r>
+        <w:t xml:space="preserve"> </w:t>
+      </w:r>
+      <w:r>
+        <w:t xml:space="preserve">sont fusionnés). Le trajet Québec-Toronto de la figure est composé de Québec-Montréal</w:t>
+      </w:r>
+      <w:r>
+        <w:t xml:space="preserve"> </w:t>
+      </w:r>
+      <w:r>
+        <w:t xml:space="preserve">et de Montréal-Toronto, plus dix minutes d’arrêt à Montréal [HYPOTHÈSE déclarée dans</w:t>
+      </w:r>
+      <w:r>
+        <w:t xml:space="preserve"> </w:t>
+      </w:r>
+      <w:r>
+        <w:t xml:space="preserve">la table]. Les parts « relèvement du plafond » et</w:t>
       </w:r>
       <w:r>
         <w:t xml:space="preserve"> </w:t>
@@ -6004,7 +6124,13 @@
         <w:pStyle w:val="BodyText"/>
       </w:pPr>
       <w:r>
-        <w:t xml:space="preserve">Sensibilités : blocs urbains ±20 pour cent (déjà dans les fourchettes) ; le biais de la fenêtre de mesure sur les segments courts est mesuré et chiffré ci-dessous ; l’immobilisation en gare (2 minutes par arrêt) peut être doublée sans changer</w:t>
+        <w:t xml:space="preserve">Sensibilités : blocs urbains ±20 pour cent, soit de ±4 à ±8 minutes de temps de base</w:t>
+      </w:r>
+      <w:r>
+        <w:t xml:space="preserve"> </w:t>
+      </w:r>
+      <w:r>
+        <w:t xml:space="preserve">selon le tronçon ; le biais de la fenêtre de mesure sur les segments courts est mesuré et chiffré ci-dessous ; l’immobilisation en gare (2 minutes par arrêt) peut être doublée sans changer</w:t>
       </w:r>
       <w:r>
         <w:t xml:space="preserve"> </w:t>
@@ -6118,13 +6244,13 @@
         <w:t xml:space="preserve"> </w:t>
       </w:r>
       <w:r>
-        <w:t xml:space="preserve">les sections à doubler (184 km de segments concernés, définis par un recouvrement d’au</w:t>
-      </w:r>
-      <w:r>
-        <w:t xml:space="preserve"> </w:t>
-      </w:r>
-      <w:r>
-        <w:t xml:space="preserve">moins 70 pour cent avec la voie simple hors gares) étaient rectifiées au plafond</w:t>
+        <w:t xml:space="preserve">les sections à doubler (162 km de segments concernés sur les quatre trajets, définis</w:t>
+      </w:r>
+      <w:r>
+        <w:t xml:space="preserve"> </w:t>
+      </w:r>
+      <w:r>
+        <w:t xml:space="preserve">par un recouvrement d’au moins 70 pour cent avec la voie simple hors gares) étaient rectifiées au plafond</w:t>
       </w:r>
       <w:r>
         <w:t xml:space="preserve"> </w:t>
@@ -6607,7 +6733,19 @@
         <w:pStyle w:val="BodyText"/>
       </w:pPr>
       <w:r>
-        <w:t xml:space="preserve">Sept cent dix des 1 014 segments du cœur sont plus courts que la fenêtre, soit 305 km</w:t>
+        <w:t xml:space="preserve">La table ne compte que les segments où la référence fine est mesurable (877 des 1 014 ;</w:t>
+      </w:r>
+      <w:r>
+        <w:t xml:space="preserve"> </w:t>
+      </w:r>
+      <w:r>
+        <w:t xml:space="preserve">les autres, trop amples pour que la flèche de la courbe dépasse le bruit de la source,</w:t>
+      </w:r>
+      <w:r>
+        <w:t xml:space="preserve"> </w:t>
+      </w:r>
+      <w:r>
+        <w:t xml:space="preserve">n’ont pas de facteur). Sept cent dix des 1 014 segments du cœur sont plus courts que la fenêtre, soit 305 km</w:t>
       </w:r>
       <w:r>
         <w:t xml:space="preserve"> </w:t>
@@ -6886,7 +7024,7 @@
         <w:t xml:space="preserve"> </w:t>
       </w:r>
       <w:r>
-        <w:t xml:space="preserve">entre sa classe et sa vitesse (zéro violation sur 5 040 contrôles), et les zones-témoins</w:t>
+        <w:t xml:space="preserve">entre sa classe et sa vitesse (zéro violation sur 3 804 contrôles), et les zones-témoins</w:t>
       </w:r>
       <w:r>
         <w:t xml:space="preserve"> </w:t>
@@ -6959,13 +7097,37 @@
         <w:t xml:space="preserve"> </w:t>
       </w:r>
       <w:r>
-        <w:t xml:space="preserve">la crise : la hiérarchie entre cellules et les niveaux de marge y sont pratiquement</w:t>
-      </w:r>
-      <w:r>
-        <w:t xml:space="preserve"> </w:t>
-      </w:r>
-      <w:r>
-        <w:t xml:space="preserve">identiques (voie simple CN à 67 pour cent dès 2023). La structure précède la crise.</w:t>
+        <w:t xml:space="preserve">la crise. Le résultat central y tient : la voie simple du CN portait déjà 67 pour cent</w:t>
+      </w:r>
+      <w:r>
+        <w:t xml:space="preserve"> </w:t>
+      </w:r>
+      <w:r>
+        <w:t xml:space="preserve">de marge en 2023, contre 36 pour la voie double ; le coût du régime chez le propriétaire</w:t>
+      </w:r>
+      <w:r>
+        <w:t xml:space="preserve"> </w:t>
+      </w:r>
+      <w:r>
+        <w:t xml:space="preserve">de fret précède la crise. La lecture fine de la voie simple de VIA, elle, dépend de la</w:t>
+      </w:r>
+      <w:r>
+        <w:t xml:space="preserve"> </w:t>
+      </w:r>
+      <w:r>
+        <w:t xml:space="preserve">saison (49 pour cent de marge en 2023, 34 en 2026) : l’écart entre propriétaires reste</w:t>
+      </w:r>
+      <w:r>
+        <w:t xml:space="preserve"> </w:t>
+      </w:r>
+      <w:r>
+        <w:t xml:space="preserve">béant dans les deux saisons, mais la valeur « la voie simple ne coûte rien chez VIA »</w:t>
+      </w:r>
+      <w:r>
+        <w:t xml:space="preserve"> </w:t>
+      </w:r>
+      <w:r>
+        <w:t xml:space="preserve">est celle des horaires courants, et se lit comme telle.</w:t>
       </w:r>
     </w:p>
     <w:p>

</xml_diff>

<commit_message>
Le scénario plafond entre dans la figure et la synthèse, et l'ETCS commence là où l'ITCS s'arrête
Plafond = recommandé + approches urbaines à leur géométrie + courbes des
sections à doubler rectifiées, calculés ensemble par le moteur (note de bas de
page : une borne, pas une promesse). Contrôle intégral relibellé « au-delà de
177 km/h » : au-dessus de la limite du système incrémental, on remplace la
signalisation au lieu de s'y superposer.

Co-Authored-By: Claude Fable 5 <noreply@anthropic.com>
</commit_message>
<xml_diff>
--- a/livrables/rapport_corridor.docx
+++ b/livrables/rapport_corridor.docx
@@ -34,7 +34,7 @@
         <w:t xml:space="preserve">Août 2026</w:t>
       </w:r>
     </w:p>
-    <w:bookmarkStart w:id="15" w:name="synthèse"/>
+    <w:bookmarkStart w:id="16" w:name="synthèse"/>
     <w:p>
       <w:pPr>
         <w:pStyle w:val="Heading1"/>
@@ -227,9 +227,9 @@
       <w:r>
         <w:drawing>
           <wp:inline>
-            <wp:extent cx="5334000" cy="2693759"/>
+            <wp:extent cx="5334000" cy="3329492"/>
             <wp:effectExtent b="0" l="0" r="0" t="0"/>
-            <wp:docPr descr="Le train contre l’auto : chaque barre du scénario recommandé est un temps avec marge, présenté en fourchette, et les pourcentages face à l’auto sont donc eux aussi des bornes. Temps auto : approximation de connaissance générale, en repère." title="" id="10" name="Picture"/>
+            <wp:docPr descr="Le train contre l’auto : chaque barre de scénario est un temps avec marge, présenté en fourchette, et les pourcentages face à l’auto sont donc eux aussi des bornes. Le scénario plafond est le recommandé poussé à sa borne (note de la synthèse). Temps auto : approximation de connaissance générale, en repère." title="" id="10" name="Picture"/>
             <a:graphic>
               <a:graphicData uri="http://schemas.openxmlformats.org/drawingml/2006/picture">
                 <pic:pic>
@@ -248,7 +248,7 @@
                   <pic:spPr bwMode="auto">
                     <a:xfrm>
                       <a:off x="0" y="0"/>
-                      <a:ext cx="5334000" cy="2693759"/>
+                      <a:ext cx="5334000" cy="3329492"/>
                     </a:xfrm>
                     <a:prstGeom prst="rect">
                       <a:avLst/>
@@ -272,7 +272,7 @@
         <w:pStyle w:val="ImageCaption"/>
       </w:pPr>
       <w:r>
-        <w:t xml:space="preserve">Le train contre l’auto : chaque barre du scénario recommandé est un temps avec marge, présenté en fourchette, et les pourcentages face à l’auto sont donc eux aussi des bornes. Temps auto : approximation de connaissance générale, en repère.</w:t>
+        <w:t xml:space="preserve">Le train contre l’auto : chaque barre de scénario est un temps avec marge, présenté en fourchette, et les pourcentages face à l’auto sont donc eux aussi des bornes. Le scénario plafond est le recommandé poussé à sa borne (note de la synthèse). Temps auto : approximation de connaissance générale, en repère.</w:t>
       </w:r>
     </w:p>
     <w:p>
@@ -356,7 +356,50 @@
         <w:t xml:space="preserve"> </w:t>
       </w:r>
       <w:r>
-        <w:t xml:space="preserve">à Montréal compris, si la marge est tenue à la borne normative (figure suivante).</w:t>
+        <w:t xml:space="preserve">à Montréal compris, si la marge est tenue à la borne normative (figure suivante). La</w:t>
+      </w:r>
+      <w:r>
+        <w:t xml:space="preserve"> </w:t>
+      </w:r>
+      <w:r>
+        <w:t xml:space="preserve">troisième barre de chaque panneau est le</w:t>
+      </w:r>
+      <w:r>
+        <w:t xml:space="preserve"> </w:t>
+      </w:r>
+      <w:r>
+        <w:rPr>
+          <w:b/>
+          <w:bCs/>
+        </w:rPr>
+        <w:t xml:space="preserve">scénario plafond</w:t>
+      </w:r>
+      <w:r>
+        <w:rPr>
+          <w:rStyle w:val="FootnoteReference"/>
+        </w:rPr>
+        <w:footnoteReference w:id="12"/>
+      </w:r>
+      <w:r>
+        <w:t xml:space="preserve"> : le recommandé,</w:t>
+      </w:r>
+      <w:r>
+        <w:t xml:space="preserve"> </w:t>
+      </w:r>
+      <w:r>
+        <w:t xml:space="preserve">poussé à sa borne. Il descend à 4 h 03 à 4 h 26 sur Montréal-Toronto (74 à 81 pour cent</w:t>
+      </w:r>
+      <w:r>
+        <w:t xml:space="preserve"> </w:t>
+      </w:r>
+      <w:r>
+        <w:t xml:space="preserve">de l’auto), 2 h 02 à 2 h 29 sur Montréal-Québec (72 à 88 pour cent), 1 h 26 à 1 h 28</w:t>
+      </w:r>
+      <w:r>
+        <w:t xml:space="preserve"> </w:t>
+      </w:r>
+      <w:r>
+        <w:t xml:space="preserve">sur Montréal-Ottawa et 3 h 28 à 3 h 58 sur Ottawa-Toronto.</w:t>
       </w:r>
     </w:p>
     <w:p>
@@ -368,18 +411,18 @@
           <wp:inline>
             <wp:extent cx="5334000" cy="2006235"/>
             <wp:effectExtent b="0" l="0" r="0" t="0"/>
-            <wp:docPr descr="D’où viennent les minutes : chaque barre est l’horaire actuel du trajet ; le segment évidé est le temps du scénario recommandé avec sa marge normative, et les tranches attribuent le gain à ses trois leviers. Les parts sont des attributions qui somment exactement au gain (méthode en section 7), pas des mesures indépendantes." title="" id="13" name="Picture"/>
+            <wp:docPr descr="D’où viennent les minutes : chaque barre est l’horaire actuel du trajet ; le segment évidé est le temps du scénario recommandé avec sa marge normative, et les tranches attribuent le gain à ses trois leviers. Les parts sont des attributions qui somment exactement au gain (méthode en section 7), pas des mesures indépendantes." title="" id="14" name="Picture"/>
             <a:graphic>
               <a:graphicData uri="http://schemas.openxmlformats.org/drawingml/2006/picture">
                 <pic:pic>
                   <pic:nvPicPr>
-                    <pic:cNvPr descr="livrables/figure_gains.png" id="14" name="Picture"/>
+                    <pic:cNvPr descr="livrables/figure_gains.png" id="15" name="Picture"/>
                     <pic:cNvPicPr>
                       <a:picLocks noChangeArrowheads="1" noChangeAspect="1"/>
                     </pic:cNvPicPr>
                   </pic:nvPicPr>
                   <pic:blipFill>
-                    <a:blip r:embed="rId12"/>
+                    <a:blip r:embed="rId13"/>
                     <a:stretch>
                       <a:fillRect/>
                     </a:stretch>
@@ -1001,7 +1044,7 @@
         <w:t xml:space="preserve">)</w:t>
       </w:r>
       <w:r>
-        <w:t xml:space="preserve"> ; le contrôle intégral n’est requis qu’au-delà de 200 (c’est le devis</w:t>
+        <w:t xml:space="preserve"> ; le contrôle intégral n’est requis qu’au-delà de 177 (c’est le devis</w:t>
       </w:r>
       <w:r>
         <w:t xml:space="preserve"> </w:t>
@@ -1078,8 +1121,8 @@
         <w:t xml:space="preserve">circulation avec le propriétaire de la voie devra allouer.</w:t>
       </w:r>
     </w:p>
-    <w:bookmarkEnd w:id="15"/>
-    <w:bookmarkStart w:id="19" w:name="méthode-et-périmètre"/>
+    <w:bookmarkEnd w:id="16"/>
+    <w:bookmarkStart w:id="20" w:name="méthode-et-périmètre"/>
     <w:p>
       <w:pPr>
         <w:pStyle w:val="Heading1"/>
@@ -1088,7 +1131,7 @@
         <w:t xml:space="preserve">Méthode et périmètre</w:t>
       </w:r>
     </w:p>
-    <w:bookmarkStart w:id="16" w:name="le-modèle"/>
+    <w:bookmarkStart w:id="17" w:name="le-modèle"/>
     <w:p>
       <w:pPr>
         <w:pStyle w:val="Heading2"/>
@@ -1930,8 +1973,8 @@
         <w:t xml:space="preserve">(section 4.3).</w:t>
       </w:r>
     </w:p>
-    <w:bookmarkEnd w:id="16"/>
-    <w:bookmarkStart w:id="17" w:name="X1a1c4a7d8a19cc0ff7b825fa1ef270c3558115a"/>
+    <w:bookmarkEnd w:id="17"/>
+    <w:bookmarkStart w:id="18" w:name="X1a1c4a7d8a19cc0ff7b825fa1ef270c3558115a"/>
     <w:p>
       <w:pPr>
         <w:pStyle w:val="Heading2"/>
@@ -2228,8 +2271,8 @@
         <w:t xml:space="preserve">.</w:t>
       </w:r>
     </w:p>
-    <w:bookmarkEnd w:id="17"/>
-    <w:bookmarkStart w:id="18" w:name="hors-périmètre-déclaré"/>
+    <w:bookmarkEnd w:id="18"/>
+    <w:bookmarkStart w:id="19" w:name="hors-périmètre-déclaré"/>
     <w:p>
       <w:pPr>
         <w:pStyle w:val="Heading2"/>
@@ -2314,9 +2357,9 @@
         <w:t xml:space="preserve">compte.</w:t>
       </w:r>
     </w:p>
-    <w:bookmarkEnd w:id="18"/>
     <w:bookmarkEnd w:id="19"/>
-    <w:bookmarkStart w:id="20" w:name="le-train-pendulaire-et-le-dévers"/>
+    <w:bookmarkEnd w:id="20"/>
+    <w:bookmarkStart w:id="21" w:name="le-train-pendulaire-et-le-dévers"/>
     <w:p>
       <w:pPr>
         <w:pStyle w:val="Heading1"/>
@@ -3052,8 +3095,8 @@
         <w:t xml:space="preserve">renforcé (un point de veto potentiel du propriétaire, et un coût récurrent).</w:t>
       </w:r>
     </w:p>
-    <w:bookmarkEnd w:id="20"/>
-    <w:bookmarkStart w:id="27" w:name="X42a82ebb192afdbd87b7e7f59c353876bbe630b"/>
+    <w:bookmarkEnd w:id="21"/>
+    <w:bookmarkStart w:id="28" w:name="X42a82ebb192afdbd87b7e7f59c353876bbe630b"/>
     <w:p>
       <w:pPr>
         <w:pStyle w:val="Heading1"/>
@@ -3106,7 +3149,7 @@
         <w:t xml:space="preserve">et le prix du régime.</w:t>
       </w:r>
     </w:p>
-    <w:bookmarkStart w:id="24" w:name="la-mesure"/>
+    <w:bookmarkStart w:id="25" w:name="la-mesure"/>
     <w:p>
       <w:pPr>
         <w:pStyle w:val="Heading2"/>
@@ -3420,18 +3463,18 @@
           <wp:inline>
             <wp:extent cx="5334000" cy="3118082"/>
             <wp:effectExtent b="0" l="0" r="0" t="0"/>
-            <wp:docPr descr="Le 2×2 du corridor : chaque inter-gare colorée selon sa cellule voie × propriétaire, avec la marge médiane mesurée par cellule. En gris, les paires exclues de la mesure (blocs urbains, ponts, frontières de propriétaire)." title="" id="22" name="Picture"/>
+            <wp:docPr descr="Le 2×2 du corridor : chaque inter-gare colorée selon sa cellule voie × propriétaire, avec la marge médiane mesurée par cellule. En gris, les paires exclues de la mesure (blocs urbains, ponts, frontières de propriétaire)." title="" id="23" name="Picture"/>
             <a:graphic>
               <a:graphicData uri="http://schemas.openxmlformats.org/drawingml/2006/picture">
                 <pic:pic>
                   <pic:nvPicPr>
-                    <pic:cNvPr descr="livrables/figure_cellules.png" id="23" name="Picture"/>
+                    <pic:cNvPr descr="livrables/figure_cellules.png" id="24" name="Picture"/>
                     <pic:cNvPicPr>
                       <a:picLocks noChangeArrowheads="1" noChangeAspect="1"/>
                     </pic:cNvPicPr>
                   </pic:nvPicPr>
                   <pic:blipFill>
-                    <a:blip r:embed="rId21"/>
+                    <a:blip r:embed="rId22"/>
                     <a:stretch>
                       <a:fillRect/>
                     </a:stretch>
@@ -3684,8 +3727,8 @@
         <w:t xml:space="preserve">jusqu’à 24 minutes selon l’heure de son départ.</w:t>
       </w:r>
     </w:p>
-    <w:bookmarkEnd w:id="24"/>
-    <w:bookmarkStart w:id="25" w:name="contre-épreuve-le-sud-ouest-ontarien"/>
+    <w:bookmarkEnd w:id="25"/>
+    <w:bookmarkStart w:id="26" w:name="contre-épreuve-le-sud-ouest-ontarien"/>
     <w:p>
       <w:pPr>
         <w:pStyle w:val="Heading2"/>
@@ -3756,8 +3799,8 @@
         <w:t xml:space="preserve">la conclusion du cœur se réplique dans une seconde région, par un autre mécanisme.</w:t>
       </w:r>
     </w:p>
-    <w:bookmarkEnd w:id="25"/>
-    <w:bookmarkStart w:id="26" w:name="lencadrement-de-la-marge"/>
+    <w:bookmarkEnd w:id="26"/>
+    <w:bookmarkStart w:id="27" w:name="lencadrement-de-la-marge"/>
     <w:p>
       <w:pPr>
         <w:pStyle w:val="Heading2"/>
@@ -4619,9 +4662,9 @@
         <w:t xml:space="preserve">circulation.</w:t>
       </w:r>
     </w:p>
-    <w:bookmarkEnd w:id="26"/>
     <w:bookmarkEnd w:id="27"/>
-    <w:bookmarkStart w:id="28" w:name="passages-à-niveau"/>
+    <w:bookmarkEnd w:id="28"/>
+    <w:bookmarkStart w:id="29" w:name="passages-à-niveau"/>
     <w:p>
       <w:pPr>
         <w:pStyle w:val="Heading1"/>
@@ -5153,8 +5196,8 @@
         <w:t xml:space="preserve">ne propose la fermeture d’aucun passage.</w:t>
       </w:r>
     </w:p>
-    <w:bookmarkEnd w:id="28"/>
-    <w:bookmarkStart w:id="29" w:name="signalisation"/>
+    <w:bookmarkEnd w:id="29"/>
+    <w:bookmarkStart w:id="30" w:name="signalisation"/>
     <w:p>
       <w:pPr>
         <w:pStyle w:val="Heading1"/>
@@ -5344,7 +5387,7 @@
           <w:b/>
           <w:bCs/>
         </w:rPr>
-        <w:t xml:space="preserve">Au-delà de 200 km/h (124 mi/h) : contrôle intégral</w:t>
+        <w:t xml:space="preserve">Au-delà de 177 km/h (110 mi/h) : contrôle intégral</w:t>
       </w:r>
       <w:r>
         <w:t xml:space="preserve"> </w:t>
@@ -5356,7 +5399,19 @@
         <w:t xml:space="preserve"> </w:t>
       </w:r>
       <w:r>
-        <w:t xml:space="preserve">contrôle des trains). C’est le devis d’Alto</w:t>
+        <w:t xml:space="preserve">contrôle des trains) : le système incrémental s’arrête là, et tout ce qui dépasse</w:t>
+      </w:r>
+      <w:r>
+        <w:t xml:space="preserve"> </w:t>
+      </w:r>
+      <w:r>
+        <w:t xml:space="preserve">demande de remplacer la signalisation plutôt que de s’y superposer. C’est le devis</w:t>
+      </w:r>
+      <w:r>
+        <w:t xml:space="preserve"> </w:t>
+      </w:r>
+      <w:r>
+        <w:t xml:space="preserve">d’Alto</w:t>
       </w:r>
       <w:r>
         <w:t xml:space="preserve"> </w:t>
@@ -5376,19 +5431,13 @@
         <w:t xml:space="preserve">)</w:t>
       </w:r>
       <w:r>
-        <w:t xml:space="preserve">, et</w:t>
-      </w:r>
-      <w:r>
-        <w:t xml:space="preserve"> </w:t>
-      </w:r>
-      <w:r>
-        <w:t xml:space="preserve">l’argument économique pour ne pas viser cette bande sur la voie partagée : elle est</w:t>
-      </w:r>
-      <w:r>
-        <w:t xml:space="preserve"> </w:t>
-      </w:r>
-      <w:r>
-        <w:t xml:space="preserve">hors du scénario recommandé.</w:t>
+        <w:t xml:space="preserve">, et l’argument économique pour ne pas viser ces vitesses sur la</w:t>
+      </w:r>
+      <w:r>
+        <w:t xml:space="preserve"> </w:t>
+      </w:r>
+      <w:r>
+        <w:t xml:space="preserve">voie partagée : elles sont hors du scénario recommandé.</w:t>
       </w:r>
     </w:p>
     <w:p>
@@ -5573,8 +5622,8 @@
         <w:t xml:space="preserve">ne dimensionne pas.</w:t>
       </w:r>
     </w:p>
-    <w:bookmarkEnd w:id="29"/>
-    <w:bookmarkStart w:id="31" w:name="résultats-intégrés"/>
+    <w:bookmarkEnd w:id="30"/>
+    <w:bookmarkStart w:id="32" w:name="résultats-intégrés"/>
     <w:p>
       <w:pPr>
         <w:pStyle w:val="Heading1"/>
@@ -6274,10 +6323,53 @@
         <w:t xml:space="preserve"> </w:t>
       </w:r>
       <w:r>
-        <w:t xml:space="preserve">grande vitesse.</w:t>
-      </w:r>
-    </w:p>
-    <w:bookmarkStart w:id="30" w:name="X3e98b9c7167cabff9ca22a4446093da05eff647"/>
+        <w:t xml:space="preserve">grande vitesse. La combinaison des deux, calculée ensemble par le moteur, est le</w:t>
+      </w:r>
+      <w:r>
+        <w:t xml:space="preserve"> </w:t>
+      </w:r>
+      <w:r>
+        <w:rPr>
+          <w:b/>
+          <w:bCs/>
+        </w:rPr>
+        <w:t xml:space="preserve">scénario plafond</w:t>
+      </w:r>
+      <w:r>
+        <w:t xml:space="preserve"> </w:t>
+      </w:r>
+      <w:r>
+        <w:t xml:space="preserve">de la figure de la synthèse : un temps de base de 4 h 03 à 4 h 26</w:t>
+      </w:r>
+      <w:r>
+        <w:t xml:space="preserve"> </w:t>
+      </w:r>
+      <w:r>
+        <w:t xml:space="preserve">sur Montréal-Toronto, 2 h 02 à 2 h 29 sur Montréal-Québec, 1 h 26 à 1 h 28 sur</w:t>
+      </w:r>
+      <w:r>
+        <w:t xml:space="preserve"> </w:t>
+      </w:r>
+      <w:r>
+        <w:t xml:space="preserve">Montréal-Ottawa et 3 h 28 à 3 h 58 sur Ottawa-Toronto, marge comprise</w:t>
+      </w:r>
+      <w:r>
+        <w:t xml:space="preserve"> </w:t>
+      </w:r>
+      <w:r>
+        <w:t xml:space="preserve">(</w:t>
+      </w:r>
+      <w:r>
+        <w:rPr>
+          <w:rStyle w:val="VerbatimChar"/>
+        </w:rPr>
+        <w:t xml:space="preserve">tbase_par_bande_rectifies_blocs_libres.csv</w:t>
+      </w:r>
+      <w:r>
+        <w:t xml:space="preserve">).</w:t>
+      </w:r>
+    </w:p>
+    <w:bookmarkStart w:id="31" w:name="X3e98b9c7167cabff9ca22a4446093da05eff647"/>
     <w:p>
       <w:pPr>
         <w:pStyle w:val="Heading2"/>
@@ -7039,9 +7131,9 @@
         <w:t xml:space="preserve">correctement à chaque régénération.</w:t>
       </w:r>
     </w:p>
-    <w:bookmarkEnd w:id="30"/>
     <w:bookmarkEnd w:id="31"/>
-    <w:bookmarkStart w:id="32" w:name="limites-et-létude-quil-faut-commander"/>
+    <w:bookmarkEnd w:id="32"/>
+    <w:bookmarkStart w:id="33" w:name="limites-et-létude-quil-faut-commander"/>
     <w:p>
       <w:pPr>
         <w:pStyle w:val="Heading1"/>
@@ -7168,8 +7260,8 @@
         <w:t xml:space="preserve">bornent d’avance le résultat.</w:t>
       </w:r>
     </w:p>
-    <w:bookmarkEnd w:id="32"/>
-    <w:bookmarkStart w:id="100" w:name="références"/>
+    <w:bookmarkEnd w:id="33"/>
+    <w:bookmarkStart w:id="101" w:name="références"/>
     <w:p>
       <w:pPr>
         <w:pStyle w:val="Heading1"/>
@@ -7178,8 +7270,8 @@
         <w:t xml:space="preserve">Références</w:t>
       </w:r>
     </w:p>
-    <w:bookmarkStart w:id="99" w:name="refs"/>
-    <w:bookmarkStart w:id="34" w:name="ref-alto2025"/>
+    <w:bookmarkStart w:id="100" w:name="refs"/>
+    <w:bookmarkStart w:id="35" w:name="ref-alto2025"/>
     <w:p>
       <w:pPr>
         <w:pStyle w:val="Bibliography"/>
@@ -7203,7 +7295,7 @@
       <w:r>
         <w:t xml:space="preserve"> </w:t>
       </w:r>
-      <w:hyperlink r:id="rId33">
+      <w:hyperlink r:id="rId34">
         <w:r>
           <w:rPr>
             <w:rStyle w:val="Hyperlink"/>
@@ -7212,8 +7304,8 @@
         </w:r>
       </w:hyperlink>
     </w:p>
-    <w:bookmarkEnd w:id="34"/>
-    <w:bookmarkStart w:id="36" w:name="ref-amtrakoig2019"/>
+    <w:bookmarkEnd w:id="35"/>
+    <w:bookmarkStart w:id="37" w:name="ref-amtrakoig2019"/>
     <w:p>
       <w:pPr>
         <w:pStyle w:val="Bibliography"/>
@@ -7240,7 +7332,7 @@
       <w:r>
         <w:t xml:space="preserve"> </w:t>
       </w:r>
-      <w:hyperlink r:id="rId35">
+      <w:hyperlink r:id="rId36">
         <w:r>
           <w:rPr>
             <w:rStyle w:val="Hyperlink"/>
@@ -7249,8 +7341,8 @@
         </w:r>
       </w:hyperlink>
     </w:p>
-    <w:bookmarkEnd w:id="36"/>
-    <w:bookmarkStart w:id="38" w:name="ref-canadianrail1976"/>
+    <w:bookmarkEnd w:id="37"/>
+    <w:bookmarkStart w:id="39" w:name="ref-canadianrail1976"/>
     <w:p>
       <w:pPr>
         <w:pStyle w:val="Bibliography"/>
@@ -7274,7 +7366,7 @@
       <w:r>
         <w:t xml:space="preserve"> </w:t>
       </w:r>
-      <w:hyperlink r:id="rId37">
+      <w:hyperlink r:id="rId38">
         <w:r>
           <w:rPr>
             <w:rStyle w:val="Hyperlink"/>
@@ -7283,8 +7375,8 @@
         </w:r>
       </w:hyperlink>
     </w:p>
-    <w:bookmarkEnd w:id="38"/>
-    <w:bookmarkStart w:id="40" w:name="ref-bateman2015"/>
+    <w:bookmarkEnd w:id="39"/>
+    <w:bookmarkStart w:id="41" w:name="ref-bateman2015"/>
     <w:p>
       <w:pPr>
         <w:pStyle w:val="Bibliography"/>
@@ -7336,7 +7428,7 @@
       <w:r>
         <w:t xml:space="preserve"> </w:t>
       </w:r>
-      <w:hyperlink r:id="rId39">
+      <w:hyperlink r:id="rId40">
         <w:r>
           <w:rPr>
             <w:rStyle w:val="Hyperlink"/>
@@ -7345,8 +7437,8 @@
         </w:r>
       </w:hyperlink>
     </w:p>
-    <w:bookmarkEnd w:id="40"/>
-    <w:bookmarkStart w:id="42" w:name="ref-bienaime2009sealed"/>
+    <w:bookmarkEnd w:id="41"/>
+    <w:bookmarkStart w:id="43" w:name="ref-bienaime2009sealed"/>
     <w:p>
       <w:pPr>
         <w:pStyle w:val="Bibliography"/>
@@ -7429,7 +7521,7 @@
       <w:r>
         <w:t xml:space="preserve"> </w:t>
       </w:r>
-      <w:hyperlink r:id="rId41">
+      <w:hyperlink r:id="rId42">
         <w:r>
           <w:rPr>
             <w:rStyle w:val="Hyperlink"/>
@@ -7438,8 +7530,8 @@
         </w:r>
       </w:hyperlink>
     </w:p>
-    <w:bookmarkEnd w:id="42"/>
-    <w:bookmarkStart w:id="43" w:name="ref-cn2002mr1305"/>
+    <w:bookmarkEnd w:id="43"/>
+    <w:bookmarkStart w:id="44" w:name="ref-cn2002mr1305"/>
     <w:p>
       <w:pPr>
         <w:pStyle w:val="Bibliography"/>
@@ -7464,8 +7556,8 @@
         <w:t xml:space="preserve">[Circulaire technique interne]. Compagnie des chemins de fer nationaux du Canada.</w:t>
       </w:r>
     </w:p>
-    <w:bookmarkEnd w:id="43"/>
-    <w:bookmarkStart w:id="45" w:name="ref-cbc2025pilote"/>
+    <w:bookmarkEnd w:id="44"/>
+    <w:bookmarkStart w:id="46" w:name="ref-cbc2025pilote"/>
     <w:p>
       <w:pPr>
         <w:pStyle w:val="Bibliography"/>
@@ -7517,7 +7609,7 @@
       <w:r>
         <w:t xml:space="preserve"> </w:t>
       </w:r>
-      <w:hyperlink r:id="rId44">
+      <w:hyperlink r:id="rId45">
         <w:r>
           <w:rPr>
             <w:rStyle w:val="Hyperlink"/>
@@ -7526,8 +7618,8 @@
         </w:r>
       </w:hyperlink>
     </w:p>
-    <w:bookmarkEnd w:id="45"/>
-    <w:bookmarkStart w:id="47" w:name="ref-dick2019blocs"/>
+    <w:bookmarkEnd w:id="46"/>
+    <w:bookmarkStart w:id="48" w:name="ref-dick2019blocs"/>
     <w:p>
       <w:pPr>
         <w:pStyle w:val="Bibliography"/>
@@ -7564,7 +7656,7 @@
       <w:r>
         <w:t xml:space="preserve"> </w:t>
       </w:r>
-      <w:hyperlink r:id="rId46">
+      <w:hyperlink r:id="rId47">
         <w:r>
           <w:rPr>
             <w:rStyle w:val="Hyperlink"/>
@@ -7573,8 +7665,8 @@
         </w:r>
       </w:hyperlink>
     </w:p>
-    <w:bookmarkEnd w:id="47"/>
-    <w:bookmarkStart w:id="49" w:name="ref-ecfr213-347"/>
+    <w:bookmarkEnd w:id="48"/>
+    <w:bookmarkStart w:id="50" w:name="ref-ecfr213-347"/>
     <w:p>
       <w:pPr>
         <w:pStyle w:val="Bibliography"/>
@@ -7598,7 +7690,7 @@
       <w:r>
         <w:t xml:space="preserve"> </w:t>
       </w:r>
-      <w:hyperlink r:id="rId48">
+      <w:hyperlink r:id="rId49">
         <w:r>
           <w:rPr>
             <w:rStyle w:val="Hyperlink"/>
@@ -7607,8 +7699,8 @@
         </w:r>
       </w:hyperlink>
     </w:p>
-    <w:bookmarkEnd w:id="49"/>
-    <w:bookmarkStart w:id="51" w:name="ref-fra-lrc-152"/>
+    <w:bookmarkEnd w:id="50"/>
+    <w:bookmarkStart w:id="52" w:name="ref-fra-lrc-152"/>
     <w:p>
       <w:pPr>
         <w:pStyle w:val="Bibliography"/>
@@ -7632,7 +7724,7 @@
       <w:r>
         <w:t xml:space="preserve"> </w:t>
       </w:r>
-      <w:hyperlink r:id="rId50">
+      <w:hyperlink r:id="rId51">
         <w:r>
           <w:rPr>
             <w:rStyle w:val="Hyperlink"/>
@@ -7641,8 +7733,8 @@
         </w:r>
       </w:hyperlink>
     </w:p>
-    <w:bookmarkEnd w:id="51"/>
-    <w:bookmarkStart w:id="53" w:name="ref-fra2004ptc"/>
+    <w:bookmarkEnd w:id="52"/>
+    <w:bookmarkStart w:id="54" w:name="ref-fra2004ptc"/>
     <w:p>
       <w:pPr>
         <w:pStyle w:val="Bibliography"/>
@@ -7666,7 +7758,7 @@
       <w:r>
         <w:t xml:space="preserve"> </w:t>
       </w:r>
-      <w:hyperlink r:id="rId52">
+      <w:hyperlink r:id="rId53">
         <w:r>
           <w:rPr>
             <w:rStyle w:val="Hyperlink"/>
@@ -7675,8 +7767,8 @@
         </w:r>
       </w:hyperlink>
     </w:p>
-    <w:bookmarkEnd w:id="53"/>
-    <w:bookmarkStart w:id="55" w:name="ref-fra2024itcs"/>
+    <w:bookmarkEnd w:id="54"/>
+    <w:bookmarkStart w:id="56" w:name="ref-fra2024itcs"/>
     <w:p>
       <w:pPr>
         <w:pStyle w:val="Bibliography"/>
@@ -7700,7 +7792,7 @@
       <w:r>
         <w:t xml:space="preserve"> </w:t>
       </w:r>
-      <w:hyperlink r:id="rId54">
+      <w:hyperlink r:id="rId55">
         <w:r>
           <w:rPr>
             <w:rStyle w:val="Hyperlink"/>
@@ -7709,8 +7801,8 @@
         </w:r>
       </w:hyperlink>
     </w:p>
-    <w:bookmarkEnd w:id="55"/>
-    <w:bookmarkStart w:id="57" w:name="ref-mdot2014tier1"/>
+    <w:bookmarkEnd w:id="56"/>
+    <w:bookmarkStart w:id="58" w:name="ref-mdot2014tier1"/>
     <w:p>
       <w:pPr>
         <w:pStyle w:val="Bibliography"/>
@@ -7734,7 +7826,7 @@
       <w:r>
         <w:t xml:space="preserve"> </w:t>
       </w:r>
-      <w:hyperlink r:id="rId56">
+      <w:hyperlink r:id="rId57">
         <w:r>
           <w:rPr>
             <w:rStyle w:val="Hyperlink"/>
@@ -7743,8 +7835,8 @@
         </w:r>
       </w:hyperlink>
     </w:p>
-    <w:bookmarkEnd w:id="57"/>
-    <w:bookmarkStart w:id="59" w:name="ref-via2024requete"/>
+    <w:bookmarkEnd w:id="58"/>
+    <w:bookmarkStart w:id="60" w:name="ref-via2024requete"/>
     <w:p>
       <w:pPr>
         <w:pStyle w:val="Bibliography"/>
@@ -7796,7 +7888,7 @@
       <w:r>
         <w:t xml:space="preserve"> </w:t>
       </w:r>
-      <w:hyperlink r:id="rId58">
+      <w:hyperlink r:id="rId59">
         <w:r>
           <w:rPr>
             <w:rStyle w:val="Hyperlink"/>
@@ -7805,8 +7897,8 @@
         </w:r>
       </w:hyperlink>
     </w:p>
-    <w:bookmarkEnd w:id="59"/>
-    <w:bookmarkStart w:id="61" w:name="ref-nao2006wcml"/>
+    <w:bookmarkEnd w:id="60"/>
+    <w:bookmarkStart w:id="62" w:name="ref-nao2006wcml"/>
     <w:p>
       <w:pPr>
         <w:pStyle w:val="Bibliography"/>
@@ -7847,7 +7939,7 @@
       <w:r>
         <w:t xml:space="preserve"> </w:t>
       </w:r>
-      <w:hyperlink r:id="rId60">
+      <w:hyperlink r:id="rId61">
         <w:r>
           <w:rPr>
             <w:rStyle w:val="Hyperlink"/>
@@ -7856,8 +7948,8 @@
         </w:r>
       </w:hyperlink>
     </w:p>
-    <w:bookmarkEnd w:id="61"/>
-    <w:bookmarkStart w:id="63" w:name="ref-otc2016circulation"/>
+    <w:bookmarkEnd w:id="62"/>
+    <w:bookmarkStart w:id="64" w:name="ref-otc2016circulation"/>
     <w:p>
       <w:pPr>
         <w:pStyle w:val="Bibliography"/>
@@ -7881,7 +7973,7 @@
       <w:r>
         <w:t xml:space="preserve"> </w:t>
       </w:r>
-      <w:hyperlink r:id="rId62">
+      <w:hyperlink r:id="rId63">
         <w:r>
           <w:rPr>
             <w:rStyle w:val="Hyperlink"/>
@@ -7890,8 +7982,8 @@
         </w:r>
       </w:hyperlink>
     </w:p>
-    <w:bookmarkEnd w:id="63"/>
-    <w:bookmarkStart w:id="65" w:name="ref-orr2021cadre"/>
+    <w:bookmarkEnd w:id="64"/>
+    <w:bookmarkStart w:id="66" w:name="ref-orr2021cadre"/>
     <w:p>
       <w:pPr>
         <w:pStyle w:val="Bibliography"/>
@@ -7918,7 +8010,7 @@
       <w:r>
         <w:t xml:space="preserve"> </w:t>
       </w:r>
-      <w:hyperlink r:id="rId64">
+      <w:hyperlink r:id="rId65">
         <w:r>
           <w:rPr>
             <w:rStyle w:val="Hyperlink"/>
@@ -7927,8 +8019,8 @@
         </w:r>
       </w:hyperlink>
     </w:p>
-    <w:bookmarkEnd w:id="65"/>
-    <w:bookmarkStart w:id="67" w:name="ref-orr2025wcml"/>
+    <w:bookmarkEnd w:id="66"/>
+    <w:bookmarkStart w:id="68" w:name="ref-orr2025wcml"/>
     <w:p>
       <w:pPr>
         <w:pStyle w:val="Bibliography"/>
@@ -7997,7 +8089,7 @@
       <w:r>
         <w:t xml:space="preserve"> </w:t>
       </w:r>
-      <w:hyperlink r:id="rId66">
+      <w:hyperlink r:id="rId67">
         <w:r>
           <w:rPr>
             <w:rStyle w:val="Hyperlink"/>
@@ -8006,8 +8098,8 @@
         </w:r>
       </w:hyperlink>
     </w:p>
-    <w:bookmarkEnd w:id="67"/>
-    <w:bookmarkStart w:id="69" w:name="ref-osm2026geofabrik"/>
+    <w:bookmarkEnd w:id="68"/>
+    <w:bookmarkStart w:id="70" w:name="ref-osm2026geofabrik"/>
     <w:p>
       <w:pPr>
         <w:pStyle w:val="Bibliography"/>
@@ -8073,7 +8165,7 @@
       <w:r>
         <w:t xml:space="preserve"> </w:t>
       </w:r>
-      <w:hyperlink r:id="rId68">
+      <w:hyperlink r:id="rId69">
         <w:r>
           <w:rPr>
             <w:rStyle w:val="Hyperlink"/>
@@ -8082,8 +8174,8 @@
         </w:r>
       </w:hyperlink>
     </w:p>
-    <w:bookmarkEnd w:id="69"/>
-    <w:bookmarkStart w:id="71" w:name="ref-ltc1996art138"/>
+    <w:bookmarkEnd w:id="70"/>
+    <w:bookmarkStart w:id="72" w:name="ref-ltc1996art138"/>
     <w:p>
       <w:pPr>
         <w:pStyle w:val="Bibliography"/>
@@ -8128,7 +8220,7 @@
       <w:r>
         <w:t xml:space="preserve"> </w:t>
       </w:r>
-      <w:hyperlink r:id="rId70">
+      <w:hyperlink r:id="rId71">
         <w:r>
           <w:rPr>
             <w:rStyle w:val="Hyperlink"/>
@@ -8137,8 +8229,8 @@
         </w:r>
       </w:hyperlink>
     </w:p>
-    <w:bookmarkEnd w:id="71"/>
-    <w:bookmarkStart w:id="73" w:name="ref-railwaysact1993"/>
+    <w:bookmarkEnd w:id="72"/>
+    <w:bookmarkStart w:id="74" w:name="ref-railwaysact1993"/>
     <w:p>
       <w:pPr>
         <w:pStyle w:val="Bibliography"/>
@@ -8162,7 +8254,7 @@
       <w:r>
         <w:t xml:space="preserve"> </w:t>
       </w:r>
-      <w:hyperlink r:id="rId72">
+      <w:hyperlink r:id="rId73">
         <w:r>
           <w:rPr>
             <w:rStyle w:val="Hyperlink"/>
@@ -8171,8 +8263,8 @@
         </w:r>
       </w:hyperlink>
     </w:p>
-    <w:bookmarkEnd w:id="73"/>
-    <w:bookmarkStart w:id="75" w:name="ref-schittenhelm2011"/>
+    <w:bookmarkEnd w:id="74"/>
+    <w:bookmarkStart w:id="76" w:name="ref-schittenhelm2011"/>
     <w:p>
       <w:pPr>
         <w:pStyle w:val="Bibliography"/>
@@ -8196,7 +8288,7 @@
       <w:r>
         <w:t xml:space="preserve"> </w:t>
       </w:r>
-      <w:hyperlink r:id="rId74">
+      <w:hyperlink r:id="rId75">
         <w:r>
           <w:rPr>
             <w:rStyle w:val="Hyperlink"/>
@@ -8205,8 +8297,8 @@
         </w:r>
       </w:hyperlink>
     </w:p>
-    <w:bookmarkEnd w:id="75"/>
-    <w:bookmarkStart w:id="77" w:name="ref-sncf2023drr"/>
+    <w:bookmarkEnd w:id="76"/>
+    <w:bookmarkStart w:id="78" w:name="ref-sncf2023drr"/>
     <w:p>
       <w:pPr>
         <w:pStyle w:val="Bibliography"/>
@@ -8230,7 +8322,7 @@
       <w:r>
         <w:t xml:space="preserve"> </w:t>
       </w:r>
-      <w:hyperlink r:id="rId76">
+      <w:hyperlink r:id="rId77">
         <w:r>
           <w:rPr>
             <w:rStyle w:val="Hyperlink"/>
@@ -8239,8 +8331,8 @@
         </w:r>
       </w:hyperlink>
     </w:p>
-    <w:bookmarkEnd w:id="77"/>
-    <w:bookmarkStart w:id="79" w:name="ref-sogin2013doublement"/>
+    <w:bookmarkEnd w:id="78"/>
+    <w:bookmarkStart w:id="80" w:name="ref-sogin2013doublement"/>
     <w:p>
       <w:pPr>
         <w:pStyle w:val="Bibliography"/>
@@ -8264,7 +8356,7 @@
       <w:r>
         <w:t xml:space="preserve"> </w:t>
       </w:r>
-      <w:hyperlink r:id="rId78">
+      <w:hyperlink r:id="rId79">
         <w:r>
           <w:rPr>
             <w:rStyle w:val="Hyperlink"/>
@@ -8273,8 +8365,8 @@
         </w:r>
       </w:hyperlink>
     </w:p>
-    <w:bookmarkEnd w:id="79"/>
-    <w:bookmarkStart w:id="81" w:name="ref-trafikverket2025jnb"/>
+    <w:bookmarkEnd w:id="80"/>
+    <w:bookmarkStart w:id="82" w:name="ref-trafikverket2025jnb"/>
     <w:p>
       <w:pPr>
         <w:pStyle w:val="Bibliography"/>
@@ -8298,7 +8390,7 @@
       <w:r>
         <w:t xml:space="preserve"> </w:t>
       </w:r>
-      <w:hyperlink r:id="rId80">
+      <w:hyperlink r:id="rId81">
         <w:r>
           <w:rPr>
             <w:rStyle w:val="Hyperlink"/>
@@ -8307,8 +8399,8 @@
         </w:r>
       </w:hyperlink>
     </w:p>
-    <w:bookmarkEnd w:id="81"/>
-    <w:bookmarkStart w:id="83" w:name="ref-tc2022rrts"/>
+    <w:bookmarkEnd w:id="82"/>
+    <w:bookmarkStart w:id="84" w:name="ref-tc2022rrts"/>
     <w:p>
       <w:pPr>
         <w:pStyle w:val="Bibliography"/>
@@ -8346,7 +8438,7 @@
       <w:r>
         <w:t xml:space="preserve"> </w:t>
       </w:r>
-      <w:hyperlink r:id="rId82">
+      <w:hyperlink r:id="rId83">
         <w:r>
           <w:rPr>
             <w:rStyle w:val="Hyperlink"/>
@@ -8355,8 +8447,8 @@
         </w:r>
       </w:hyperlink>
     </w:p>
-    <w:bookmarkEnd w:id="83"/>
-    <w:bookmarkStart w:id="85" w:name="ref-tc2023inventairepn"/>
+    <w:bookmarkEnd w:id="84"/>
+    <w:bookmarkStart w:id="86" w:name="ref-tc2023inventairepn"/>
     <w:p>
       <w:pPr>
         <w:pStyle w:val="Bibliography"/>
@@ -8380,7 +8472,7 @@
       <w:r>
         <w:t xml:space="preserve"> </w:t>
       </w:r>
-      <w:hyperlink r:id="rId84">
+      <w:hyperlink r:id="rId85">
         <w:r>
           <w:rPr>
             <w:rStyle w:val="Hyperlink"/>
@@ -8389,8 +8481,8 @@
         </w:r>
       </w:hyperlink>
     </w:p>
-    <w:bookmarkEnd w:id="85"/>
-    <w:bookmarkStart w:id="87" w:name="ref-tc2025gcp"/>
+    <w:bookmarkEnd w:id="86"/>
+    <w:bookmarkStart w:id="88" w:name="ref-tc2025gcp"/>
     <w:p>
       <w:pPr>
         <w:pStyle w:val="Bibliography"/>
@@ -8498,7 +8590,7 @@
       <w:r>
         <w:t xml:space="preserve"> </w:t>
       </w:r>
-      <w:hyperlink r:id="rId86">
+      <w:hyperlink r:id="rId87">
         <w:r>
           <w:rPr>
             <w:rStyle w:val="Hyperlink"/>
@@ -8507,8 +8599,8 @@
         </w:r>
       </w:hyperlink>
     </w:p>
-    <w:bookmarkEnd w:id="87"/>
-    <w:bookmarkStart w:id="88" w:name="ref-uic2000f451"/>
+    <w:bookmarkEnd w:id="88"/>
+    <w:bookmarkStart w:id="89" w:name="ref-uic2000f451"/>
     <w:p>
       <w:pPr>
         <w:pStyle w:val="Bibliography"/>
@@ -8533,8 +8625,8 @@
         <w:t xml:space="preserve">[Fiche UIC 451-1/F/4, 4e \'ed.]. UIC.</w:t>
       </w:r>
     </w:p>
-    <w:bookmarkEnd w:id="88"/>
-    <w:bookmarkStart w:id="90" w:name="ref-via2009lrc"/>
+    <w:bookmarkEnd w:id="89"/>
+    <w:bookmarkStart w:id="91" w:name="ref-via2009lrc"/>
     <w:p>
       <w:pPr>
         <w:pStyle w:val="Bibliography"/>
@@ -8579,7 +8671,7 @@
       <w:r>
         <w:t xml:space="preserve"> </w:t>
       </w:r>
-      <w:hyperlink r:id="rId89">
+      <w:hyperlink r:id="rId90">
         <w:r>
           <w:rPr>
             <w:rStyle w:val="Hyperlink"/>
@@ -8588,8 +8680,8 @@
         </w:r>
       </w:hyperlink>
     </w:p>
-    <w:bookmarkEnd w:id="90"/>
-    <w:bookmarkStart w:id="92" w:name="ref-via2025rapportannuel"/>
+    <w:bookmarkEnd w:id="91"/>
+    <w:bookmarkStart w:id="93" w:name="ref-via2025rapportannuel"/>
     <w:p>
       <w:pPr>
         <w:pStyle w:val="Bibliography"/>
@@ -8613,7 +8705,7 @@
       <w:r>
         <w:t xml:space="preserve"> </w:t>
       </w:r>
-      <w:hyperlink r:id="rId91">
+      <w:hyperlink r:id="rId92">
         <w:r>
           <w:rPr>
             <w:rStyle w:val="Hyperlink"/>
@@ -8622,8 +8714,8 @@
         </w:r>
       </w:hyperlink>
     </w:p>
-    <w:bookmarkEnd w:id="92"/>
-    <w:bookmarkStart w:id="94" w:name="ref-via2025t1"/>
+    <w:bookmarkEnd w:id="93"/>
+    <w:bookmarkStart w:id="95" w:name="ref-via2025t1"/>
     <w:p>
       <w:pPr>
         <w:pStyle w:val="Bibliography"/>
@@ -8647,7 +8739,7 @@
       <w:r>
         <w:t xml:space="preserve"> </w:t>
       </w:r>
-      <w:hyperlink r:id="rId93">
+      <w:hyperlink r:id="rId94">
         <w:r>
           <w:rPr>
             <w:rStyle w:val="Hyperlink"/>
@@ -8656,8 +8748,8 @@
         </w:r>
       </w:hyperlink>
     </w:p>
-    <w:bookmarkEnd w:id="94"/>
-    <w:bookmarkStart w:id="96" w:name="ref-viarail2026gtfs"/>
+    <w:bookmarkEnd w:id="95"/>
+    <w:bookmarkStart w:id="97" w:name="ref-viarail2026gtfs"/>
     <w:p>
       <w:pPr>
         <w:pStyle w:val="Bibliography"/>
@@ -8723,7 +8815,7 @@
       <w:r>
         <w:t xml:space="preserve"> </w:t>
       </w:r>
-      <w:hyperlink r:id="rId95">
+      <w:hyperlink r:id="rId96">
         <w:r>
           <w:rPr>
             <w:rStyle w:val="Hyperlink"/>
@@ -8732,8 +8824,8 @@
         </w:r>
       </w:hyperlink>
     </w:p>
-    <w:bookmarkEnd w:id="96"/>
-    <w:bookmarkStart w:id="98" w:name="ref-wcml2026wiki"/>
+    <w:bookmarkEnd w:id="97"/>
+    <w:bookmarkStart w:id="99" w:name="ref-wcml2026wiki"/>
     <w:p>
       <w:pPr>
         <w:pStyle w:val="Bibliography"/>
@@ -8771,7 +8863,7 @@
       <w:r>
         <w:t xml:space="preserve"> </w:t>
       </w:r>
-      <w:hyperlink r:id="rId97">
+      <w:hyperlink r:id="rId98">
         <w:r>
           <w:rPr>
             <w:rStyle w:val="Hyperlink"/>
@@ -8780,9 +8872,9 @@
         </w:r>
       </w:hyperlink>
     </w:p>
-    <w:bookmarkEnd w:id="98"/>
     <w:bookmarkEnd w:id="99"/>
     <w:bookmarkEnd w:id="100"/>
+    <w:bookmarkEnd w:id="101"/>
     <w:sectPr>
       <w:footnotePr>
         <w:numRestart w:val="eachSect"/>
@@ -8809,6 +8901,55 @@
     <w:p>
       <w:r>
         <w:separator/>
+      </w:r>
+    </w:p>
+  </w:footnote>
+  <w:footnote w:id="12">
+    <w:p>
+      <w:pPr>
+        <w:pStyle w:val="FootnoteText"/>
+      </w:pPr>
+      <w:r>
+        <w:rPr>
+          <w:rStyle w:val="FootnoteReference"/>
+        </w:rPr>
+        <w:footnoteRef/>
+      </w:r>
+      <w:r>
+        <w:t xml:space="preserve"> </w:t>
+      </w:r>
+      <w:r>
+        <w:t xml:space="preserve">Le scénario plafond est le scénario recommandé auquel s’ajoutent les deux</w:t>
+      </w:r>
+      <w:r>
+        <w:t xml:space="preserve"> </w:t>
+      </w:r>
+      <w:r>
+        <w:t xml:space="preserve">sensibilités favorables de la section 7, calculées ensemble par le moteur : les</w:t>
+      </w:r>
+      <w:r>
+        <w:t xml:space="preserve"> </w:t>
+      </w:r>
+      <w:r>
+        <w:t xml:space="preserve">approches urbaines roulent ce que leur géométrie permet au lieu d’être figées à</w:t>
+      </w:r>
+      <w:r>
+        <w:t xml:space="preserve"> </w:t>
+      </w:r>
+      <w:r>
+        <w:t xml:space="preserve">l’horaire actuel, et les courbes des sections à doubler sont rectifiées au moment du</w:t>
+      </w:r>
+      <w:r>
+        <w:t xml:space="preserve"> </w:t>
+      </w:r>
+      <w:r>
+        <w:t xml:space="preserve">doublement. C’est une borne de ce que le corridor peut donner, pas une promesse : les</w:t>
+      </w:r>
+      <w:r>
+        <w:t xml:space="preserve"> </w:t>
+      </w:r>
+      <w:r>
+        <w:t xml:space="preserve">approches urbaines ont leurs propres contraintes, hors du périmètre de cette étude.</w:t>
       </w:r>
     </w:p>
   </w:footnote>

</xml_diff>

<commit_message>
Page « Et si on enlevait tous les passages à niveau? » (sensibilité 241 km/h)
Demande client : une page unique pour juger si la dénivellation complète vaut
l'investissement. Bande 241 (150 mi/h, plafond prouvé du NEC sous ACSES,
fra2010ptc/fra2000acela) ajoutée au moteur 21 (même rame pendulaire 12 W/kg,
lecture conservatrice) ; les trois CSV de scénarios portent la bande.

Verdict de la page : lever le mur des 924 passages n'achète que 2 à 12 min par
trajet (16 min Québec-Toronto de bout en bout) parce qu'au-dessus de 201 ce
sont les courbes qui retiennent le train. Comme levier de temps, ça ne se
justifie pas ; les minutes au-delà du scénario 3 exigent de toucher au tracé,
c'est-à-dire le projet d'ALTO. Section d'une page (p. 17), surtitre « La
contre-hypothèse », PDF 22 pages.

Co-Authored-By: Claude Fable 5 <noreply@anthropic.com>
</commit_message>
<xml_diff>
--- a/livrables/rapport_corridor.docx
+++ b/livrables/rapport_corridor.docx
@@ -3965,12 +3965,363 @@
       </w:r>
     </w:p>
     <w:bookmarkEnd w:id="34"/>
-    <w:bookmarkStart w:id="35" w:name="limites-et-létude-quil-faut-commander"/>
+    <w:bookmarkStart w:id="35" w:name="Xfdc148e5a6fd2c26c89d44d88229f0bfe73e54a"/>
     <w:p>
       <w:pPr>
         <w:pStyle w:val="Heading1"/>
       </w:pPr>
       <w:r>
+        <w:t xml:space="preserve">Et si on enlevait tous les passages à niveau?</w:t>
+      </w:r>
+    </w:p>
+    <w:p>
+      <w:pPr>
+        <w:pStyle w:val="FirstParagraph"/>
+      </w:pPr>
+      <w:r>
+        <w:t xml:space="preserve">Le plafond de 201 km/h (125 mi/h) tient à une seule chose : les passages à niveau. Supposons qu’on les enlève tous. Les 924 croisements du corridor sont dénivelés ou fermés, sans exception. Le mur tombe. Le train peut alors monter à la marche de signalisation suivante, déjà prouvée en Amérique du Nord : 241 km/h (150 mi/h), la vitesse du corridor du Nord-Est d’Amtrak</w:t>
+      </w:r>
+      <w:r>
+        <w:t xml:space="preserve"> </w:t>
+      </w:r>
+      <w:r>
+        <w:t xml:space="preserve">(</w:t>
+      </w:r>
+      <w:hyperlink w:anchor="ref-fra2000acela">
+        <w:r>
+          <w:rPr>
+            <w:rStyle w:val="Hyperlink"/>
+          </w:rPr>
+          <w:t xml:space="preserve">United States. Federal Railroad Administration, 2000</w:t>
+        </w:r>
+      </w:hyperlink>
+      <w:r>
+        <w:t xml:space="preserve">,</w:t>
+      </w:r>
+      <w:r>
+        <w:t xml:space="preserve"> </w:t>
+      </w:r>
+      <w:hyperlink w:anchor="ref-fra2010ptc">
+        <w:r>
+          <w:rPr>
+            <w:rStyle w:val="Hyperlink"/>
+          </w:rPr>
+          <w:t xml:space="preserve">2010</w:t>
+        </w:r>
+      </w:hyperlink>
+      <w:r>
+        <w:t xml:space="preserve">)</w:t>
+      </w:r>
+      <w:r>
+        <w:t xml:space="preserve">. Combien de temps ce chantier achète-t-il?</w:t>
+      </w:r>
+    </w:p>
+    <w:p>
+      <w:pPr>
+        <w:pStyle w:val="BodyText"/>
+      </w:pPr>
+      <w:r>
+        <w:t xml:space="preserve">Voici la réponse, sur le scénario 3 (marge de 10 % incluse) :</w:t>
+      </w:r>
+    </w:p>
+    <w:tbl>
+      <w:tblPr>
+        <w:tblStyle w:val="Table"/>
+        <w:tblW w:type="pct" w:w="5000"/>
+        <w:tblLayout w:type="fixed"/>
+        <w:tblLook w:firstRow="1" w:lastRow="0" w:firstColumn="0" w:lastColumn="0" w:noHBand="0" w:noVBand="0" w:val="0020"/>
+      </w:tblPr>
+      <w:tblGrid>
+        <w:gridCol w:w="1980"/>
+        <w:gridCol w:w="1980"/>
+        <w:gridCol w:w="1980"/>
+        <w:gridCol w:w="1980"/>
+      </w:tblGrid>
+      <w:tr>
+        <w:trPr>
+          <w:tblHeader w:val="on"/>
+        </w:trPr>
+        <w:tc>
+          <w:tcPr/>
+          <w:p>
+            <w:pPr>
+              <w:pStyle w:val="Compact"/>
+            </w:pPr>
+            <w:r>
+              <w:t xml:space="preserve">Trajet</w:t>
+            </w:r>
+          </w:p>
+        </w:tc>
+        <w:tc>
+          <w:tcPr/>
+          <w:p>
+            <w:pPr>
+              <w:pStyle w:val="Compact"/>
+            </w:pPr>
+            <w:r>
+              <w:t xml:space="preserve">Scénario 3 (plafond 201 km/h)</w:t>
+            </w:r>
+          </w:p>
+        </w:tc>
+        <w:tc>
+          <w:tcPr/>
+          <w:p>
+            <w:pPr>
+              <w:pStyle w:val="Compact"/>
+            </w:pPr>
+            <w:r>
+              <w:t xml:space="preserve">Zéro passage à niveau (plafond 241 km/h)</w:t>
+            </w:r>
+          </w:p>
+        </w:tc>
+        <w:tc>
+          <w:tcPr/>
+          <w:p>
+            <w:pPr>
+              <w:pStyle w:val="Compact"/>
+            </w:pPr>
+            <w:r>
+              <w:t xml:space="preserve">Gain</w:t>
+            </w:r>
+          </w:p>
+        </w:tc>
+      </w:tr>
+      <w:tr>
+        <w:tc>
+          <w:tcPr/>
+          <w:p>
+            <w:pPr>
+              <w:pStyle w:val="Compact"/>
+            </w:pPr>
+            <w:r>
+              <w:t xml:space="preserve">Montréal-Québec</w:t>
+            </w:r>
+          </w:p>
+        </w:tc>
+        <w:tc>
+          <w:tcPr/>
+          <w:p>
+            <w:pPr>
+              <w:pStyle w:val="Compact"/>
+            </w:pPr>
+            <w:r>
+              <w:t xml:space="preserve">1 h 56</w:t>
+            </w:r>
+          </w:p>
+        </w:tc>
+        <w:tc>
+          <w:tcPr/>
+          <w:p>
+            <w:pPr>
+              <w:pStyle w:val="Compact"/>
+            </w:pPr>
+            <w:r>
+              <w:t xml:space="preserve">1 h 52</w:t>
+            </w:r>
+          </w:p>
+        </w:tc>
+        <w:tc>
+          <w:tcPr/>
+          <w:p>
+            <w:pPr>
+              <w:pStyle w:val="Compact"/>
+            </w:pPr>
+            <w:r>
+              <w:t xml:space="preserve">4 min</w:t>
+            </w:r>
+          </w:p>
+        </w:tc>
+      </w:tr>
+      <w:tr>
+        <w:tc>
+          <w:tcPr/>
+          <w:p>
+            <w:pPr>
+              <w:pStyle w:val="Compact"/>
+            </w:pPr>
+            <w:r>
+              <w:t xml:space="preserve">Montréal-Ottawa</w:t>
+            </w:r>
+          </w:p>
+        </w:tc>
+        <w:tc>
+          <w:tcPr/>
+          <w:p>
+            <w:pPr>
+              <w:pStyle w:val="Compact"/>
+            </w:pPr>
+            <w:r>
+              <w:t xml:space="preserve">1 h 23</w:t>
+            </w:r>
+          </w:p>
+        </w:tc>
+        <w:tc>
+          <w:tcPr/>
+          <w:p>
+            <w:pPr>
+              <w:pStyle w:val="Compact"/>
+            </w:pPr>
+            <w:r>
+              <w:t xml:space="preserve">1 h 21</w:t>
+            </w:r>
+          </w:p>
+        </w:tc>
+        <w:tc>
+          <w:tcPr/>
+          <w:p>
+            <w:pPr>
+              <w:pStyle w:val="Compact"/>
+            </w:pPr>
+            <w:r>
+              <w:t xml:space="preserve">2 min</w:t>
+            </w:r>
+          </w:p>
+        </w:tc>
+      </w:tr>
+      <w:tr>
+        <w:tc>
+          <w:tcPr/>
+          <w:p>
+            <w:pPr>
+              <w:pStyle w:val="Compact"/>
+            </w:pPr>
+            <w:r>
+              <w:t xml:space="preserve">Ottawa-Toronto</w:t>
+            </w:r>
+          </w:p>
+        </w:tc>
+        <w:tc>
+          <w:tcPr/>
+          <w:p>
+            <w:pPr>
+              <w:pStyle w:val="Compact"/>
+            </w:pPr>
+            <w:r>
+              <w:t xml:space="preserve">3 h 29</w:t>
+            </w:r>
+          </w:p>
+        </w:tc>
+        <w:tc>
+          <w:tcPr/>
+          <w:p>
+            <w:pPr>
+              <w:pStyle w:val="Compact"/>
+            </w:pPr>
+            <w:r>
+              <w:t xml:space="preserve">3 h 21</w:t>
+            </w:r>
+          </w:p>
+        </w:tc>
+        <w:tc>
+          <w:tcPr/>
+          <w:p>
+            <w:pPr>
+              <w:pStyle w:val="Compact"/>
+            </w:pPr>
+            <w:r>
+              <w:t xml:space="preserve">8 min</w:t>
+            </w:r>
+          </w:p>
+        </w:tc>
+      </w:tr>
+      <w:tr>
+        <w:tc>
+          <w:tcPr/>
+          <w:p>
+            <w:pPr>
+              <w:pStyle w:val="Compact"/>
+            </w:pPr>
+            <w:r>
+              <w:t xml:space="preserve">Montréal-Toronto</w:t>
+            </w:r>
+          </w:p>
+        </w:tc>
+        <w:tc>
+          <w:tcPr/>
+          <w:p>
+            <w:pPr>
+              <w:pStyle w:val="Compact"/>
+            </w:pPr>
+            <w:r>
+              <w:t xml:space="preserve">4 h 04</w:t>
+            </w:r>
+          </w:p>
+        </w:tc>
+        <w:tc>
+          <w:tcPr/>
+          <w:p>
+            <w:pPr>
+              <w:pStyle w:val="Compact"/>
+            </w:pPr>
+            <w:r>
+              <w:t xml:space="preserve">3 h 52</w:t>
+            </w:r>
+          </w:p>
+        </w:tc>
+        <w:tc>
+          <w:tcPr/>
+          <w:p>
+            <w:pPr>
+              <w:pStyle w:val="Compact"/>
+            </w:pPr>
+            <w:r>
+              <w:t xml:space="preserve">12 min</w:t>
+            </w:r>
+          </w:p>
+        </w:tc>
+      </w:tr>
+    </w:tbl>
+    <w:p>
+      <w:pPr>
+        <w:pStyle w:val="BodyText"/>
+      </w:pPr>
+      <w:r>
+        <w:t xml:space="preserve">Sur le scénario 1, les gains sont du même ordre : de 1 à 12 minutes selon le trajet. De bout en bout, Québec-Toronto gagnerait 16 minutes.</w:t>
+      </w:r>
+    </w:p>
+    <w:p>
+      <w:pPr>
+        <w:pStyle w:val="BodyText"/>
+      </w:pPr>
+      <w:r>
+        <w:rPr>
+          <w:b/>
+          <w:bCs/>
+        </w:rPr>
+        <w:t xml:space="preserve">Pourquoi si peu?</w:t>
+      </w:r>
+      <w:r>
+        <w:t xml:space="preserve"> </w:t>
+      </w:r>
+      <w:r>
+        <w:t xml:space="preserve">Parce qu’au-dessus de 201 km/h, ce ne sont plus les passages qui retiennent le train : ce sont les courbes. Le tracé n’offre qu’un nombre limité de sections assez droites pour porter 241 km/h, et le train n’y reste jamais longtemps. Le mur des passages à niveau et le mur de la géométrie sont presque au même endroit.</w:t>
+      </w:r>
+    </w:p>
+    <w:p>
+      <w:pPr>
+        <w:pStyle w:val="BodyText"/>
+      </w:pPr>
+      <w:r>
+        <w:rPr>
+          <w:b/>
+          <w:bCs/>
+        </w:rPr>
+        <w:t xml:space="preserve">La lecture d’investissement est donc simple.</w:t>
+      </w:r>
+      <w:r>
+        <w:t xml:space="preserve"> </w:t>
+      </w:r>
+      <w:r>
+        <w:t xml:space="preserve">Comme levier de temps, déniveler les 924 passages ne se justifie pas : des centaines d’ouvrages pour gagner 2 à 12 minutes, là où le corridor scellé (le traitement des passages en place) fait partie du scénario de base et coûte une fraction de ce prix. Les dénivellations gardent leurs autres mérites, la sécurité d’abord, et quelques-unes se justifieront site par site. Mais quiconque veut des minutes au-delà du scénario 3 doit toucher au tracé lui-même, et c’est un autre projet : celui d’ALTO. Cette page borne l’écart entre les deux mondes.</w:t>
+      </w:r>
+    </w:p>
+    <w:bookmarkEnd w:id="35"/>
+    <w:bookmarkStart w:id="36" w:name="limites-et-létude-quil-faut-commander"/>
+    <w:p>
+      <w:pPr>
+        <w:pStyle w:val="Heading1"/>
+      </w:pPr>
+      <w:r>
         <w:t xml:space="preserve">Limites, et l’étude qu’il faut commander</w:t>
       </w:r>
     </w:p>
@@ -3990,8 +4341,8 @@
         <w:t xml:space="preserve">L’étape suivante est une étude de circulation menée avec le propriétaire de la voie. Elle devra répartir la marge entre ses causes (fret, état de voie, passages à niveau, terminaux), dimensionner les interventions de capacité (liaisons rapides, troisième voie, évitements), lever la correction des courbes courtes avec une géométrie fine, et établir la feuille de route concrète de l’alternative à ALTO.</w:t>
       </w:r>
     </w:p>
-    <w:bookmarkEnd w:id="35"/>
-    <w:bookmarkStart w:id="36" w:name="note-de-lauteur"/>
+    <w:bookmarkEnd w:id="36"/>
+    <w:bookmarkStart w:id="37" w:name="note-de-lauteur"/>
     <w:p>
       <w:pPr>
         <w:pStyle w:val="Heading1"/>
@@ -4122,8 +4473,8 @@
         <w:t xml:space="preserve">chiffres clés du rapport dans le navigateur du lecteur.</w:t>
       </w:r>
     </w:p>
-    <w:bookmarkEnd w:id="36"/>
-    <w:bookmarkStart w:id="132" w:name="références"/>
+    <w:bookmarkEnd w:id="37"/>
+    <w:bookmarkStart w:id="133" w:name="références"/>
     <w:p>
       <w:pPr>
         <w:pStyle w:val="Heading1"/>
@@ -4132,8 +4483,8 @@
         <w:t xml:space="preserve">Références</w:t>
       </w:r>
     </w:p>
-    <w:bookmarkStart w:id="131" w:name="refs"/>
-    <w:bookmarkStart w:id="38" w:name="ref-alto2025"/>
+    <w:bookmarkStart w:id="132" w:name="refs"/>
+    <w:bookmarkStart w:id="39" w:name="ref-alto2025"/>
     <w:p>
       <w:pPr>
         <w:pStyle w:val="Bibliography"/>
@@ -4157,7 +4508,7 @@
       <w:r>
         <w:t xml:space="preserve"> </w:t>
       </w:r>
-      <w:hyperlink r:id="rId37">
+      <w:hyperlink r:id="rId38">
         <w:r>
           <w:rPr>
             <w:rStyle w:val="Hyperlink"/>
@@ -4166,8 +4517,8 @@
         </w:r>
       </w:hyperlink>
     </w:p>
-    <w:bookmarkEnd w:id="38"/>
-    <w:bookmarkStart w:id="40" w:name="ref-altotrain2026faq"/>
+    <w:bookmarkEnd w:id="39"/>
+    <w:bookmarkStart w:id="41" w:name="ref-altotrain2026faq"/>
     <w:p>
       <w:pPr>
         <w:pStyle w:val="Bibliography"/>
@@ -4191,7 +4542,7 @@
       <w:r>
         <w:t xml:space="preserve"> </w:t>
       </w:r>
-      <w:hyperlink r:id="rId39">
+      <w:hyperlink r:id="rId40">
         <w:r>
           <w:rPr>
             <w:rStyle w:val="Hyperlink"/>
@@ -4200,8 +4551,8 @@
         </w:r>
       </w:hyperlink>
     </w:p>
-    <w:bookmarkEnd w:id="40"/>
-    <w:bookmarkStart w:id="42" w:name="ref-amtrakoig2019"/>
+    <w:bookmarkEnd w:id="41"/>
+    <w:bookmarkStart w:id="43" w:name="ref-amtrakoig2019"/>
     <w:p>
       <w:pPr>
         <w:pStyle w:val="Bibliography"/>
@@ -4228,7 +4579,7 @@
       <w:r>
         <w:t xml:space="preserve"> </w:t>
       </w:r>
-      <w:hyperlink r:id="rId41">
+      <w:hyperlink r:id="rId42">
         <w:r>
           <w:rPr>
             <w:rStyle w:val="Hyperlink"/>
@@ -4237,8 +4588,8 @@
         </w:r>
       </w:hyperlink>
     </w:p>
-    <w:bookmarkEnd w:id="42"/>
-    <w:bookmarkStart w:id="44" w:name="ref-canadianrail1976"/>
+    <w:bookmarkEnd w:id="43"/>
+    <w:bookmarkStart w:id="45" w:name="ref-canadianrail1976"/>
     <w:p>
       <w:pPr>
         <w:pStyle w:val="Bibliography"/>
@@ -4262,7 +4613,7 @@
       <w:r>
         <w:t xml:space="preserve"> </w:t>
       </w:r>
-      <w:hyperlink r:id="rId43">
+      <w:hyperlink r:id="rId44">
         <w:r>
           <w:rPr>
             <w:rStyle w:val="Hyperlink"/>
@@ -4271,8 +4622,8 @@
         </w:r>
       </w:hyperlink>
     </w:p>
-    <w:bookmarkEnd w:id="44"/>
-    <w:bookmarkStart w:id="46" w:name="ref-bateman2015"/>
+    <w:bookmarkEnd w:id="45"/>
+    <w:bookmarkStart w:id="47" w:name="ref-bateman2015"/>
     <w:p>
       <w:pPr>
         <w:pStyle w:val="Bibliography"/>
@@ -4324,7 +4675,7 @@
       <w:r>
         <w:t xml:space="preserve"> </w:t>
       </w:r>
-      <w:hyperlink r:id="rId45">
+      <w:hyperlink r:id="rId46">
         <w:r>
           <w:rPr>
             <w:rStyle w:val="Hyperlink"/>
@@ -4333,8 +4684,8 @@
         </w:r>
       </w:hyperlink>
     </w:p>
-    <w:bookmarkEnd w:id="46"/>
-    <w:bookmarkStart w:id="48" w:name="ref-bienaime2009sealed"/>
+    <w:bookmarkEnd w:id="47"/>
+    <w:bookmarkStart w:id="49" w:name="ref-bienaime2009sealed"/>
     <w:p>
       <w:pPr>
         <w:pStyle w:val="Bibliography"/>
@@ -4417,7 +4768,7 @@
       <w:r>
         <w:t xml:space="preserve"> </w:t>
       </w:r>
-      <w:hyperlink r:id="rId47">
+      <w:hyperlink r:id="rId48">
         <w:r>
           <w:rPr>
             <w:rStyle w:val="Hyperlink"/>
@@ -4426,8 +4777,8 @@
         </w:r>
       </w:hyperlink>
     </w:p>
-    <w:bookmarkEnd w:id="48"/>
-    <w:bookmarkStart w:id="50" w:name="ref-brightline2023"/>
+    <w:bookmarkEnd w:id="49"/>
+    <w:bookmarkStart w:id="51" w:name="ref-brightline2023"/>
     <w:p>
       <w:pPr>
         <w:pStyle w:val="Bibliography"/>
@@ -4451,7 +4802,7 @@
       <w:r>
         <w:t xml:space="preserve"> </w:t>
       </w:r>
-      <w:hyperlink r:id="rId49">
+      <w:hyperlink r:id="rId50">
         <w:r>
           <w:rPr>
             <w:rStyle w:val="Hyperlink"/>
@@ -4460,8 +4811,8 @@
         </w:r>
       </w:hyperlink>
     </w:p>
-    <w:bookmarkEnd w:id="50"/>
-    <w:bookmarkStart w:id="52" w:name="ref-hoc2010wcml"/>
+    <w:bookmarkEnd w:id="51"/>
+    <w:bookmarkStart w:id="53" w:name="ref-hoc2010wcml"/>
     <w:p>
       <w:pPr>
         <w:pStyle w:val="Bibliography"/>
@@ -4485,7 +4836,7 @@
       <w:r>
         <w:t xml:space="preserve"> </w:t>
       </w:r>
-      <w:hyperlink r:id="rId51">
+      <w:hyperlink r:id="rId52">
         <w:r>
           <w:rPr>
             <w:rStyle w:val="Hyperlink"/>
@@ -4494,8 +4845,8 @@
         </w:r>
       </w:hyperlink>
     </w:p>
-    <w:bookmarkEnd w:id="52"/>
-    <w:bookmarkStart w:id="54" w:name="ref-pmcanada2025alto"/>
+    <w:bookmarkEnd w:id="53"/>
+    <w:bookmarkStart w:id="55" w:name="ref-pmcanada2025alto"/>
     <w:p>
       <w:pPr>
         <w:pStyle w:val="Bibliography"/>
@@ -4519,7 +4870,7 @@
       <w:r>
         <w:t xml:space="preserve"> </w:t>
       </w:r>
-      <w:hyperlink r:id="rId53">
+      <w:hyperlink r:id="rId54">
         <w:r>
           <w:rPr>
             <w:rStyle w:val="Hyperlink"/>
@@ -4528,8 +4879,8 @@
         </w:r>
       </w:hyperlink>
     </w:p>
-    <w:bookmarkEnd w:id="54"/>
-    <w:bookmarkStart w:id="55" w:name="ref-cn2002mr1305"/>
+    <w:bookmarkEnd w:id="55"/>
+    <w:bookmarkStart w:id="56" w:name="ref-cn2002mr1305"/>
     <w:p>
       <w:pPr>
         <w:pStyle w:val="Bibliography"/>
@@ -4554,8 +4905,8 @@
         <w:t xml:space="preserve">[Circulaire technique interne]. Compagnie des chemins de fer nationaux du Canada.</w:t>
       </w:r>
     </w:p>
-    <w:bookmarkEnd w:id="55"/>
-    <w:bookmarkStart w:id="57" w:name="ref-cbc2025pilote"/>
+    <w:bookmarkEnd w:id="56"/>
+    <w:bookmarkStart w:id="58" w:name="ref-cbc2025pilote"/>
     <w:p>
       <w:pPr>
         <w:pStyle w:val="Bibliography"/>
@@ -4607,7 +4958,7 @@
       <w:r>
         <w:t xml:space="preserve"> </w:t>
       </w:r>
-      <w:hyperlink r:id="rId56">
+      <w:hyperlink r:id="rId57">
         <w:r>
           <w:rPr>
             <w:rStyle w:val="Hyperlink"/>
@@ -4616,8 +4967,8 @@
         </w:r>
       </w:hyperlink>
     </w:p>
-    <w:bookmarkEnd w:id="57"/>
-    <w:bookmarkStart w:id="59" w:name="ref-eu2023ccstsi"/>
+    <w:bookmarkEnd w:id="58"/>
+    <w:bookmarkStart w:id="60" w:name="ref-eu2023ccstsi"/>
     <w:p>
       <w:pPr>
         <w:pStyle w:val="Bibliography"/>
@@ -4641,7 +4992,7 @@
       <w:r>
         <w:t xml:space="preserve"> </w:t>
       </w:r>
-      <w:hyperlink r:id="rId58">
+      <w:hyperlink r:id="rId59">
         <w:r>
           <w:rPr>
             <w:rStyle w:val="Hyperlink"/>
@@ -4650,8 +5001,8 @@
         </w:r>
       </w:hyperlink>
     </w:p>
-    <w:bookmarkEnd w:id="59"/>
-    <w:bookmarkStart w:id="61" w:name="ref-ec2026etcs"/>
+    <w:bookmarkEnd w:id="60"/>
+    <w:bookmarkStart w:id="62" w:name="ref-ec2026etcs"/>
     <w:p>
       <w:pPr>
         <w:pStyle w:val="Bibliography"/>
@@ -4675,7 +5026,7 @@
       <w:r>
         <w:t xml:space="preserve"> </w:t>
       </w:r>
-      <w:hyperlink r:id="rId60">
+      <w:hyperlink r:id="rId61">
         <w:r>
           <w:rPr>
             <w:rStyle w:val="Hyperlink"/>
@@ -4684,8 +5035,8 @@
         </w:r>
       </w:hyperlink>
     </w:p>
-    <w:bookmarkEnd w:id="61"/>
-    <w:bookmarkStart w:id="63" w:name="ref-dick2019blocs"/>
+    <w:bookmarkEnd w:id="62"/>
+    <w:bookmarkStart w:id="64" w:name="ref-dick2019blocs"/>
     <w:p>
       <w:pPr>
         <w:pStyle w:val="Bibliography"/>
@@ -4722,7 +5073,7 @@
       <w:r>
         <w:t xml:space="preserve"> </w:t>
       </w:r>
-      <w:hyperlink r:id="rId62">
+      <w:hyperlink r:id="rId63">
         <w:r>
           <w:rPr>
             <w:rStyle w:val="Hyperlink"/>
@@ -4731,8 +5082,8 @@
         </w:r>
       </w:hyperlink>
     </w:p>
-    <w:bookmarkEnd w:id="63"/>
-    <w:bookmarkStart w:id="65" w:name="ref-ecfr213-347"/>
+    <w:bookmarkEnd w:id="64"/>
+    <w:bookmarkStart w:id="66" w:name="ref-ecfr213-347"/>
     <w:p>
       <w:pPr>
         <w:pStyle w:val="Bibliography"/>
@@ -4756,7 +5107,7 @@
       <w:r>
         <w:t xml:space="preserve"> </w:t>
       </w:r>
-      <w:hyperlink r:id="rId64">
+      <w:hyperlink r:id="rId65">
         <w:r>
           <w:rPr>
             <w:rStyle w:val="Hyperlink"/>
@@ -4765,8 +5116,8 @@
         </w:r>
       </w:hyperlink>
     </w:p>
-    <w:bookmarkEnd w:id="65"/>
-    <w:bookmarkStart w:id="67" w:name="ref-fra-lrc-152"/>
+    <w:bookmarkEnd w:id="66"/>
+    <w:bookmarkStart w:id="68" w:name="ref-fra-lrc-152"/>
     <w:p>
       <w:pPr>
         <w:pStyle w:val="Bibliography"/>
@@ -4790,7 +5141,7 @@
       <w:r>
         <w:t xml:space="preserve"> </w:t>
       </w:r>
-      <w:hyperlink r:id="rId66">
+      <w:hyperlink r:id="rId67">
         <w:r>
           <w:rPr>
             <w:rStyle w:val="Hyperlink"/>
@@ -4799,8 +5150,8 @@
         </w:r>
       </w:hyperlink>
     </w:p>
-    <w:bookmarkEnd w:id="67"/>
-    <w:bookmarkStart w:id="69" w:name="ref-fra2004ptc"/>
+    <w:bookmarkEnd w:id="68"/>
+    <w:bookmarkStart w:id="70" w:name="ref-fra2004ptc"/>
     <w:p>
       <w:pPr>
         <w:pStyle w:val="Bibliography"/>
@@ -4824,7 +5175,7 @@
       <w:r>
         <w:t xml:space="preserve"> </w:t>
       </w:r>
-      <w:hyperlink r:id="rId68">
+      <w:hyperlink r:id="rId69">
         <w:r>
           <w:rPr>
             <w:rStyle w:val="Hyperlink"/>
@@ -4833,8 +5184,8 @@
         </w:r>
       </w:hyperlink>
     </w:p>
-    <w:bookmarkEnd w:id="69"/>
-    <w:bookmarkStart w:id="71" w:name="ref-fra2024itcs"/>
+    <w:bookmarkEnd w:id="70"/>
+    <w:bookmarkStart w:id="72" w:name="ref-fra2024itcs"/>
     <w:p>
       <w:pPr>
         <w:pStyle w:val="Bibliography"/>
@@ -4858,7 +5209,7 @@
       <w:r>
         <w:t xml:space="preserve"> </w:t>
       </w:r>
-      <w:hyperlink r:id="rId70">
+      <w:hyperlink r:id="rId71">
         <w:r>
           <w:rPr>
             <w:rStyle w:val="Hyperlink"/>
@@ -4867,8 +5218,8 @@
         </w:r>
       </w:hyperlink>
     </w:p>
-    <w:bookmarkEnd w:id="71"/>
-    <w:bookmarkStart w:id="73" w:name="ref-mdot2014tier1"/>
+    <w:bookmarkEnd w:id="72"/>
+    <w:bookmarkStart w:id="74" w:name="ref-mdot2014tier1"/>
     <w:p>
       <w:pPr>
         <w:pStyle w:val="Bibliography"/>
@@ -4892,7 +5243,7 @@
       <w:r>
         <w:t xml:space="preserve"> </w:t>
       </w:r>
-      <w:hyperlink r:id="rId72">
+      <w:hyperlink r:id="rId73">
         <w:r>
           <w:rPr>
             <w:rStyle w:val="Hyperlink"/>
@@ -4901,8 +5252,8 @@
         </w:r>
       </w:hyperlink>
     </w:p>
-    <w:bookmarkEnd w:id="73"/>
-    <w:bookmarkStart w:id="75" w:name="ref-via2024requete"/>
+    <w:bookmarkEnd w:id="74"/>
+    <w:bookmarkStart w:id="76" w:name="ref-via2024requete"/>
     <w:p>
       <w:pPr>
         <w:pStyle w:val="Bibliography"/>
@@ -4954,7 +5305,7 @@
       <w:r>
         <w:t xml:space="preserve"> </w:t>
       </w:r>
-      <w:hyperlink r:id="rId74">
+      <w:hyperlink r:id="rId75">
         <w:r>
           <w:rPr>
             <w:rStyle w:val="Hyperlink"/>
@@ -4963,8 +5314,8 @@
         </w:r>
       </w:hyperlink>
     </w:p>
-    <w:bookmarkEnd w:id="75"/>
-    <w:bookmarkStart w:id="77" w:name="ref-nao2006wcml"/>
+    <w:bookmarkEnd w:id="76"/>
+    <w:bookmarkStart w:id="78" w:name="ref-nao2006wcml"/>
     <w:p>
       <w:pPr>
         <w:pStyle w:val="Bibliography"/>
@@ -5005,7 +5356,7 @@
       <w:r>
         <w:t xml:space="preserve"> </w:t>
       </w:r>
-      <w:hyperlink r:id="rId76">
+      <w:hyperlink r:id="rId77">
         <w:r>
           <w:rPr>
             <w:rStyle w:val="Hyperlink"/>
@@ -5014,8 +5365,8 @@
         </w:r>
       </w:hyperlink>
     </w:p>
-    <w:bookmarkEnd w:id="77"/>
-    <w:bookmarkStart w:id="79" w:name="ref-otc2016circulation"/>
+    <w:bookmarkEnd w:id="78"/>
+    <w:bookmarkStart w:id="80" w:name="ref-otc2016circulation"/>
     <w:p>
       <w:pPr>
         <w:pStyle w:val="Bibliography"/>
@@ -5039,7 +5390,7 @@
       <w:r>
         <w:t xml:space="preserve"> </w:t>
       </w:r>
-      <w:hyperlink r:id="rId78">
+      <w:hyperlink r:id="rId79">
         <w:r>
           <w:rPr>
             <w:rStyle w:val="Hyperlink"/>
@@ -5048,8 +5399,8 @@
         </w:r>
       </w:hyperlink>
     </w:p>
-    <w:bookmarkEnd w:id="79"/>
-    <w:bookmarkStart w:id="81" w:name="ref-orr2021cadre"/>
+    <w:bookmarkEnd w:id="80"/>
+    <w:bookmarkStart w:id="82" w:name="ref-orr2021cadre"/>
     <w:p>
       <w:pPr>
         <w:pStyle w:val="Bibliography"/>
@@ -5076,7 +5427,7 @@
       <w:r>
         <w:t xml:space="preserve"> </w:t>
       </w:r>
-      <w:hyperlink r:id="rId80">
+      <w:hyperlink r:id="rId81">
         <w:r>
           <w:rPr>
             <w:rStyle w:val="Hyperlink"/>
@@ -5085,8 +5436,8 @@
         </w:r>
       </w:hyperlink>
     </w:p>
-    <w:bookmarkEnd w:id="81"/>
-    <w:bookmarkStart w:id="83" w:name="ref-orr2024tps"/>
+    <w:bookmarkEnd w:id="82"/>
+    <w:bookmarkStart w:id="84" w:name="ref-orr2024tps"/>
     <w:p>
       <w:pPr>
         <w:pStyle w:val="Bibliography"/>
@@ -5110,7 +5461,7 @@
       <w:r>
         <w:t xml:space="preserve"> </w:t>
       </w:r>
-      <w:hyperlink r:id="rId82">
+      <w:hyperlink r:id="rId83">
         <w:r>
           <w:rPr>
             <w:rStyle w:val="Hyperlink"/>
@@ -5119,8 +5470,8 @@
         </w:r>
       </w:hyperlink>
     </w:p>
-    <w:bookmarkEnd w:id="83"/>
-    <w:bookmarkStart w:id="85" w:name="ref-orr2025wcml"/>
+    <w:bookmarkEnd w:id="84"/>
+    <w:bookmarkStart w:id="86" w:name="ref-orr2025wcml"/>
     <w:p>
       <w:pPr>
         <w:pStyle w:val="Bibliography"/>
@@ -5189,7 +5540,7 @@
       <w:r>
         <w:t xml:space="preserve"> </w:t>
       </w:r>
-      <w:hyperlink r:id="rId84">
+      <w:hyperlink r:id="rId85">
         <w:r>
           <w:rPr>
             <w:rStyle w:val="Hyperlink"/>
@@ -5198,8 +5549,8 @@
         </w:r>
       </w:hyperlink>
     </w:p>
-    <w:bookmarkEnd w:id="85"/>
-    <w:bookmarkStart w:id="87" w:name="ref-osm2026geofabrik"/>
+    <w:bookmarkEnd w:id="86"/>
+    <w:bookmarkStart w:id="88" w:name="ref-osm2026geofabrik"/>
     <w:p>
       <w:pPr>
         <w:pStyle w:val="Bibliography"/>
@@ -5265,7 +5616,7 @@
       <w:r>
         <w:t xml:space="preserve"> </w:t>
       </w:r>
-      <w:hyperlink r:id="rId86">
+      <w:hyperlink r:id="rId87">
         <w:r>
           <w:rPr>
             <w:rStyle w:val="Hyperlink"/>
@@ -5274,8 +5625,8 @@
         </w:r>
       </w:hyperlink>
     </w:p>
-    <w:bookmarkEnd w:id="87"/>
-    <w:bookmarkStart w:id="89" w:name="ref-ltc1996art138"/>
+    <w:bookmarkEnd w:id="88"/>
+    <w:bookmarkStart w:id="90" w:name="ref-ltc1996art138"/>
     <w:p>
       <w:pPr>
         <w:pStyle w:val="Bibliography"/>
@@ -5320,7 +5671,7 @@
       <w:r>
         <w:t xml:space="preserve"> </w:t>
       </w:r>
-      <w:hyperlink r:id="rId88">
+      <w:hyperlink r:id="rId89">
         <w:r>
           <w:rPr>
             <w:rStyle w:val="Hyperlink"/>
@@ -5329,8 +5680,8 @@
         </w:r>
       </w:hyperlink>
     </w:p>
-    <w:bookmarkEnd w:id="89"/>
-    <w:bookmarkStart w:id="91" w:name="ref-railwaysact1993"/>
+    <w:bookmarkEnd w:id="90"/>
+    <w:bookmarkStart w:id="92" w:name="ref-railwaysact1993"/>
     <w:p>
       <w:pPr>
         <w:pStyle w:val="Bibliography"/>
@@ -5354,7 +5705,7 @@
       <w:r>
         <w:t xml:space="preserve"> </w:t>
       </w:r>
-      <w:hyperlink r:id="rId90">
+      <w:hyperlink r:id="rId91">
         <w:r>
           <w:rPr>
             <w:rStyle w:val="Hyperlink"/>
@@ -5363,8 +5714,8 @@
         </w:r>
       </w:hyperlink>
     </w:p>
-    <w:bookmarkEnd w:id="91"/>
-    <w:bookmarkStart w:id="93" w:name="ref-rfli2026tpr"/>
+    <w:bookmarkEnd w:id="92"/>
+    <w:bookmarkStart w:id="94" w:name="ref-rfli2026tpr"/>
     <w:p>
       <w:pPr>
         <w:pStyle w:val="Bibliography"/>
@@ -5388,7 +5739,7 @@
       <w:r>
         <w:t xml:space="preserve"> </w:t>
       </w:r>
-      <w:hyperlink r:id="rId92">
+      <w:hyperlink r:id="rId93">
         <w:r>
           <w:rPr>
             <w:rStyle w:val="Hyperlink"/>
@@ -5397,8 +5748,8 @@
         </w:r>
       </w:hyperlink>
     </w:p>
-    <w:bookmarkEnd w:id="93"/>
-    <w:bookmarkStart w:id="95" w:name="ref-schittenhelm2011"/>
+    <w:bookmarkEnd w:id="94"/>
+    <w:bookmarkStart w:id="96" w:name="ref-schittenhelm2011"/>
     <w:p>
       <w:pPr>
         <w:pStyle w:val="Bibliography"/>
@@ -5422,7 +5773,7 @@
       <w:r>
         <w:t xml:space="preserve"> </w:t>
       </w:r>
-      <w:hyperlink r:id="rId94">
+      <w:hyperlink r:id="rId95">
         <w:r>
           <w:rPr>
             <w:rStyle w:val="Hyperlink"/>
@@ -5431,8 +5782,8 @@
         </w:r>
       </w:hyperlink>
     </w:p>
-    <w:bookmarkEnd w:id="95"/>
-    <w:bookmarkStart w:id="97" w:name="ref-sncf2023drr"/>
+    <w:bookmarkEnd w:id="96"/>
+    <w:bookmarkStart w:id="98" w:name="ref-sncf2023drr"/>
     <w:p>
       <w:pPr>
         <w:pStyle w:val="Bibliography"/>
@@ -5456,7 +5807,7 @@
       <w:r>
         <w:t xml:space="preserve"> </w:t>
       </w:r>
-      <w:hyperlink r:id="rId96">
+      <w:hyperlink r:id="rId97">
         <w:r>
           <w:rPr>
             <w:rStyle w:val="Hyperlink"/>
@@ -5465,8 +5816,8 @@
         </w:r>
       </w:hyperlink>
     </w:p>
-    <w:bookmarkEnd w:id="97"/>
-    <w:bookmarkStart w:id="99" w:name="ref-sogin2013doublement"/>
+    <w:bookmarkEnd w:id="98"/>
+    <w:bookmarkStart w:id="100" w:name="ref-sogin2013doublement"/>
     <w:p>
       <w:pPr>
         <w:pStyle w:val="Bibliography"/>
@@ -5490,7 +5841,7 @@
       <w:r>
         <w:t xml:space="preserve"> </w:t>
       </w:r>
-      <w:hyperlink r:id="rId98">
+      <w:hyperlink r:id="rId99">
         <w:r>
           <w:rPr>
             <w:rStyle w:val="Hyperlink"/>
@@ -5499,8 +5850,8 @@
         </w:r>
       </w:hyperlink>
     </w:p>
-    <w:bookmarkEnd w:id="99"/>
-    <w:bookmarkStart w:id="101" w:name="ref-trafikverket2025jnb"/>
+    <w:bookmarkEnd w:id="100"/>
+    <w:bookmarkStart w:id="102" w:name="ref-trafikverket2025jnb"/>
     <w:p>
       <w:pPr>
         <w:pStyle w:val="Bibliography"/>
@@ -5524,7 +5875,7 @@
       <w:r>
         <w:t xml:space="preserve"> </w:t>
       </w:r>
-      <w:hyperlink r:id="rId100">
+      <w:hyperlink r:id="rId101">
         <w:r>
           <w:rPr>
             <w:rStyle w:val="Hyperlink"/>
@@ -5533,8 +5884,8 @@
         </w:r>
       </w:hyperlink>
     </w:p>
-    <w:bookmarkEnd w:id="101"/>
-    <w:bookmarkStart w:id="103" w:name="ref-tc2022rrts"/>
+    <w:bookmarkEnd w:id="102"/>
+    <w:bookmarkStart w:id="104" w:name="ref-tc2022rrts"/>
     <w:p>
       <w:pPr>
         <w:pStyle w:val="Bibliography"/>
@@ -5572,7 +5923,7 @@
       <w:r>
         <w:t xml:space="preserve"> </w:t>
       </w:r>
-      <w:hyperlink r:id="rId102">
+      <w:hyperlink r:id="rId103">
         <w:r>
           <w:rPr>
             <w:rStyle w:val="Hyperlink"/>
@@ -5581,8 +5932,8 @@
         </w:r>
       </w:hyperlink>
     </w:p>
-    <w:bookmarkEnd w:id="103"/>
-    <w:bookmarkStart w:id="105" w:name="ref-tc2023inventairepn"/>
+    <w:bookmarkEnd w:id="104"/>
+    <w:bookmarkStart w:id="106" w:name="ref-tc2023inventairepn"/>
     <w:p>
       <w:pPr>
         <w:pStyle w:val="Bibliography"/>
@@ -5606,7 +5957,7 @@
       <w:r>
         <w:t xml:space="preserve"> </w:t>
       </w:r>
-      <w:hyperlink r:id="rId104">
+      <w:hyperlink r:id="rId105">
         <w:r>
           <w:rPr>
             <w:rStyle w:val="Hyperlink"/>
@@ -5615,8 +5966,8 @@
         </w:r>
       </w:hyperlink>
     </w:p>
-    <w:bookmarkEnd w:id="105"/>
-    <w:bookmarkStart w:id="107" w:name="ref-tc2025gcp"/>
+    <w:bookmarkEnd w:id="106"/>
+    <w:bookmarkStart w:id="108" w:name="ref-tc2025gcp"/>
     <w:p>
       <w:pPr>
         <w:pStyle w:val="Bibliography"/>
@@ -5724,7 +6075,7 @@
       <w:r>
         <w:t xml:space="preserve"> </w:t>
       </w:r>
-      <w:hyperlink r:id="rId106">
+      <w:hyperlink r:id="rId107">
         <w:r>
           <w:rPr>
             <w:rStyle w:val="Hyperlink"/>
@@ -5733,8 +6084,8 @@
         </w:r>
       </w:hyperlink>
     </w:p>
-    <w:bookmarkEnd w:id="107"/>
-    <w:bookmarkStart w:id="109" w:name="ref-cror2025"/>
+    <w:bookmarkEnd w:id="108"/>
+    <w:bookmarkStart w:id="110" w:name="ref-cror2025"/>
     <w:p>
       <w:pPr>
         <w:pStyle w:val="Bibliography"/>
@@ -5758,7 +6109,7 @@
       <w:r>
         <w:t xml:space="preserve"> </w:t>
       </w:r>
-      <w:hyperlink r:id="rId108">
+      <w:hyperlink r:id="rId109">
         <w:r>
           <w:rPr>
             <w:rStyle w:val="Hyperlink"/>
@@ -5767,8 +6118,8 @@
         </w:r>
       </w:hyperlink>
     </w:p>
-    <w:bookmarkEnd w:id="109"/>
-    <w:bookmarkStart w:id="110" w:name="ref-uic2000f451"/>
+    <w:bookmarkEnd w:id="110"/>
+    <w:bookmarkStart w:id="111" w:name="ref-uic2000f451"/>
     <w:p>
       <w:pPr>
         <w:pStyle w:val="Bibliography"/>
@@ -5793,8 +6144,8 @@
         <w:t xml:space="preserve">[Fiche UIC 451-1/F/4, 4e \'ed.]. UIC.</w:t>
       </w:r>
     </w:p>
-    <w:bookmarkEnd w:id="110"/>
-    <w:bookmarkStart w:id="112" w:name="ref-fra2000acela"/>
+    <w:bookmarkEnd w:id="111"/>
+    <w:bookmarkStart w:id="113" w:name="ref-fra2000acela"/>
     <w:p>
       <w:pPr>
         <w:pStyle w:val="Bibliography"/>
@@ -5818,7 +6169,7 @@
       <w:r>
         <w:t xml:space="preserve"> </w:t>
       </w:r>
-      <w:hyperlink r:id="rId111">
+      <w:hyperlink r:id="rId112">
         <w:r>
           <w:rPr>
             <w:rStyle w:val="Hyperlink"/>
@@ -5827,8 +6178,8 @@
         </w:r>
       </w:hyperlink>
     </w:p>
-    <w:bookmarkEnd w:id="112"/>
-    <w:bookmarkStart w:id="114" w:name="ref-fra2010ptc"/>
+    <w:bookmarkEnd w:id="113"/>
+    <w:bookmarkStart w:id="115" w:name="ref-fra2010ptc"/>
     <w:p>
       <w:pPr>
         <w:pStyle w:val="Bibliography"/>
@@ -5852,7 +6203,7 @@
       <w:r>
         <w:t xml:space="preserve"> </w:t>
       </w:r>
-      <w:hyperlink r:id="rId113">
+      <w:hyperlink r:id="rId114">
         <w:r>
           <w:rPr>
             <w:rStyle w:val="Hyperlink"/>
@@ -5861,8 +6212,8 @@
         </w:r>
       </w:hyperlink>
     </w:p>
-    <w:bookmarkEnd w:id="114"/>
-    <w:bookmarkStart w:id="116" w:name="ref-fra2023brightlineptc"/>
+    <w:bookmarkEnd w:id="115"/>
+    <w:bookmarkStart w:id="117" w:name="ref-fra2023brightlineptc"/>
     <w:p>
       <w:pPr>
         <w:pStyle w:val="Bibliography"/>
@@ -5886,7 +6237,7 @@
       <w:r>
         <w:t xml:space="preserve"> </w:t>
       </w:r>
-      <w:hyperlink r:id="rId115">
+      <w:hyperlink r:id="rId116">
         <w:r>
           <w:rPr>
             <w:rStyle w:val="Hyperlink"/>
@@ -5895,8 +6246,8 @@
         </w:r>
       </w:hyperlink>
     </w:p>
-    <w:bookmarkEnd w:id="116"/>
-    <w:bookmarkStart w:id="118" w:name="ref-cfr236-0"/>
+    <w:bookmarkEnd w:id="117"/>
+    <w:bookmarkStart w:id="119" w:name="ref-cfr236-0"/>
     <w:p>
       <w:pPr>
         <w:pStyle w:val="Bibliography"/>
@@ -5920,7 +6271,7 @@
       <w:r>
         <w:t xml:space="preserve"> </w:t>
       </w:r>
-      <w:hyperlink r:id="rId117">
+      <w:hyperlink r:id="rId118">
         <w:r>
           <w:rPr>
             <w:rStyle w:val="Hyperlink"/>
@@ -5929,8 +6280,8 @@
         </w:r>
       </w:hyperlink>
     </w:p>
-    <w:bookmarkEnd w:id="118"/>
-    <w:bookmarkStart w:id="120" w:name="ref-cfr236-1007"/>
+    <w:bookmarkEnd w:id="119"/>
+    <w:bookmarkStart w:id="121" w:name="ref-cfr236-1007"/>
     <w:p>
       <w:pPr>
         <w:pStyle w:val="Bibliography"/>
@@ -5954,7 +6305,7 @@
       <w:r>
         <w:t xml:space="preserve"> </w:t>
       </w:r>
-      <w:hyperlink r:id="rId119">
+      <w:hyperlink r:id="rId120">
         <w:r>
           <w:rPr>
             <w:rStyle w:val="Hyperlink"/>
@@ -5963,8 +6314,8 @@
         </w:r>
       </w:hyperlink>
     </w:p>
-    <w:bookmarkEnd w:id="120"/>
-    <w:bookmarkStart w:id="122" w:name="ref-via2009lrc"/>
+    <w:bookmarkEnd w:id="121"/>
+    <w:bookmarkStart w:id="123" w:name="ref-via2009lrc"/>
     <w:p>
       <w:pPr>
         <w:pStyle w:val="Bibliography"/>
@@ -6009,7 +6360,7 @@
       <w:r>
         <w:t xml:space="preserve"> </w:t>
       </w:r>
-      <w:hyperlink r:id="rId121">
+      <w:hyperlink r:id="rId122">
         <w:r>
           <w:rPr>
             <w:rStyle w:val="Hyperlink"/>
@@ -6018,8 +6369,8 @@
         </w:r>
       </w:hyperlink>
     </w:p>
-    <w:bookmarkEnd w:id="122"/>
-    <w:bookmarkStart w:id="124" w:name="ref-via2025rapportannuel"/>
+    <w:bookmarkEnd w:id="123"/>
+    <w:bookmarkStart w:id="125" w:name="ref-via2025rapportannuel"/>
     <w:p>
       <w:pPr>
         <w:pStyle w:val="Bibliography"/>
@@ -6043,7 +6394,7 @@
       <w:r>
         <w:t xml:space="preserve"> </w:t>
       </w:r>
-      <w:hyperlink r:id="rId123">
+      <w:hyperlink r:id="rId124">
         <w:r>
           <w:rPr>
             <w:rStyle w:val="Hyperlink"/>
@@ -6052,8 +6403,8 @@
         </w:r>
       </w:hyperlink>
     </w:p>
-    <w:bookmarkEnd w:id="124"/>
-    <w:bookmarkStart w:id="126" w:name="ref-via2025t1"/>
+    <w:bookmarkEnd w:id="125"/>
+    <w:bookmarkStart w:id="127" w:name="ref-via2025t1"/>
     <w:p>
       <w:pPr>
         <w:pStyle w:val="Bibliography"/>
@@ -6077,7 +6428,7 @@
       <w:r>
         <w:t xml:space="preserve"> </w:t>
       </w:r>
-      <w:hyperlink r:id="rId125">
+      <w:hyperlink r:id="rId126">
         <w:r>
           <w:rPr>
             <w:rStyle w:val="Hyperlink"/>
@@ -6086,8 +6437,8 @@
         </w:r>
       </w:hyperlink>
     </w:p>
-    <w:bookmarkEnd w:id="126"/>
-    <w:bookmarkStart w:id="128" w:name="ref-viarail2026gtfs"/>
+    <w:bookmarkEnd w:id="127"/>
+    <w:bookmarkStart w:id="129" w:name="ref-viarail2026gtfs"/>
     <w:p>
       <w:pPr>
         <w:pStyle w:val="Bibliography"/>
@@ -6153,7 +6504,7 @@
       <w:r>
         <w:t xml:space="preserve"> </w:t>
       </w:r>
-      <w:hyperlink r:id="rId127">
+      <w:hyperlink r:id="rId128">
         <w:r>
           <w:rPr>
             <w:rStyle w:val="Hyperlink"/>
@@ -6162,8 +6513,8 @@
         </w:r>
       </w:hyperlink>
     </w:p>
-    <w:bookmarkEnd w:id="128"/>
-    <w:bookmarkStart w:id="130" w:name="ref-wcml2026wiki"/>
+    <w:bookmarkEnd w:id="129"/>
+    <w:bookmarkStart w:id="131" w:name="ref-wcml2026wiki"/>
     <w:p>
       <w:pPr>
         <w:pStyle w:val="Bibliography"/>
@@ -6201,7 +6552,7 @@
       <w:r>
         <w:t xml:space="preserve"> </w:t>
       </w:r>
-      <w:hyperlink r:id="rId129">
+      <w:hyperlink r:id="rId130">
         <w:r>
           <w:rPr>
             <w:rStyle w:val="Hyperlink"/>
@@ -6210,9 +6561,9 @@
         </w:r>
       </w:hyperlink>
     </w:p>
-    <w:bookmarkEnd w:id="130"/>
     <w:bookmarkEnd w:id="131"/>
     <w:bookmarkEnd w:id="132"/>
+    <w:bookmarkEnd w:id="133"/>
     <w:sectPr>
       <w:footnotePr>
         <w:numRestart w:val="eachSect"/>

</xml_diff>

<commit_message>
Bloc urbain de Québec étendu à Charny, figure des facteurs (scénario 2, 4 facteurs), figures auto en JPEG, cartes zoom
- 21/22/35 : bloc Charny ↔ Québec (pont de Québec figé comme le pont Victoria) ; bande 153 km/h ajoutée
- 32 : « Facteurs de réduction des temps de parcours » : cohabitation (régime + doublement, note), pendulaire et zones urbaines sous 153 km/h, changement de classe 153→201 ; arrivée = scénario 2
- 24 : quatre JPEG séparés pleine largeur (figure_vs_auto_<trajet>.jpg), planche PNG retirée ; 29 gère le MIME jpeg ; 19 aligné
- 35 : gros plans des blocs urbains de Montréal et de Québec
- rapport.md : Mtl-Qc S1 2 h 38, Qc-TO 7 h 15, marge réelle 2 h 44 / 39 min, sensibilité ±5 à ±9, légendes des figures ; retrait de la mention François (29 août)

Co-Authored-By: Claude Fable 5.1 <noreply@anthropic.com>
Claude-Session: https://claude.ai/code/session_01K8FWnQ4KeGMcC8MEfsKyYg
</commit_message>
<xml_diff>
--- a/livrables/rapport_corridor.docx
+++ b/livrables/rapport_corridor.docx
@@ -23,7 +23,7 @@
         <w:pStyle w:val="Author"/>
       </w:pPr>
       <w:r>
-        <w:t xml:space="preserve">Étude préparée pour Vision Transport (François Rebello) par Vincent Duguay</w:t>
+        <w:t xml:space="preserve">Étude préparée pour Vision Transport par Vincent Duguay</w:t>
       </w:r>
     </w:p>
     <w:p>
@@ -34,7 +34,7 @@
         <w:t xml:space="preserve">Août 2026</w:t>
       </w:r>
     </w:p>
-    <w:bookmarkStart w:id="15" w:name="lessentiel"/>
+    <w:bookmarkStart w:id="24" w:name="lessentiel"/>
     <w:p>
       <w:pPr>
         <w:pStyle w:val="Heading1"/>
@@ -261,7 +261,7 @@
               <w:pStyle w:val="Compact"/>
             </w:pPr>
             <w:r>
-              <w:t xml:space="preserve">2 h 35 (104 km/h)</w:t>
+              <w:t xml:space="preserve">2 h 38 (103 km/h)</w:t>
             </w:r>
           </w:p>
         </w:tc>
@@ -560,7 +560,7 @@
         <w:pStyle w:val="BodyText"/>
       </w:pPr>
       <w:r>
-        <w:t xml:space="preserve">De bout en bout, Québec-Toronto via Montréal passerait de 8 h 50 aujourd’hui (106 % du temps auto) à 7 h 12 au scénario 1 (86 % du temps auto) et 6 h 10 au scénario 3 (74 % du temps auto), contre environ 4 h 30 pour le projet ALTO (54 % du temps auto).</w:t>
+        <w:t xml:space="preserve">De bout en bout, Québec-Toronto via Montréal passerait de 8 h 50 aujourd’hui (106 % du temps auto) à 7 h 15 au scénario 1 (87 % du temps auto) et 6 h 10 au scénario 3 (74 % du temps auto), contre environ 4 h 30 pour le projet ALTO (54 % du temps auto).</w:t>
       </w:r>
     </w:p>
     <w:p>
@@ -570,14 +570,14 @@
       <w:r>
         <w:drawing>
           <wp:inline>
-            <wp:extent cx="5334000" cy="2878909"/>
+            <wp:extent cx="5334000" cy="2049093"/>
             <wp:effectExtent b="0" l="0" r="0" t="0"/>
-            <wp:docPr descr="Le train contre l’auto, pour les quatre trajets. Chaque barre de scénario est un temps calculé selon la méthode de la section 5. Le trait pointillé est le temps annoncé par ALTO. Temps auto : estimation à partir de la cartographie routière grand public (Google Maps), approximative." title="" id="10" name="Picture"/>
+            <wp:docPr descr="Montréal-Québec : le train contre l’auto. Chaque barre de scénario est un temps calculé selon la méthode de la section 5. Le trait pointillé est le temps annoncé par ALTO. Temps auto : estimation à partir de la cartographie routière grand public (Google Maps), approximative." title="" id="10" name="Picture"/>
             <a:graphic>
               <a:graphicData uri="http://schemas.openxmlformats.org/drawingml/2006/picture">
                 <pic:pic>
                   <pic:nvPicPr>
-                    <pic:cNvPr descr="livrables/figure_vs_auto.png" id="11" name="Picture"/>
+                    <pic:cNvPr descr="livrables/figure_vs_auto_montreal_quebec.jpg" id="11" name="Picture"/>
                     <pic:cNvPicPr>
                       <a:picLocks noChangeArrowheads="1" noChangeAspect="1"/>
                     </pic:cNvPicPr>
@@ -591,7 +591,7 @@
                   <pic:spPr bwMode="auto">
                     <a:xfrm>
                       <a:off x="0" y="0"/>
-                      <a:ext cx="5334000" cy="2878909"/>
+                      <a:ext cx="5334000" cy="2049093"/>
                     </a:xfrm>
                     <a:prstGeom prst="rect">
                       <a:avLst/>
@@ -615,25 +615,7 @@
         <w:pStyle w:val="ImageCaption"/>
       </w:pPr>
       <w:r>
-        <w:t xml:space="preserve">Le train contre l’auto, pour les quatre trajets. Chaque barre de scénario est un temps calculé selon la méthode de la section 5. Le trait pointillé est le temps annoncé par ALTO. Temps auto : estimation à partir de la cartographie routière grand public (Google Maps), approximative.</w:t>
-      </w:r>
-    </w:p>
-    <w:p>
-      <w:pPr>
-        <w:pStyle w:val="BodyText"/>
-      </w:pPr>
-      <w:r>
-        <w:rPr>
-          <w:b/>
-          <w:bCs/>
-        </w:rPr>
-        <w:t xml:space="preserve">Ce que la table dit.</w:t>
-      </w:r>
-      <w:r>
-        <w:t xml:space="preserve"> </w:t>
-      </w:r>
-      <w:r>
-        <w:t xml:space="preserve">Aujourd’hui, le train fait à peu près jeu égal avec l’auto sur Montréal-Toronto et la perd nettement sur Montréal-Québec. Dès le scénario 1 (train pendulaire et dévers de 5 po dans les courbes), le train bat l’auto sur les quatre trajets. Au scénario 3, il la bat de 20 à 41 %, selon le segment. La modernisation n’égale pas ALTO, et ce n’est pas son rôle : la voie existante offre un train compétitif avec la route, pour une fraction de l’effort, du temps et du coût, sans pour autant atteindre des temps de trajet de niveau TGV.</w:t>
+        <w:t xml:space="preserve">Montréal-Québec : le train contre l’auto. Chaque barre de scénario est un temps calculé selon la méthode de la section 5. Le trait pointillé est le temps annoncé par ALTO. Temps auto : estimation à partir de la cartographie routière grand public (Google Maps), approximative.</w:t>
       </w:r>
     </w:p>
     <w:p>
@@ -643,14 +625,14 @@
       <w:r>
         <w:drawing>
           <wp:inline>
-            <wp:extent cx="5334000" cy="1928546"/>
+            <wp:extent cx="5334000" cy="2049093"/>
             <wp:effectExtent b="0" l="0" r="0" t="0"/>
-            <wp:docPr descr="D’où viennent les minutes gagnées, trajet par trajet. La barre pleine, incluant les parties colorées, est l’horaire actuel. Le segment sans couleur est le temps du scénario 3 (train pendulaire, dévers de 5 po, signalisation et passages modernisés, rectification des courbes doublées, gains urbains inclus). Chaque tranche attribue une part du gain de temps à un levier." title="" id="13" name="Picture"/>
+            <wp:docPr descr="Montréal-Toronto : le train contre l’auto. Mêmes conventions." title="" id="13" name="Picture"/>
             <a:graphic>
               <a:graphicData uri="http://schemas.openxmlformats.org/drawingml/2006/picture">
                 <pic:pic>
                   <pic:nvPicPr>
-                    <pic:cNvPr descr="livrables/figure_gains.png" id="14" name="Picture"/>
+                    <pic:cNvPr descr="livrables/figure_vs_auto_montreal_toronto.jpg" id="14" name="Picture"/>
                     <pic:cNvPicPr>
                       <a:picLocks noChangeArrowheads="1" noChangeAspect="1"/>
                     </pic:cNvPicPr>
@@ -664,7 +646,7 @@
                   <pic:spPr bwMode="auto">
                     <a:xfrm>
                       <a:off x="0" y="0"/>
-                      <a:ext cx="5334000" cy="1928546"/>
+                      <a:ext cx="5334000" cy="2049093"/>
                     </a:xfrm>
                     <a:prstGeom prst="rect">
                       <a:avLst/>
@@ -688,7 +670,190 @@
         <w:pStyle w:val="ImageCaption"/>
       </w:pPr>
       <w:r>
-        <w:t xml:space="preserve">D’où viennent les minutes gagnées, trajet par trajet. La barre pleine, incluant les parties colorées, est l’horaire actuel. Le segment sans couleur est le temps du scénario 3 (train pendulaire, dévers de 5 po, signalisation et passages modernisés, rectification des courbes doublées, gains urbains inclus). Chaque tranche attribue une part du gain de temps à un levier.</w:t>
+        <w:t xml:space="preserve">Montréal-Toronto : le train contre l’auto. Mêmes conventions.</w:t>
+      </w:r>
+    </w:p>
+    <w:p>
+      <w:pPr>
+        <w:pStyle w:val="CaptionedFigure"/>
+      </w:pPr>
+      <w:r>
+        <w:drawing>
+          <wp:inline>
+            <wp:extent cx="5334000" cy="2049093"/>
+            <wp:effectExtent b="0" l="0" r="0" t="0"/>
+            <wp:docPr descr="Montréal-Ottawa : le train contre l’auto. Mêmes conventions." title="" id="16" name="Picture"/>
+            <a:graphic>
+              <a:graphicData uri="http://schemas.openxmlformats.org/drawingml/2006/picture">
+                <pic:pic>
+                  <pic:nvPicPr>
+                    <pic:cNvPr descr="livrables/figure_vs_auto_montreal_ottawa.jpg" id="17" name="Picture"/>
+                    <pic:cNvPicPr>
+                      <a:picLocks noChangeArrowheads="1" noChangeAspect="1"/>
+                    </pic:cNvPicPr>
+                  </pic:nvPicPr>
+                  <pic:blipFill>
+                    <a:blip r:embed="rId15"/>
+                    <a:stretch>
+                      <a:fillRect/>
+                    </a:stretch>
+                  </pic:blipFill>
+                  <pic:spPr bwMode="auto">
+                    <a:xfrm>
+                      <a:off x="0" y="0"/>
+                      <a:ext cx="5334000" cy="2049093"/>
+                    </a:xfrm>
+                    <a:prstGeom prst="rect">
+                      <a:avLst/>
+                    </a:prstGeom>
+                    <a:noFill/>
+                    <a:ln w="9525">
+                      <a:noFill/>
+                      <a:headEnd/>
+                      <a:tailEnd/>
+                    </a:ln>
+                  </pic:spPr>
+                </pic:pic>
+              </a:graphicData>
+            </a:graphic>
+          </wp:inline>
+        </w:drawing>
+      </w:r>
+    </w:p>
+    <w:p>
+      <w:pPr>
+        <w:pStyle w:val="ImageCaption"/>
+      </w:pPr>
+      <w:r>
+        <w:t xml:space="preserve">Montréal-Ottawa : le train contre l’auto. Mêmes conventions.</w:t>
+      </w:r>
+    </w:p>
+    <w:p>
+      <w:pPr>
+        <w:pStyle w:val="CaptionedFigure"/>
+      </w:pPr>
+      <w:r>
+        <w:drawing>
+          <wp:inline>
+            <wp:extent cx="5334000" cy="2049093"/>
+            <wp:effectExtent b="0" l="0" r="0" t="0"/>
+            <wp:docPr descr="Ottawa-Toronto : le train contre l’auto. Mêmes conventions." title="" id="19" name="Picture"/>
+            <a:graphic>
+              <a:graphicData uri="http://schemas.openxmlformats.org/drawingml/2006/picture">
+                <pic:pic>
+                  <pic:nvPicPr>
+                    <pic:cNvPr descr="livrables/figure_vs_auto_ottawa_toronto.jpg" id="20" name="Picture"/>
+                    <pic:cNvPicPr>
+                      <a:picLocks noChangeArrowheads="1" noChangeAspect="1"/>
+                    </pic:cNvPicPr>
+                  </pic:nvPicPr>
+                  <pic:blipFill>
+                    <a:blip r:embed="rId18"/>
+                    <a:stretch>
+                      <a:fillRect/>
+                    </a:stretch>
+                  </pic:blipFill>
+                  <pic:spPr bwMode="auto">
+                    <a:xfrm>
+                      <a:off x="0" y="0"/>
+                      <a:ext cx="5334000" cy="2049093"/>
+                    </a:xfrm>
+                    <a:prstGeom prst="rect">
+                      <a:avLst/>
+                    </a:prstGeom>
+                    <a:noFill/>
+                    <a:ln w="9525">
+                      <a:noFill/>
+                      <a:headEnd/>
+                      <a:tailEnd/>
+                    </a:ln>
+                  </pic:spPr>
+                </pic:pic>
+              </a:graphicData>
+            </a:graphic>
+          </wp:inline>
+        </w:drawing>
+      </w:r>
+    </w:p>
+    <w:p>
+      <w:pPr>
+        <w:pStyle w:val="ImageCaption"/>
+      </w:pPr>
+      <w:r>
+        <w:t xml:space="preserve">Ottawa-Toronto : le train contre l’auto. Mêmes conventions.</w:t>
+      </w:r>
+    </w:p>
+    <w:p>
+      <w:pPr>
+        <w:pStyle w:val="BodyText"/>
+      </w:pPr>
+      <w:r>
+        <w:rPr>
+          <w:b/>
+          <w:bCs/>
+        </w:rPr>
+        <w:t xml:space="preserve">Ce que la table dit.</w:t>
+      </w:r>
+      <w:r>
+        <w:t xml:space="preserve"> </w:t>
+      </w:r>
+      <w:r>
+        <w:t xml:space="preserve">Aujourd’hui, le train fait à peu près jeu égal avec l’auto sur Montréal-Toronto et la perd nettement sur Montréal-Québec. Dès le scénario 1 (train pendulaire et dévers de 5 po dans les courbes), le train bat l’auto sur les quatre trajets. Au scénario 3, il la bat de 20 à 41 %, selon le segment. La modernisation n’égale pas ALTO, et ce n’est pas son rôle : la voie existante offre un train compétitif avec la route, pour une fraction de l’effort, du temps et du coût, sans pour autant atteindre des temps de trajet de niveau TGV.</w:t>
+      </w:r>
+    </w:p>
+    <w:p>
+      <w:pPr>
+        <w:pStyle w:val="CaptionedFigure"/>
+      </w:pPr>
+      <w:r>
+        <w:drawing>
+          <wp:inline>
+            <wp:extent cx="5334000" cy="4244615"/>
+            <wp:effectExtent b="0" l="0" r="0" t="0"/>
+            <wp:docPr descr="Facteurs de réduction des temps de parcours, trajet par trajet. La barre pleine, incluant les parties colorées, est l’horaire actuel. Le segment sans couleur est le temps du scénario 2 (train pendulaire, dévers de 5 po, zones urbaines modernisées, sans correction de courbes). Quatre facteurs se partagent le gain : la cohabitation, qui réunit le régime de circulation avec le fret et le doublement des voies ; le train pendulaire et les zones urbaines, comptés sous la classe de voie actuelle (153 km/h, 95 mi/h) ; et le changement de classe, soit ce que ces facteurs rapportent en plus une fois le plafond porté à 201 km/h grâce aux passages à niveau sécurisés et à la signalisation." title="" id="22" name="Picture"/>
+            <a:graphic>
+              <a:graphicData uri="http://schemas.openxmlformats.org/drawingml/2006/picture">
+                <pic:pic>
+                  <pic:nvPicPr>
+                    <pic:cNvPr descr="livrables/figure_gains.png" id="23" name="Picture"/>
+                    <pic:cNvPicPr>
+                      <a:picLocks noChangeArrowheads="1" noChangeAspect="1"/>
+                    </pic:cNvPicPr>
+                  </pic:nvPicPr>
+                  <pic:blipFill>
+                    <a:blip r:embed="rId21"/>
+                    <a:stretch>
+                      <a:fillRect/>
+                    </a:stretch>
+                  </pic:blipFill>
+                  <pic:spPr bwMode="auto">
+                    <a:xfrm>
+                      <a:off x="0" y="0"/>
+                      <a:ext cx="5334000" cy="4244615"/>
+                    </a:xfrm>
+                    <a:prstGeom prst="rect">
+                      <a:avLst/>
+                    </a:prstGeom>
+                    <a:noFill/>
+                    <a:ln w="9525">
+                      <a:noFill/>
+                      <a:headEnd/>
+                      <a:tailEnd/>
+                    </a:ln>
+                  </pic:spPr>
+                </pic:pic>
+              </a:graphicData>
+            </a:graphic>
+          </wp:inline>
+        </w:drawing>
+      </w:r>
+    </w:p>
+    <w:p>
+      <w:pPr>
+        <w:pStyle w:val="ImageCaption"/>
+      </w:pPr>
+      <w:r>
+        <w:t xml:space="preserve">Facteurs de réduction des temps de parcours, trajet par trajet. La barre pleine, incluant les parties colorées, est l’horaire actuel. Le segment sans couleur est le temps du scénario 2 (train pendulaire, dévers de 5 po, zones urbaines modernisées, sans correction de courbes). Quatre facteurs se partagent le gain : la cohabitation, qui réunit le régime de circulation avec le fret et le doublement des voies ; le train pendulaire et les zones urbaines, comptés sous la classe de voie actuelle (153 km/h, 95 mi/h) ; et le changement de classe, soit ce que ces facteurs rapportent en plus une fois le plafond porté à 201 km/h grâce aux passages à niveau sécurisés et à la signalisation.</w:t>
       </w:r>
     </w:p>
     <w:p>
@@ -1041,8 +1206,8 @@
         <w:t xml:space="preserve">. C’est précisément le rôle de l’étude qui devrait suivre.</w:t>
       </w:r>
     </w:p>
-    <w:bookmarkEnd w:id="15"/>
-    <w:bookmarkStart w:id="16" w:name="les-trois-scénarios-analysés"/>
+    <w:bookmarkEnd w:id="24"/>
+    <w:bookmarkStart w:id="25" w:name="les-trois-scénarios-analysés"/>
     <w:p>
       <w:pPr>
         <w:pStyle w:val="Heading1"/>
@@ -1284,8 +1449,8 @@
         <w:t xml:space="preserve">. Un pendulaire use davantage le rail en courbe qu’un train régulier : le scénario suppose un entretien et des inspections à la hauteur, ce qui impose nécessairement des coûts supplémentaires et une entente avec le propriétaire de la voie.</w:t>
       </w:r>
     </w:p>
-    <w:bookmarkEnd w:id="16"/>
-    <w:bookmarkStart w:id="20" w:name="ce-que-les-scénarios-demandent"/>
+    <w:bookmarkEnd w:id="25"/>
+    <w:bookmarkStart w:id="29" w:name="ce-que-les-scénarios-demandent"/>
     <w:p>
       <w:pPr>
         <w:pStyle w:val="Heading1"/>
@@ -1294,7 +1459,7 @@
         <w:t xml:space="preserve">Ce que les scénarios demandent</w:t>
       </w:r>
     </w:p>
-    <w:bookmarkStart w:id="17" w:name="les-passages-à-niveau"/>
+    <w:bookmarkStart w:id="26" w:name="les-passages-à-niveau"/>
     <w:p>
       <w:pPr>
         <w:pStyle w:val="Heading2"/>
@@ -1690,8 +1855,8 @@
         <w:t xml:space="preserve">. Le corridor bute sur ce mur depuis cinquante ans : un corridor scellé est la façon la plus économe de permettre une vitesse plus haute sans tout reconstruire.</w:t>
       </w:r>
     </w:p>
-    <w:bookmarkEnd w:id="17"/>
-    <w:bookmarkStart w:id="18" w:name="la-signalisation"/>
+    <w:bookmarkEnd w:id="26"/>
+    <w:bookmarkStart w:id="27" w:name="la-signalisation"/>
     <w:p>
       <w:pPr>
         <w:pStyle w:val="Heading2"/>
@@ -1996,8 +2161,8 @@
         <w:t xml:space="preserve">. La modernisation proposée pourrait être l’occasion de le faire, mais son impact n’est pas étudié ici.</w:t>
       </w:r>
     </w:p>
-    <w:bookmarkEnd w:id="18"/>
-    <w:bookmarkStart w:id="19" w:name="le-dévers-inclinaison-de-la-voie"/>
+    <w:bookmarkEnd w:id="27"/>
+    <w:bookmarkStart w:id="28" w:name="le-dévers-inclinaison-de-la-voie"/>
     <w:p>
       <w:pPr>
         <w:pStyle w:val="Heading2"/>
@@ -2407,9 +2572,9 @@
         <w:t xml:space="preserve">La géométrie du corridor n’a donc pas besoin d’être reconstruite pour améliorer la performance. Elle a surtout besoin d’un meilleur train.</w:t>
       </w:r>
     </w:p>
-    <w:bookmarkEnd w:id="19"/>
-    <w:bookmarkEnd w:id="20"/>
-    <w:bookmarkStart w:id="27" w:name="Xe7ab6870725a631c9031127d1d3ed94a4cc89ce"/>
+    <w:bookmarkEnd w:id="28"/>
+    <w:bookmarkEnd w:id="29"/>
+    <w:bookmarkStart w:id="36" w:name="Xe7ab6870725a631c9031127d1d3ed94a4cc89ce"/>
     <w:p>
       <w:pPr>
         <w:pStyle w:val="Heading1"/>
@@ -2418,7 +2583,7 @@
         <w:t xml:space="preserve">Doubler la voie, et vivre ensemble sur le rail</w:t>
       </w:r>
     </w:p>
-    <w:bookmarkStart w:id="24" w:name="ce-que-la-voie-double-achète-vraiment"/>
+    <w:bookmarkStart w:id="33" w:name="ce-que-la-voie-double-achète-vraiment"/>
     <w:p>
       <w:pPr>
         <w:pStyle w:val="Heading2"/>
@@ -2686,18 +2851,18 @@
           <wp:inline>
             <wp:extent cx="5334000" cy="3118082"/>
             <wp:effectExtent b="0" l="0" r="0" t="0"/>
-            <wp:docPr descr="Le corridor, coloré selon sa famille voie et propriétaire. En gris, les inter-gares exclus de la mesure (zones urbaines, ponts, frontières de propriétaire). L’approche est d’Ottawa reste en couleur : aucune gare entre Casselman et Ottawa ne permet de l’isoler, et la paire est gardée avec cette réserve." title="" id="22" name="Picture"/>
+            <wp:docPr descr="Le corridor, coloré selon sa famille voie et propriétaire. En gris, les inter-gares exclus de la mesure (zones urbaines, ponts, frontières de propriétaire). L’approche est d’Ottawa reste en couleur : aucune gare entre Casselman et Ottawa ne permet de l’isoler, et la paire est gardée avec cette réserve." title="" id="31" name="Picture"/>
             <a:graphic>
               <a:graphicData uri="http://schemas.openxmlformats.org/drawingml/2006/picture">
                 <pic:pic>
                   <pic:nvPicPr>
-                    <pic:cNvPr descr="livrables/figure_cellules.png" id="23" name="Picture"/>
+                    <pic:cNvPr descr="livrables/figure_cellules.png" id="32" name="Picture"/>
                     <pic:cNvPicPr>
                       <a:picLocks noChangeArrowheads="1" noChangeAspect="1"/>
                     </pic:cNvPicPr>
                   </pic:nvPicPr>
                   <pic:blipFill>
-                    <a:blip r:embed="rId21"/>
+                    <a:blip r:embed="rId30"/>
                     <a:stretch>
                       <a:fillRect/>
                     </a:stretch>
@@ -2828,29 +2993,29 @@
               <w:pStyle w:val="Compact"/>
             </w:pPr>
             <w:r>
-              <w:t xml:space="preserve">3 h 22</w:t>
-            </w:r>
-          </w:p>
-        </w:tc>
-        <w:tc>
-          <w:tcPr/>
-          <w:p>
-            <w:pPr>
-              <w:pStyle w:val="Compact"/>
-            </w:pPr>
-            <w:r>
-              <w:t xml:space="preserve">2 h 43</w:t>
-            </w:r>
-          </w:p>
-        </w:tc>
-        <w:tc>
-          <w:tcPr/>
-          <w:p>
-            <w:pPr>
-              <w:pStyle w:val="Compact"/>
-            </w:pPr>
-            <w:r>
-              <w:t xml:space="preserve">24 % (40 min)</w:t>
+              <w:t xml:space="preserve">3 h 22</w:t>
+            </w:r>
+          </w:p>
+        </w:tc>
+        <w:tc>
+          <w:tcPr/>
+          <w:p>
+            <w:pPr>
+              <w:pStyle w:val="Compact"/>
+            </w:pPr>
+            <w:r>
+              <w:t xml:space="preserve">2 h 44</w:t>
+            </w:r>
+          </w:p>
+        </w:tc>
+        <w:tc>
+          <w:tcPr/>
+          <w:p>
+            <w:pPr>
+              <w:pStyle w:val="Compact"/>
+            </w:pPr>
+            <w:r>
+              <w:t xml:space="preserve">24 % (39 min)</w:t>
             </w:r>
           </w:p>
         </w:tc>
@@ -3096,8 +3261,8 @@
         <w:t xml:space="preserve">Aujourd’hui, chaque minute gagnée par le passager sur une voie simple est une minute prise au fret, et inversement : un jeu à somme nulle. Avec la deuxième voie, les deux circulations cessent de se disputer le même créneau. Le fret garde sa fluidité, le passager gagne sa régularité, dans une configuration gagnant-gagnant.</w:t>
       </w:r>
     </w:p>
-    <w:bookmarkEnd w:id="24"/>
-    <w:bookmarkStart w:id="25" w:name="Xe870b771d6d846327e27c8161e0e3641846dbc5"/>
+    <w:bookmarkEnd w:id="33"/>
+    <w:bookmarkStart w:id="34" w:name="Xe870b771d6d846327e27c8161e0e3641846dbc5"/>
     <w:p>
       <w:pPr>
         <w:pStyle w:val="Heading2"/>
@@ -3368,8 +3533,8 @@
         <w:t xml:space="preserve">. Ce pouvoir n’a simplement jamais servi, notamment parce qu’il ne s’applique pas aux contrats de cohabitation existants (le modèle VIA-CN du corridor) et qu’une orientation claire en faveur du service aux passagers n’a jamais été édictée. Ces deux enjeux peuvent aisément être corrigés, par règlement ou par projet de loi : une note juridique plus détaillée est fournie en complément.</w:t>
       </w:r>
     </w:p>
-    <w:bookmarkEnd w:id="25"/>
-    <w:bookmarkStart w:id="26" w:name="par-où-commencer-le-doublement"/>
+    <w:bookmarkEnd w:id="34"/>
+    <w:bookmarkStart w:id="35" w:name="par-où-commencer-le-doublement"/>
     <w:p>
       <w:pPr>
         <w:pStyle w:val="Heading2"/>
@@ -3446,9 +3611,9 @@
         <w:t xml:space="preserve">. Le programme devrait donc commencer là : allonger et relier les évitements en place, la deuxième voie continue venant fermer les intervalles restants.</w:t>
       </w:r>
     </w:p>
-    <w:bookmarkEnd w:id="26"/>
-    <w:bookmarkEnd w:id="27"/>
-    <w:bookmarkStart w:id="33" w:name="comment-nous-avons-mesuré"/>
+    <w:bookmarkEnd w:id="35"/>
+    <w:bookmarkEnd w:id="36"/>
+    <w:bookmarkStart w:id="42" w:name="comment-nous-avons-mesuré"/>
     <w:p>
       <w:pPr>
         <w:pStyle w:val="Heading1"/>
@@ -3457,7 +3622,7 @@
         <w:t xml:space="preserve">Comment nous avons mesuré</w:t>
       </w:r>
     </w:p>
-    <w:bookmarkStart w:id="28" w:name="les-données"/>
+    <w:bookmarkStart w:id="37" w:name="les-données"/>
     <w:p>
       <w:pPr>
         <w:pStyle w:val="Heading2"/>
@@ -3534,8 +3699,8 @@
         <w:t xml:space="preserve">. Le nombre de voies est détecté par la géométrie des voies parallèles dans la carte.</w:t>
       </w:r>
     </w:p>
-    <w:bookmarkEnd w:id="28"/>
-    <w:bookmarkStart w:id="29" w:name="le-modèle-de-temps"/>
+    <w:bookmarkEnd w:id="37"/>
+    <w:bookmarkStart w:id="38" w:name="le-modèle-de-temps"/>
     <w:p>
       <w:pPr>
         <w:pStyle w:val="Heading2"/>
@@ -3756,8 +3921,8 @@
         <w:t xml:space="preserve">.</w:t>
       </w:r>
     </w:p>
-    <w:bookmarkEnd w:id="29"/>
-    <w:bookmarkStart w:id="30" w:name="la-marge-de-10"/>
+    <w:bookmarkEnd w:id="38"/>
+    <w:bookmarkStart w:id="39" w:name="la-marge-de-10"/>
     <w:p>
       <w:pPr>
         <w:pStyle w:val="Heading2"/>
@@ -3887,8 +4052,8 @@
         <w:t xml:space="preserve">: légèrement plus prudent que la médiane, et aligné sur le référent britannique dont ce rapport invoque le précédent. En regard, le corridor porte aujourd’hui de 7 à 24 % de marge selon le tronçon : l’écart entre cette réalité et la norme est le prix du régime de cohabitation, mesuré à la section précédente.</w:t>
       </w:r>
     </w:p>
-    <w:bookmarkEnd w:id="30"/>
-    <w:bookmarkStart w:id="31" w:name="la-correction-des-courbes-courtes"/>
+    <w:bookmarkEnd w:id="39"/>
+    <w:bookmarkStart w:id="40" w:name="la-correction-des-courbes-courtes"/>
     <w:p>
       <w:pPr>
         <w:pStyle w:val="Heading2"/>
@@ -3913,8 +4078,8 @@
         <w:t xml:space="preserve">Pour y remédier, une vérification sur le terrain menée sur un secteur témoin avec l’aide d’un expert ferroviaire a permis de chiffrer l’erreur en comparant la mesure officielle avec le résultat du code : sur des courbes de 300 à 400 m, le rayon publié valait, dans le pire cas, environ le double du rayon réel ; cet écart gonfle donc la vitesse possible d’environ 30 % sur les courbes courtes. Les chiffres publiés dans ce rapport incluent donc une correction volontairement prudente : sur tout segment courbe de moins de 900 m, le rayon mesuré est divisé par deux avant de calculer la vitesse, alignant leur vitesse sur le plus grand écart entre la mesure de l’expert et celle du code. Cette règle touche 414 segments (187 km), ajoute environ 96 km aux kilomètres restants sous le plafond (un quart de plus) et de 4 à 13 minutes aux temps (avant marge) selon le tronçon. Lever cette incertitude serait relativement simple avec un accès à une carte plus précise, ce qui n’a pas été possible dans le cadre de cette étude basée sur des données ouvertes.</w:t>
       </w:r>
     </w:p>
-    <w:bookmarkEnd w:id="31"/>
-    <w:bookmarkStart w:id="32" w:name="hors-périmètre"/>
+    <w:bookmarkEnd w:id="40"/>
+    <w:bookmarkStart w:id="41" w:name="hors-périmètre"/>
     <w:p>
       <w:pPr>
         <w:pStyle w:val="Heading2"/>
@@ -3931,9 +4096,9 @@
         <w:t xml:space="preserve">La conception par site, les fiches de traction des constructeurs, les pentes, la simulation fine de la circulation, les ponts et tunnels, l’état détaillé de la voie et l’intérieur des zones urbaines sont hors du périmètre de cette étude. Les horaires mesurés datent de la saison 2026, une période de restrictions exceptionnelles : les marges mesurées sont possiblement gonflées, ce qui est signalé où c’est pertinent.</w:t>
       </w:r>
     </w:p>
-    <w:bookmarkEnd w:id="32"/>
-    <w:bookmarkEnd w:id="33"/>
-    <w:bookmarkStart w:id="34" w:name="résultats-détaillés"/>
+    <w:bookmarkEnd w:id="41"/>
+    <w:bookmarkEnd w:id="42"/>
+    <w:bookmarkStart w:id="43" w:name="résultats-détaillés"/>
     <w:p>
       <w:pPr>
         <w:pStyle w:val="Heading1"/>
@@ -4065,51 +4230,51 @@
               <w:pStyle w:val="Compact"/>
             </w:pPr>
             <w:r>
-              <w:t xml:space="preserve">3 h 22</w:t>
-            </w:r>
-          </w:p>
-        </w:tc>
-        <w:tc>
-          <w:tcPr/>
-          <w:p>
-            <w:pPr>
-              <w:pStyle w:val="Compact"/>
-            </w:pPr>
-            <w:r>
-              <w:t xml:space="preserve">2 h 35</w:t>
-            </w:r>
-          </w:p>
-        </w:tc>
-        <w:tc>
-          <w:tcPr/>
-          <w:p>
-            <w:pPr>
-              <w:pStyle w:val="Compact"/>
-            </w:pPr>
-            <w:r>
-              <w:t xml:space="preserve">2 h 16</w:t>
-            </w:r>
-          </w:p>
-        </w:tc>
-        <w:tc>
-          <w:tcPr/>
-          <w:p>
-            <w:pPr>
-              <w:pStyle w:val="Compact"/>
-            </w:pPr>
-            <w:r>
-              <w:t xml:space="preserve">1 h 56</w:t>
-            </w:r>
-          </w:p>
-        </w:tc>
-        <w:tc>
-          <w:tcPr/>
-          <w:p>
-            <w:pPr>
-              <w:pStyle w:val="Compact"/>
-            </w:pPr>
-            <w:r>
-              <w:t xml:space="preserve">~1 h 30</w:t>
+              <w:t xml:space="preserve">3 h 22</w:t>
+            </w:r>
+          </w:p>
+        </w:tc>
+        <w:tc>
+          <w:tcPr/>
+          <w:p>
+            <w:pPr>
+              <w:pStyle w:val="Compact"/>
+            </w:pPr>
+            <w:r>
+              <w:t xml:space="preserve">2 h 38</w:t>
+            </w:r>
+          </w:p>
+        </w:tc>
+        <w:tc>
+          <w:tcPr/>
+          <w:p>
+            <w:pPr>
+              <w:pStyle w:val="Compact"/>
+            </w:pPr>
+            <w:r>
+              <w:t xml:space="preserve">2 h 16</w:t>
+            </w:r>
+          </w:p>
+        </w:tc>
+        <w:tc>
+          <w:tcPr/>
+          <w:p>
+            <w:pPr>
+              <w:pStyle w:val="Compact"/>
+            </w:pPr>
+            <w:r>
+              <w:t xml:space="preserve">1 h 56</w:t>
+            </w:r>
+          </w:p>
+        </w:tc>
+        <w:tc>
+          <w:tcPr/>
+          <w:p>
+            <w:pPr>
+              <w:pStyle w:val="Compact"/>
+            </w:pPr>
+            <w:r>
+              <w:t xml:space="preserve">~1 h 30</w:t>
             </w:r>
           </w:p>
         </w:tc>
@@ -4337,51 +4502,51 @@
               <w:pStyle w:val="Compact"/>
             </w:pPr>
             <w:r>
-              <w:t xml:space="preserve">8 h 50</w:t>
-            </w:r>
-          </w:p>
-        </w:tc>
-        <w:tc>
-          <w:tcPr/>
-          <w:p>
-            <w:pPr>
-              <w:pStyle w:val="Compact"/>
-            </w:pPr>
-            <w:r>
-              <w:t xml:space="preserve">7 h 12</w:t>
-            </w:r>
-          </w:p>
-        </w:tc>
-        <w:tc>
-          <w:tcPr/>
-          <w:p>
-            <w:pPr>
-              <w:pStyle w:val="Compact"/>
-            </w:pPr>
-            <w:r>
-              <w:t xml:space="preserve">6 h 30</w:t>
-            </w:r>
-          </w:p>
-        </w:tc>
-        <w:tc>
-          <w:tcPr/>
-          <w:p>
-            <w:pPr>
-              <w:pStyle w:val="Compact"/>
-            </w:pPr>
-            <w:r>
-              <w:t xml:space="preserve">6 h 10</w:t>
-            </w:r>
-          </w:p>
-        </w:tc>
-        <w:tc>
-          <w:tcPr/>
-          <w:p>
-            <w:pPr>
-              <w:pStyle w:val="Compact"/>
-            </w:pPr>
-            <w:r>
-              <w:t xml:space="preserve">~4 h 30</w:t>
+              <w:t xml:space="preserve">8 h 50</w:t>
+            </w:r>
+          </w:p>
+        </w:tc>
+        <w:tc>
+          <w:tcPr/>
+          <w:p>
+            <w:pPr>
+              <w:pStyle w:val="Compact"/>
+            </w:pPr>
+            <w:r>
+              <w:t xml:space="preserve">7 h 15</w:t>
+            </w:r>
+          </w:p>
+        </w:tc>
+        <w:tc>
+          <w:tcPr/>
+          <w:p>
+            <w:pPr>
+              <w:pStyle w:val="Compact"/>
+            </w:pPr>
+            <w:r>
+              <w:t xml:space="preserve">6 h 30</w:t>
+            </w:r>
+          </w:p>
+        </w:tc>
+        <w:tc>
+          <w:tcPr/>
+          <w:p>
+            <w:pPr>
+              <w:pStyle w:val="Compact"/>
+            </w:pPr>
+            <w:r>
+              <w:t xml:space="preserve">6 h 10</w:t>
+            </w:r>
+          </w:p>
+        </w:tc>
+        <w:tc>
+          <w:tcPr/>
+          <w:p>
+            <w:pPr>
+              <w:pStyle w:val="Compact"/>
+            </w:pPr>
+            <w:r>
+              <w:t xml:space="preserve">~4 h 30</w:t>
             </w:r>
           </w:p>
         </w:tc>
@@ -4431,7 +4596,7 @@
         <w:t xml:space="preserve"> </w:t>
       </w:r>
       <w:r>
-        <w:t xml:space="preserve">La délimitation des zones urbaines varie de ±20 % : effet de ±4 à ±8 minutes sur les temps avant marge du scénario 1. La rame actuelle de VIA (une locomotive Charger et cinq voitures Venture) porte 8,4 W de puissance nominale par kilogramme de rame à vide ; le modèle arrondit à 8</w:t>
+        <w:t xml:space="preserve">La délimitation des zones urbaines varie de ±20 % : effet de ±5 à ±9 minutes sur les temps avant marge du scénario 1. La rame actuelle de VIA (une locomotive Charger et cinq voitures Venture) porte 8,4 W de puissance nominale par kilogramme de rame à vide ; le modèle arrondit à 8</w:t>
       </w:r>
       <w:r>
         <w:t xml:space="preserve"> </w:t>
@@ -4584,8 +4749,8 @@
         <w:t xml:space="preserve">. Deux réserves : la masse des voitures Venture vient d’une source secondaire (corroborée à 1 % près par la fiche officielle de la locomotive), et la puissance nominale n’est pas celle disponible au rail : un train moins puissant ajouterait 3 à 5 minutes par tronçon. Les conventions de calcul sont au registre des sources.</w:t>
       </w:r>
     </w:p>
-    <w:bookmarkEnd w:id="34"/>
-    <w:bookmarkStart w:id="35" w:name="Xfdc148e5a6fd2c26c89d44d88229f0bfe73e54a"/>
+    <w:bookmarkEnd w:id="43"/>
+    <w:bookmarkStart w:id="44" w:name="Xfdc148e5a6fd2c26c89d44d88229f0bfe73e54a"/>
     <w:p>
       <w:pPr>
         <w:pStyle w:val="Heading1"/>
@@ -5011,8 +5176,8 @@
         <w:t xml:space="preserve">Comme levier de temps, retirer ces 627 passages ne se justifie pas : des centaines d’ouvrages pour gagner 2 à 12 minutes, alors que le traitement des passages en place des scénarios 1 à 3 coûte une fraction de ce prix. Les retraits gardent leurs autres mérites, notamment la sécurité, et quelques-uns se justifieront site par site. Mais quiconque veut des minutes au-delà du scénario 3 doit toucher au tracé lui-même, et c’est un autre projet : celui d’ALTO. Cette page établit l’écart entre les deux mondes.</w:t>
       </w:r>
     </w:p>
-    <w:bookmarkEnd w:id="35"/>
-    <w:bookmarkStart w:id="36" w:name="limites-et-létude-quil-faut-commander"/>
+    <w:bookmarkEnd w:id="44"/>
+    <w:bookmarkStart w:id="45" w:name="limites-et-létude-quil-faut-commander"/>
     <w:p>
       <w:pPr>
         <w:pStyle w:val="Heading1"/>
@@ -5037,8 +5202,8 @@
         <w:t xml:space="preserve">L’étape suivante est une étude de circulation menée avec le propriétaire de la voie. Elle devra répartir la marge entre ses causes (fret, état de voie, passages à niveau, terminaux), dimensionner les interventions de capacité (liaisons rapides, troisième voie, évitements), lever la correction des courbes courtes avec une géométrie fine, et établir la feuille de route concrète de l’alternative à ALTO.</w:t>
       </w:r>
     </w:p>
-    <w:bookmarkEnd w:id="36"/>
-    <w:bookmarkStart w:id="37" w:name="note-de-lauteur"/>
+    <w:bookmarkEnd w:id="45"/>
+    <w:bookmarkStart w:id="46" w:name="note-de-lauteur"/>
     <w:p>
       <w:pPr>
         <w:pStyle w:val="Heading1"/>
@@ -5169,8 +5334,8 @@
         <w:t xml:space="preserve">chiffres clés du rapport dans le navigateur du lecteur.</w:t>
       </w:r>
     </w:p>
-    <w:bookmarkEnd w:id="37"/>
-    <w:bookmarkStart w:id="147" w:name="références"/>
+    <w:bookmarkEnd w:id="46"/>
+    <w:bookmarkStart w:id="156" w:name="références"/>
     <w:p>
       <w:pPr>
         <w:pStyle w:val="Heading1"/>
@@ -5179,8 +5344,8 @@
         <w:t xml:space="preserve">Références</w:t>
       </w:r>
     </w:p>
-    <w:bookmarkStart w:id="146" w:name="refs"/>
-    <w:bookmarkStart w:id="39" w:name="ref-alstom2005pendolino"/>
+    <w:bookmarkStart w:id="155" w:name="refs"/>
+    <w:bookmarkStart w:id="48" w:name="ref-alstom2005pendolino"/>
     <w:p>
       <w:pPr>
         <w:pStyle w:val="Bibliography"/>
@@ -5204,7 +5369,7 @@
       <w:r>
         <w:t xml:space="preserve"> </w:t>
       </w:r>
-      <w:hyperlink r:id="rId38">
+      <w:hyperlink r:id="rId47">
         <w:r>
           <w:rPr>
             <w:rStyle w:val="Hyperlink"/>
@@ -5213,8 +5378,8 @@
         </w:r>
       </w:hyperlink>
     </w:p>
-    <w:bookmarkEnd w:id="39"/>
-    <w:bookmarkStart w:id="41" w:name="ref-alto2025"/>
+    <w:bookmarkEnd w:id="48"/>
+    <w:bookmarkStart w:id="50" w:name="ref-alto2025"/>
     <w:p>
       <w:pPr>
         <w:pStyle w:val="Bibliography"/>
@@ -5238,7 +5403,7 @@
       <w:r>
         <w:t xml:space="preserve"> </w:t>
       </w:r>
-      <w:hyperlink r:id="rId40">
+      <w:hyperlink r:id="rId49">
         <w:r>
           <w:rPr>
             <w:rStyle w:val="Hyperlink"/>
@@ -5247,8 +5412,8 @@
         </w:r>
       </w:hyperlink>
     </w:p>
-    <w:bookmarkEnd w:id="41"/>
-    <w:bookmarkStart w:id="43" w:name="ref-altotrain2026faq"/>
+    <w:bookmarkEnd w:id="50"/>
+    <w:bookmarkStart w:id="52" w:name="ref-altotrain2026faq"/>
     <w:p>
       <w:pPr>
         <w:pStyle w:val="Bibliography"/>
@@ -5272,7 +5437,7 @@
       <w:r>
         <w:t xml:space="preserve"> </w:t>
       </w:r>
-      <w:hyperlink r:id="rId42">
+      <w:hyperlink r:id="rId51">
         <w:r>
           <w:rPr>
             <w:rStyle w:val="Hyperlink"/>
@@ -5281,8 +5446,8 @@
         </w:r>
       </w:hyperlink>
     </w:p>
-    <w:bookmarkEnd w:id="43"/>
-    <w:bookmarkStart w:id="45" w:name="ref-amtrakoig2019"/>
+    <w:bookmarkEnd w:id="52"/>
+    <w:bookmarkStart w:id="54" w:name="ref-amtrakoig2019"/>
     <w:p>
       <w:pPr>
         <w:pStyle w:val="Bibliography"/>
@@ -5309,7 +5474,7 @@
       <w:r>
         <w:t xml:space="preserve"> </w:t>
       </w:r>
-      <w:hyperlink r:id="rId44">
+      <w:hyperlink r:id="rId53">
         <w:r>
           <w:rPr>
             <w:rStyle w:val="Hyperlink"/>
@@ -5318,8 +5483,8 @@
         </w:r>
       </w:hyperlink>
     </w:p>
-    <w:bookmarkEnd w:id="45"/>
-    <w:bookmarkStart w:id="47" w:name="ref-canadianrail1976"/>
+    <w:bookmarkEnd w:id="54"/>
+    <w:bookmarkStart w:id="56" w:name="ref-canadianrail1976"/>
     <w:p>
       <w:pPr>
         <w:pStyle w:val="Bibliography"/>
@@ -5343,7 +5508,7 @@
       <w:r>
         <w:t xml:space="preserve"> </w:t>
       </w:r>
-      <w:hyperlink r:id="rId46">
+      <w:hyperlink r:id="rId55">
         <w:r>
           <w:rPr>
             <w:rStyle w:val="Hyperlink"/>
@@ -5352,8 +5517,8 @@
         </w:r>
       </w:hyperlink>
     </w:p>
-    <w:bookmarkEnd w:id="47"/>
-    <w:bookmarkStart w:id="49" w:name="ref-austriaforum2026icet"/>
+    <w:bookmarkEnd w:id="56"/>
+    <w:bookmarkStart w:id="58" w:name="ref-austriaforum2026icet"/>
     <w:p>
       <w:pPr>
         <w:pStyle w:val="Bibliography"/>
@@ -5377,7 +5542,7 @@
       <w:r>
         <w:t xml:space="preserve"> </w:t>
       </w:r>
-      <w:hyperlink r:id="rId48">
+      <w:hyperlink r:id="rId57">
         <w:r>
           <w:rPr>
             <w:rStyle w:val="Hyperlink"/>
@@ -5386,8 +5551,8 @@
         </w:r>
       </w:hyperlink>
     </w:p>
-    <w:bookmarkEnd w:id="49"/>
-    <w:bookmarkStart w:id="51" w:name="ref-bateman2015"/>
+    <w:bookmarkEnd w:id="58"/>
+    <w:bookmarkStart w:id="60" w:name="ref-bateman2015"/>
     <w:p>
       <w:pPr>
         <w:pStyle w:val="Bibliography"/>
@@ -5439,7 +5604,7 @@
       <w:r>
         <w:t xml:space="preserve"> </w:t>
       </w:r>
-      <w:hyperlink r:id="rId50">
+      <w:hyperlink r:id="rId59">
         <w:r>
           <w:rPr>
             <w:rStyle w:val="Hyperlink"/>
@@ -5448,8 +5613,8 @@
         </w:r>
       </w:hyperlink>
     </w:p>
-    <w:bookmarkEnd w:id="51"/>
-    <w:bookmarkStart w:id="53" w:name="ref-bienaime2009sealed"/>
+    <w:bookmarkEnd w:id="60"/>
+    <w:bookmarkStart w:id="62" w:name="ref-bienaime2009sealed"/>
     <w:p>
       <w:pPr>
         <w:pStyle w:val="Bibliography"/>
@@ -5532,7 +5697,7 @@
       <w:r>
         <w:t xml:space="preserve"> </w:t>
       </w:r>
-      <w:hyperlink r:id="rId52">
+      <w:hyperlink r:id="rId61">
         <w:r>
           <w:rPr>
             <w:rStyle w:val="Hyperlink"/>
@@ -5541,8 +5706,8 @@
         </w:r>
       </w:hyperlink>
     </w:p>
-    <w:bookmarkEnd w:id="53"/>
-    <w:bookmarkStart w:id="55" w:name="ref-brightline2023"/>
+    <w:bookmarkEnd w:id="62"/>
+    <w:bookmarkStart w:id="64" w:name="ref-brightline2023"/>
     <w:p>
       <w:pPr>
         <w:pStyle w:val="Bibliography"/>
@@ -5566,7 +5731,7 @@
       <w:r>
         <w:t xml:space="preserve"> </w:t>
       </w:r>
-      <w:hyperlink r:id="rId54">
+      <w:hyperlink r:id="rId63">
         <w:r>
           <w:rPr>
             <w:rStyle w:val="Hyperlink"/>
@@ -5575,8 +5740,8 @@
         </w:r>
       </w:hyperlink>
     </w:p>
-    <w:bookmarkEnd w:id="55"/>
-    <w:bookmarkStart w:id="57" w:name="ref-hoc2010wcml"/>
+    <w:bookmarkEnd w:id="64"/>
+    <w:bookmarkStart w:id="66" w:name="ref-hoc2010wcml"/>
     <w:p>
       <w:pPr>
         <w:pStyle w:val="Bibliography"/>
@@ -5600,7 +5765,7 @@
       <w:r>
         <w:t xml:space="preserve"> </w:t>
       </w:r>
-      <w:hyperlink r:id="rId56">
+      <w:hyperlink r:id="rId65">
         <w:r>
           <w:rPr>
             <w:rStyle w:val="Hyperlink"/>
@@ -5609,8 +5774,8 @@
         </w:r>
       </w:hyperlink>
     </w:p>
-    <w:bookmarkEnd w:id="57"/>
-    <w:bookmarkStart w:id="59" w:name="ref-pmcanada2025alto"/>
+    <w:bookmarkEnd w:id="66"/>
+    <w:bookmarkStart w:id="68" w:name="ref-pmcanada2025alto"/>
     <w:p>
       <w:pPr>
         <w:pStyle w:val="Bibliography"/>
@@ -5634,7 +5799,7 @@
       <w:r>
         <w:t xml:space="preserve"> </w:t>
       </w:r>
-      <w:hyperlink r:id="rId58">
+      <w:hyperlink r:id="rId67">
         <w:r>
           <w:rPr>
             <w:rStyle w:val="Hyperlink"/>
@@ -5643,8 +5808,8 @@
         </w:r>
       </w:hyperlink>
     </w:p>
-    <w:bookmarkEnd w:id="59"/>
-    <w:bookmarkStart w:id="60" w:name="ref-cn2002mr1305"/>
+    <w:bookmarkEnd w:id="68"/>
+    <w:bookmarkStart w:id="69" w:name="ref-cn2002mr1305"/>
     <w:p>
       <w:pPr>
         <w:pStyle w:val="Bibliography"/>
@@ -5669,8 +5834,8 @@
         <w:t xml:space="preserve">[Circulaire technique interne]. Compagnie des chemins de fer nationaux du Canada.</w:t>
       </w:r>
     </w:p>
-    <w:bookmarkEnd w:id="60"/>
-    <w:bookmarkStart w:id="62" w:name="ref-cbc2025pilote"/>
+    <w:bookmarkEnd w:id="69"/>
+    <w:bookmarkStart w:id="71" w:name="ref-cbc2025pilote"/>
     <w:p>
       <w:pPr>
         <w:pStyle w:val="Bibliography"/>
@@ -5722,7 +5887,7 @@
       <w:r>
         <w:t xml:space="preserve"> </w:t>
       </w:r>
-      <w:hyperlink r:id="rId61">
+      <w:hyperlink r:id="rId70">
         <w:r>
           <w:rPr>
             <w:rStyle w:val="Hyperlink"/>
@@ -5731,8 +5896,8 @@
         </w:r>
       </w:hyperlink>
     </w:p>
-    <w:bookmarkEnd w:id="62"/>
-    <w:bookmarkStart w:id="64" w:name="ref-eu2023ccstsi"/>
+    <w:bookmarkEnd w:id="71"/>
+    <w:bookmarkStart w:id="73" w:name="ref-eu2023ccstsi"/>
     <w:p>
       <w:pPr>
         <w:pStyle w:val="Bibliography"/>
@@ -5756,7 +5921,7 @@
       <w:r>
         <w:t xml:space="preserve"> </w:t>
       </w:r>
-      <w:hyperlink r:id="rId63">
+      <w:hyperlink r:id="rId72">
         <w:r>
           <w:rPr>
             <w:rStyle w:val="Hyperlink"/>
@@ -5765,8 +5930,8 @@
         </w:r>
       </w:hyperlink>
     </w:p>
-    <w:bookmarkEnd w:id="64"/>
-    <w:bookmarkStart w:id="66" w:name="ref-ec2026etcs"/>
+    <w:bookmarkEnd w:id="73"/>
+    <w:bookmarkStart w:id="75" w:name="ref-ec2026etcs"/>
     <w:p>
       <w:pPr>
         <w:pStyle w:val="Bibliography"/>
@@ -5790,7 +5955,7 @@
       <w:r>
         <w:t xml:space="preserve"> </w:t>
       </w:r>
-      <w:hyperlink r:id="rId65">
+      <w:hyperlink r:id="rId74">
         <w:r>
           <w:rPr>
             <w:rStyle w:val="Hyperlink"/>
@@ -5799,8 +5964,8 @@
         </w:r>
       </w:hyperlink>
     </w:p>
-    <w:bookmarkEnd w:id="66"/>
-    <w:bookmarkStart w:id="68" w:name="ref-db2019icet411"/>
+    <w:bookmarkEnd w:id="75"/>
+    <w:bookmarkStart w:id="77" w:name="ref-db2019icet411"/>
     <w:p>
       <w:pPr>
         <w:pStyle w:val="Bibliography"/>
@@ -5824,7 +5989,7 @@
       <w:r>
         <w:t xml:space="preserve"> </w:t>
       </w:r>
-      <w:hyperlink r:id="rId67">
+      <w:hyperlink r:id="rId76">
         <w:r>
           <w:rPr>
             <w:rStyle w:val="Hyperlink"/>
@@ -5833,8 +5998,8 @@
         </w:r>
       </w:hyperlink>
     </w:p>
-    <w:bookmarkEnd w:id="68"/>
-    <w:bookmarkStart w:id="70" w:name="ref-dick2019blocs"/>
+    <w:bookmarkEnd w:id="77"/>
+    <w:bookmarkStart w:id="79" w:name="ref-dick2019blocs"/>
     <w:p>
       <w:pPr>
         <w:pStyle w:val="Bibliography"/>
@@ -5871,7 +6036,7 @@
       <w:r>
         <w:t xml:space="preserve"> </w:t>
       </w:r>
-      <w:hyperlink r:id="rId69">
+      <w:hyperlink r:id="rId78">
         <w:r>
           <w:rPr>
             <w:rStyle w:val="Hyperlink"/>
@@ -5880,8 +6045,8 @@
         </w:r>
       </w:hyperlink>
     </w:p>
-    <w:bookmarkEnd w:id="70"/>
-    <w:bookmarkStart w:id="72" w:name="ref-ecfr213-347"/>
+    <w:bookmarkEnd w:id="79"/>
+    <w:bookmarkStart w:id="81" w:name="ref-ecfr213-347"/>
     <w:p>
       <w:pPr>
         <w:pStyle w:val="Bibliography"/>
@@ -5905,7 +6070,7 @@
       <w:r>
         <w:t xml:space="preserve"> </w:t>
       </w:r>
-      <w:hyperlink r:id="rId71">
+      <w:hyperlink r:id="rId80">
         <w:r>
           <w:rPr>
             <w:rStyle w:val="Hyperlink"/>
@@ -5914,8 +6079,8 @@
         </w:r>
       </w:hyperlink>
     </w:p>
-    <w:bookmarkEnd w:id="72"/>
-    <w:bookmarkStart w:id="74" w:name="ref-fra-lrc-152"/>
+    <w:bookmarkEnd w:id="81"/>
+    <w:bookmarkStart w:id="83" w:name="ref-fra-lrc-152"/>
     <w:p>
       <w:pPr>
         <w:pStyle w:val="Bibliography"/>
@@ -5939,7 +6104,7 @@
       <w:r>
         <w:t xml:space="preserve"> </w:t>
       </w:r>
-      <w:hyperlink r:id="rId73">
+      <w:hyperlink r:id="rId82">
         <w:r>
           <w:rPr>
             <w:rStyle w:val="Hyperlink"/>
@@ -5948,8 +6113,8 @@
         </w:r>
       </w:hyperlink>
     </w:p>
-    <w:bookmarkEnd w:id="74"/>
-    <w:bookmarkStart w:id="76" w:name="ref-fra2004ptc"/>
+    <w:bookmarkEnd w:id="83"/>
+    <w:bookmarkStart w:id="85" w:name="ref-fra2004ptc"/>
     <w:p>
       <w:pPr>
         <w:pStyle w:val="Bibliography"/>
@@ -5973,7 +6138,7 @@
       <w:r>
         <w:t xml:space="preserve"> </w:t>
       </w:r>
-      <w:hyperlink r:id="rId75">
+      <w:hyperlink r:id="rId84">
         <w:r>
           <w:rPr>
             <w:rStyle w:val="Hyperlink"/>
@@ -5982,8 +6147,8 @@
         </w:r>
       </w:hyperlink>
     </w:p>
-    <w:bookmarkEnd w:id="76"/>
-    <w:bookmarkStart w:id="78" w:name="ref-mdot2014tier1"/>
+    <w:bookmarkEnd w:id="85"/>
+    <w:bookmarkStart w:id="87" w:name="ref-mdot2014tier1"/>
     <w:p>
       <w:pPr>
         <w:pStyle w:val="Bibliography"/>
@@ -6007,7 +6172,7 @@
       <w:r>
         <w:t xml:space="preserve"> </w:t>
       </w:r>
-      <w:hyperlink r:id="rId77">
+      <w:hyperlink r:id="rId86">
         <w:r>
           <w:rPr>
             <w:rStyle w:val="Hyperlink"/>
@@ -6016,8 +6181,8 @@
         </w:r>
       </w:hyperlink>
     </w:p>
-    <w:bookmarkEnd w:id="78"/>
-    <w:bookmarkStart w:id="80" w:name="ref-via2024requete"/>
+    <w:bookmarkEnd w:id="87"/>
+    <w:bookmarkStart w:id="89" w:name="ref-via2024requete"/>
     <w:p>
       <w:pPr>
         <w:pStyle w:val="Bibliography"/>
@@ -6069,7 +6234,7 @@
       <w:r>
         <w:t xml:space="preserve"> </w:t>
       </w:r>
-      <w:hyperlink r:id="rId79">
+      <w:hyperlink r:id="rId88">
         <w:r>
           <w:rPr>
             <w:rStyle w:val="Hyperlink"/>
@@ -6078,8 +6243,8 @@
         </w:r>
       </w:hyperlink>
     </w:p>
-    <w:bookmarkEnd w:id="80"/>
-    <w:bookmarkStart w:id="82" w:name="ref-nao2006wcml"/>
+    <w:bookmarkEnd w:id="89"/>
+    <w:bookmarkStart w:id="91" w:name="ref-nao2006wcml"/>
     <w:p>
       <w:pPr>
         <w:pStyle w:val="Bibliography"/>
@@ -6120,7 +6285,7 @@
       <w:r>
         <w:t xml:space="preserve"> </w:t>
       </w:r>
-      <w:hyperlink r:id="rId81">
+      <w:hyperlink r:id="rId90">
         <w:r>
           <w:rPr>
             <w:rStyle w:val="Hyperlink"/>
@@ -6129,8 +6294,8 @@
         </w:r>
       </w:hyperlink>
     </w:p>
-    <w:bookmarkEnd w:id="82"/>
-    <w:bookmarkStart w:id="84" w:name="ref-otc2016circulation"/>
+    <w:bookmarkEnd w:id="91"/>
+    <w:bookmarkStart w:id="93" w:name="ref-otc2016circulation"/>
     <w:p>
       <w:pPr>
         <w:pStyle w:val="Bibliography"/>
@@ -6154,7 +6319,7 @@
       <w:r>
         <w:t xml:space="preserve"> </w:t>
       </w:r>
-      <w:hyperlink r:id="rId83">
+      <w:hyperlink r:id="rId92">
         <w:r>
           <w:rPr>
             <w:rStyle w:val="Hyperlink"/>
@@ -6163,8 +6328,8 @@
         </w:r>
       </w:hyperlink>
     </w:p>
-    <w:bookmarkEnd w:id="84"/>
-    <w:bookmarkStart w:id="86" w:name="ref-orr2021cadre"/>
+    <w:bookmarkEnd w:id="93"/>
+    <w:bookmarkStart w:id="95" w:name="ref-orr2021cadre"/>
     <w:p>
       <w:pPr>
         <w:pStyle w:val="Bibliography"/>
@@ -6191,7 +6356,7 @@
       <w:r>
         <w:t xml:space="preserve"> </w:t>
       </w:r>
-      <w:hyperlink r:id="rId85">
+      <w:hyperlink r:id="rId94">
         <w:r>
           <w:rPr>
             <w:rStyle w:val="Hyperlink"/>
@@ -6200,8 +6365,8 @@
         </w:r>
       </w:hyperlink>
     </w:p>
-    <w:bookmarkEnd w:id="86"/>
-    <w:bookmarkStart w:id="88" w:name="ref-orr2024tps"/>
+    <w:bookmarkEnd w:id="95"/>
+    <w:bookmarkStart w:id="97" w:name="ref-orr2024tps"/>
     <w:p>
       <w:pPr>
         <w:pStyle w:val="Bibliography"/>
@@ -6225,7 +6390,7 @@
       <w:r>
         <w:t xml:space="preserve"> </w:t>
       </w:r>
-      <w:hyperlink r:id="rId87">
+      <w:hyperlink r:id="rId96">
         <w:r>
           <w:rPr>
             <w:rStyle w:val="Hyperlink"/>
@@ -6234,8 +6399,8 @@
         </w:r>
       </w:hyperlink>
     </w:p>
-    <w:bookmarkEnd w:id="88"/>
-    <w:bookmarkStart w:id="90" w:name="ref-orr2025wcml"/>
+    <w:bookmarkEnd w:id="97"/>
+    <w:bookmarkStart w:id="99" w:name="ref-orr2025wcml"/>
     <w:p>
       <w:pPr>
         <w:pStyle w:val="Bibliography"/>
@@ -6304,7 +6469,7 @@
       <w:r>
         <w:t xml:space="preserve"> </w:t>
       </w:r>
-      <w:hyperlink r:id="rId89">
+      <w:hyperlink r:id="rId98">
         <w:r>
           <w:rPr>
             <w:rStyle w:val="Hyperlink"/>
@@ -6313,8 +6478,8 @@
         </w:r>
       </w:hyperlink>
     </w:p>
-    <w:bookmarkEnd w:id="90"/>
-    <w:bookmarkStart w:id="92" w:name="ref-osm2026geofabrik"/>
+    <w:bookmarkEnd w:id="99"/>
+    <w:bookmarkStart w:id="101" w:name="ref-osm2026geofabrik"/>
     <w:p>
       <w:pPr>
         <w:pStyle w:val="Bibliography"/>
@@ -6380,7 +6545,7 @@
       <w:r>
         <w:t xml:space="preserve"> </w:t>
       </w:r>
-      <w:hyperlink r:id="rId91">
+      <w:hyperlink r:id="rId100">
         <w:r>
           <w:rPr>
             <w:rStyle w:val="Hyperlink"/>
@@ -6389,8 +6554,8 @@
         </w:r>
       </w:hyperlink>
     </w:p>
-    <w:bookmarkEnd w:id="92"/>
-    <w:bookmarkStart w:id="94" w:name="ref-ltc1996art138"/>
+    <w:bookmarkEnd w:id="101"/>
+    <w:bookmarkStart w:id="103" w:name="ref-ltc1996art138"/>
     <w:p>
       <w:pPr>
         <w:pStyle w:val="Bibliography"/>
@@ -6435,7 +6600,7 @@
       <w:r>
         <w:t xml:space="preserve"> </w:t>
       </w:r>
-      <w:hyperlink r:id="rId93">
+      <w:hyperlink r:id="rId102">
         <w:r>
           <w:rPr>
             <w:rStyle w:val="Hyperlink"/>
@@ -6444,8 +6609,8 @@
         </w:r>
       </w:hyperlink>
     </w:p>
-    <w:bookmarkEnd w:id="94"/>
-    <w:bookmarkStart w:id="96" w:name="ref-railwaysact1993"/>
+    <w:bookmarkEnd w:id="103"/>
+    <w:bookmarkStart w:id="105" w:name="ref-railwaysact1993"/>
     <w:p>
       <w:pPr>
         <w:pStyle w:val="Bibliography"/>
@@ -6469,7 +6634,7 @@
       <w:r>
         <w:t xml:space="preserve"> </w:t>
       </w:r>
-      <w:hyperlink r:id="rId95">
+      <w:hyperlink r:id="rId104">
         <w:r>
           <w:rPr>
             <w:rStyle w:val="Hyperlink"/>
@@ -6478,8 +6643,8 @@
         </w:r>
       </w:hyperlink>
     </w:p>
-    <w:bookmarkEnd w:id="96"/>
-    <w:bookmarkStart w:id="98" w:name="ref-rfli2026tpr"/>
+    <w:bookmarkEnd w:id="105"/>
+    <w:bookmarkStart w:id="107" w:name="ref-rfli2026tpr"/>
     <w:p>
       <w:pPr>
         <w:pStyle w:val="Bibliography"/>
@@ -6503,7 +6668,7 @@
       <w:r>
         <w:t xml:space="preserve"> </w:t>
       </w:r>
-      <w:hyperlink r:id="rId97">
+      <w:hyperlink r:id="rId106">
         <w:r>
           <w:rPr>
             <w:rStyle w:val="Hyperlink"/>
@@ -6512,8 +6677,8 @@
         </w:r>
       </w:hyperlink>
     </w:p>
-    <w:bookmarkEnd w:id="98"/>
-    <w:bookmarkStart w:id="100" w:name="ref-schittenhelm2011"/>
+    <w:bookmarkEnd w:id="107"/>
+    <w:bookmarkStart w:id="109" w:name="ref-schittenhelm2011"/>
     <w:p>
       <w:pPr>
         <w:pStyle w:val="Bibliography"/>
@@ -6537,7 +6702,7 @@
       <w:r>
         <w:t xml:space="preserve"> </w:t>
       </w:r>
-      <w:hyperlink r:id="rId99">
+      <w:hyperlink r:id="rId108">
         <w:r>
           <w:rPr>
             <w:rStyle w:val="Hyperlink"/>
@@ -6546,8 +6711,8 @@
         </w:r>
       </w:hyperlink>
     </w:p>
-    <w:bookmarkEnd w:id="100"/>
-    <w:bookmarkStart w:id="102" w:name="ref-siemens2024chargerwsdot"/>
+    <w:bookmarkEnd w:id="109"/>
+    <w:bookmarkStart w:id="111" w:name="ref-siemens2024chargerwsdot"/>
     <w:p>
       <w:pPr>
         <w:pStyle w:val="Bibliography"/>
@@ -6571,7 +6736,7 @@
       <w:r>
         <w:t xml:space="preserve"> </w:t>
       </w:r>
-      <w:hyperlink r:id="rId101">
+      <w:hyperlink r:id="rId110">
         <w:r>
           <w:rPr>
             <w:rStyle w:val="Hyperlink"/>
@@ -6580,8 +6745,8 @@
         </w:r>
       </w:hyperlink>
     </w:p>
-    <w:bookmarkEnd w:id="102"/>
-    <w:bookmarkStart w:id="104" w:name="ref-sncf2023drr"/>
+    <w:bookmarkEnd w:id="111"/>
+    <w:bookmarkStart w:id="113" w:name="ref-sncf2023drr"/>
     <w:p>
       <w:pPr>
         <w:pStyle w:val="Bibliography"/>
@@ -6605,7 +6770,7 @@
       <w:r>
         <w:t xml:space="preserve"> </w:t>
       </w:r>
-      <w:hyperlink r:id="rId103">
+      <w:hyperlink r:id="rId112">
         <w:r>
           <w:rPr>
             <w:rStyle w:val="Hyperlink"/>
@@ -6614,8 +6779,8 @@
         </w:r>
       </w:hyperlink>
     </w:p>
-    <w:bookmarkEnd w:id="104"/>
-    <w:bookmarkStart w:id="106" w:name="ref-sogin2013doublement"/>
+    <w:bookmarkEnd w:id="113"/>
+    <w:bookmarkStart w:id="115" w:name="ref-sogin2013doublement"/>
     <w:p>
       <w:pPr>
         <w:pStyle w:val="Bibliography"/>
@@ -6639,7 +6804,7 @@
       <w:r>
         <w:t xml:space="preserve"> </w:t>
       </w:r>
-      <w:hyperlink r:id="rId105">
+      <w:hyperlink r:id="rId114">
         <w:r>
           <w:rPr>
             <w:rStyle w:val="Hyperlink"/>
@@ -6648,8 +6813,8 @@
         </w:r>
       </w:hyperlink>
     </w:p>
-    <w:bookmarkEnd w:id="106"/>
-    <w:bookmarkStart w:id="108" w:name="ref-trafikverket2025jnb"/>
+    <w:bookmarkEnd w:id="115"/>
+    <w:bookmarkStart w:id="117" w:name="ref-trafikverket2025jnb"/>
     <w:p>
       <w:pPr>
         <w:pStyle w:val="Bibliography"/>
@@ -6673,7 +6838,7 @@
       <w:r>
         <w:t xml:space="preserve"> </w:t>
       </w:r>
-      <w:hyperlink r:id="rId107">
+      <w:hyperlink r:id="rId116">
         <w:r>
           <w:rPr>
             <w:rStyle w:val="Hyperlink"/>
@@ -6682,8 +6847,8 @@
         </w:r>
       </w:hyperlink>
     </w:p>
-    <w:bookmarkEnd w:id="108"/>
-    <w:bookmarkStart w:id="110" w:name="ref-tc2022rrts"/>
+    <w:bookmarkEnd w:id="117"/>
+    <w:bookmarkStart w:id="119" w:name="ref-tc2022rrts"/>
     <w:p>
       <w:pPr>
         <w:pStyle w:val="Bibliography"/>
@@ -6721,7 +6886,7 @@
       <w:r>
         <w:t xml:space="preserve"> </w:t>
       </w:r>
-      <w:hyperlink r:id="rId109">
+      <w:hyperlink r:id="rId118">
         <w:r>
           <w:rPr>
             <w:rStyle w:val="Hyperlink"/>
@@ -6730,8 +6895,8 @@
         </w:r>
       </w:hyperlink>
     </w:p>
-    <w:bookmarkEnd w:id="110"/>
-    <w:bookmarkStart w:id="112" w:name="ref-tc2023inventairepn"/>
+    <w:bookmarkEnd w:id="119"/>
+    <w:bookmarkStart w:id="121" w:name="ref-tc2023inventairepn"/>
     <w:p>
       <w:pPr>
         <w:pStyle w:val="Bibliography"/>
@@ -6755,7 +6920,7 @@
       <w:r>
         <w:t xml:space="preserve"> </w:t>
       </w:r>
-      <w:hyperlink r:id="rId111">
+      <w:hyperlink r:id="rId120">
         <w:r>
           <w:rPr>
             <w:rStyle w:val="Hyperlink"/>
@@ -6764,8 +6929,8 @@
         </w:r>
       </w:hyperlink>
     </w:p>
-    <w:bookmarkEnd w:id="112"/>
-    <w:bookmarkStart w:id="114" w:name="ref-tc2025gcp"/>
+    <w:bookmarkEnd w:id="121"/>
+    <w:bookmarkStart w:id="123" w:name="ref-tc2025gcp"/>
     <w:p>
       <w:pPr>
         <w:pStyle w:val="Bibliography"/>
@@ -6873,7 +7038,7 @@
       <w:r>
         <w:t xml:space="preserve"> </w:t>
       </w:r>
-      <w:hyperlink r:id="rId113">
+      <w:hyperlink r:id="rId122">
         <w:r>
           <w:rPr>
             <w:rStyle w:val="Hyperlink"/>
@@ -6882,8 +7047,8 @@
         </w:r>
       </w:hyperlink>
     </w:p>
-    <w:bookmarkEnd w:id="114"/>
-    <w:bookmarkStart w:id="116" w:name="ref-cror2025"/>
+    <w:bookmarkEnd w:id="123"/>
+    <w:bookmarkStart w:id="125" w:name="ref-cror2025"/>
     <w:p>
       <w:pPr>
         <w:pStyle w:val="Bibliography"/>
@@ -6907,7 +7072,7 @@
       <w:r>
         <w:t xml:space="preserve"> </w:t>
       </w:r>
-      <w:hyperlink r:id="rId115">
+      <w:hyperlink r:id="rId124">
         <w:r>
           <w:rPr>
             <w:rStyle w:val="Hyperlink"/>
@@ -6916,8 +7081,8 @@
         </w:r>
       </w:hyperlink>
     </w:p>
-    <w:bookmarkEnd w:id="116"/>
-    <w:bookmarkStart w:id="117" w:name="ref-uic2000f451"/>
+    <w:bookmarkEnd w:id="125"/>
+    <w:bookmarkStart w:id="126" w:name="ref-uic2000f451"/>
     <w:p>
       <w:pPr>
         <w:pStyle w:val="Bibliography"/>
@@ -6942,8 +7107,8 @@
         <w:t xml:space="preserve">[Fiche UIC 451-1/F/4, 4e \'ed.]. UIC.</w:t>
       </w:r>
     </w:p>
-    <w:bookmarkEnd w:id="117"/>
-    <w:bookmarkStart w:id="119" w:name="ref-fra2000acela"/>
+    <w:bookmarkEnd w:id="126"/>
+    <w:bookmarkStart w:id="128" w:name="ref-fra2000acela"/>
     <w:p>
       <w:pPr>
         <w:pStyle w:val="Bibliography"/>
@@ -6967,7 +7132,7 @@
       <w:r>
         <w:t xml:space="preserve"> </w:t>
       </w:r>
-      <w:hyperlink r:id="rId118">
+      <w:hyperlink r:id="rId127">
         <w:r>
           <w:rPr>
             <w:rStyle w:val="Hyperlink"/>
@@ -6976,8 +7141,8 @@
         </w:r>
       </w:hyperlink>
     </w:p>
-    <w:bookmarkEnd w:id="119"/>
-    <w:bookmarkStart w:id="121" w:name="ref-fra2010ptc"/>
+    <w:bookmarkEnd w:id="128"/>
+    <w:bookmarkStart w:id="130" w:name="ref-fra2010ptc"/>
     <w:p>
       <w:pPr>
         <w:pStyle w:val="Bibliography"/>
@@ -7001,7 +7166,7 @@
       <w:r>
         <w:t xml:space="preserve"> </w:t>
       </w:r>
-      <w:hyperlink r:id="rId120">
+      <w:hyperlink r:id="rId129">
         <w:r>
           <w:rPr>
             <w:rStyle w:val="Hyperlink"/>
@@ -7010,8 +7175,8 @@
         </w:r>
       </w:hyperlink>
     </w:p>
-    <w:bookmarkEnd w:id="121"/>
-    <w:bookmarkStart w:id="123" w:name="ref-fra2023brightlineptc"/>
+    <w:bookmarkEnd w:id="130"/>
+    <w:bookmarkStart w:id="132" w:name="ref-fra2023brightlineptc"/>
     <w:p>
       <w:pPr>
         <w:pStyle w:val="Bibliography"/>
@@ -7035,7 +7200,7 @@
       <w:r>
         <w:t xml:space="preserve"> </w:t>
       </w:r>
-      <w:hyperlink r:id="rId122">
+      <w:hyperlink r:id="rId131">
         <w:r>
           <w:rPr>
             <w:rStyle w:val="Hyperlink"/>
@@ -7044,8 +7209,8 @@
         </w:r>
       </w:hyperlink>
     </w:p>
-    <w:bookmarkEnd w:id="123"/>
-    <w:bookmarkStart w:id="125" w:name="ref-cfr236-0"/>
+    <w:bookmarkEnd w:id="132"/>
+    <w:bookmarkStart w:id="134" w:name="ref-cfr236-0"/>
     <w:p>
       <w:pPr>
         <w:pStyle w:val="Bibliography"/>
@@ -7069,7 +7234,7 @@
       <w:r>
         <w:t xml:space="preserve"> </w:t>
       </w:r>
-      <w:hyperlink r:id="rId124">
+      <w:hyperlink r:id="rId133">
         <w:r>
           <w:rPr>
             <w:rStyle w:val="Hyperlink"/>
@@ -7078,8 +7243,8 @@
         </w:r>
       </w:hyperlink>
     </w:p>
-    <w:bookmarkEnd w:id="125"/>
-    <w:bookmarkStart w:id="127" w:name="ref-via2009lrc"/>
+    <w:bookmarkEnd w:id="134"/>
+    <w:bookmarkStart w:id="136" w:name="ref-via2009lrc"/>
     <w:p>
       <w:pPr>
         <w:pStyle w:val="Bibliography"/>
@@ -7124,7 +7289,7 @@
       <w:r>
         <w:t xml:space="preserve"> </w:t>
       </w:r>
-      <w:hyperlink r:id="rId126">
+      <w:hyperlink r:id="rId135">
         <w:r>
           <w:rPr>
             <w:rStyle w:val="Hyperlink"/>
@@ -7133,8 +7298,8 @@
         </w:r>
       </w:hyperlink>
     </w:p>
-    <w:bookmarkEnd w:id="127"/>
-    <w:bookmarkStart w:id="129" w:name="ref-viarail2024corridor"/>
+    <w:bookmarkEnd w:id="136"/>
+    <w:bookmarkStart w:id="138" w:name="ref-viarail2024corridor"/>
     <w:p>
       <w:pPr>
         <w:pStyle w:val="Bibliography"/>
@@ -7158,7 +7323,7 @@
       <w:r>
         <w:t xml:space="preserve"> </w:t>
       </w:r>
-      <w:hyperlink r:id="rId128">
+      <w:hyperlink r:id="rId137">
         <w:r>
           <w:rPr>
             <w:rStyle w:val="Hyperlink"/>
@@ -7167,8 +7332,8 @@
         </w:r>
       </w:hyperlink>
     </w:p>
-    <w:bookmarkEnd w:id="129"/>
-    <w:bookmarkStart w:id="131" w:name="ref-via2025rapportannuel"/>
+    <w:bookmarkEnd w:id="138"/>
+    <w:bookmarkStart w:id="140" w:name="ref-via2025rapportannuel"/>
     <w:p>
       <w:pPr>
         <w:pStyle w:val="Bibliography"/>
@@ -7192,7 +7357,7 @@
       <w:r>
         <w:t xml:space="preserve"> </w:t>
       </w:r>
-      <w:hyperlink r:id="rId130">
+      <w:hyperlink r:id="rId139">
         <w:r>
           <w:rPr>
             <w:rStyle w:val="Hyperlink"/>
@@ -7201,8 +7366,8 @@
         </w:r>
       </w:hyperlink>
     </w:p>
-    <w:bookmarkEnd w:id="131"/>
-    <w:bookmarkStart w:id="133" w:name="ref-via2025t1"/>
+    <w:bookmarkEnd w:id="140"/>
+    <w:bookmarkStart w:id="142" w:name="ref-via2025t1"/>
     <w:p>
       <w:pPr>
         <w:pStyle w:val="Bibliography"/>
@@ -7226,7 +7391,7 @@
       <w:r>
         <w:t xml:space="preserve"> </w:t>
       </w:r>
-      <w:hyperlink r:id="rId132">
+      <w:hyperlink r:id="rId141">
         <w:r>
           <w:rPr>
             <w:rStyle w:val="Hyperlink"/>
@@ -7235,8 +7400,8 @@
         </w:r>
       </w:hyperlink>
     </w:p>
-    <w:bookmarkEnd w:id="133"/>
-    <w:bookmarkStart w:id="135" w:name="ref-viarail2026gtfs"/>
+    <w:bookmarkEnd w:id="142"/>
+    <w:bookmarkStart w:id="144" w:name="ref-viarail2026gtfs"/>
     <w:p>
       <w:pPr>
         <w:pStyle w:val="Bibliography"/>
@@ -7302,7 +7467,7 @@
       <w:r>
         <w:t xml:space="preserve"> </w:t>
       </w:r>
-      <w:hyperlink r:id="rId134">
+      <w:hyperlink r:id="rId143">
         <w:r>
           <w:rPr>
             <w:rStyle w:val="Hyperlink"/>
@@ -7311,8 +7476,8 @@
         </w:r>
       </w:hyperlink>
     </w:p>
-    <w:bookmarkEnd w:id="135"/>
-    <w:bookmarkStart w:id="137" w:name="ref-wikipedia2026class390"/>
+    <w:bookmarkEnd w:id="144"/>
+    <w:bookmarkStart w:id="146" w:name="ref-wikipedia2026class390"/>
     <w:p>
       <w:pPr>
         <w:pStyle w:val="Bibliography"/>
@@ -7336,7 +7501,7 @@
       <w:r>
         <w:t xml:space="preserve"> </w:t>
       </w:r>
-      <w:hyperlink r:id="rId136">
+      <w:hyperlink r:id="rId145">
         <w:r>
           <w:rPr>
             <w:rStyle w:val="Hyperlink"/>
@@ -7345,8 +7510,8 @@
         </w:r>
       </w:hyperlink>
     </w:p>
-    <w:bookmarkEnd w:id="137"/>
-    <w:bookmarkStart w:id="139" w:name="ref-wikipedia2026newpendolino"/>
+    <w:bookmarkEnd w:id="146"/>
+    <w:bookmarkStart w:id="148" w:name="ref-wikipedia2026newpendolino"/>
     <w:p>
       <w:pPr>
         <w:pStyle w:val="Bibliography"/>
@@ -7370,7 +7535,7 @@
       <w:r>
         <w:t xml:space="preserve"> </w:t>
       </w:r>
-      <w:hyperlink r:id="rId138">
+      <w:hyperlink r:id="rId147">
         <w:r>
           <w:rPr>
             <w:rStyle w:val="Hyperlink"/>
@@ -7379,8 +7544,8 @@
         </w:r>
       </w:hyperlink>
     </w:p>
-    <w:bookmarkEnd w:id="139"/>
-    <w:bookmarkStart w:id="141" w:name="ref-wikipedia2026charger"/>
+    <w:bookmarkEnd w:id="148"/>
+    <w:bookmarkStart w:id="150" w:name="ref-wikipedia2026charger"/>
     <w:p>
       <w:pPr>
         <w:pStyle w:val="Bibliography"/>
@@ -7404,7 +7569,7 @@
       <w:r>
         <w:t xml:space="preserve"> </w:t>
       </w:r>
-      <w:hyperlink r:id="rId140">
+      <w:hyperlink r:id="rId149">
         <w:r>
           <w:rPr>
             <w:rStyle w:val="Hyperlink"/>
@@ -7413,8 +7578,8 @@
         </w:r>
       </w:hyperlink>
     </w:p>
-    <w:bookmarkEnd w:id="141"/>
-    <w:bookmarkStart w:id="143" w:name="ref-wikipedia2026venture"/>
+    <w:bookmarkEnd w:id="150"/>
+    <w:bookmarkStart w:id="152" w:name="ref-wikipedia2026venture"/>
     <w:p>
       <w:pPr>
         <w:pStyle w:val="Bibliography"/>
@@ -7438,7 +7603,7 @@
       <w:r>
         <w:t xml:space="preserve"> </w:t>
       </w:r>
-      <w:hyperlink r:id="rId142">
+      <w:hyperlink r:id="rId151">
         <w:r>
           <w:rPr>
             <w:rStyle w:val="Hyperlink"/>
@@ -7447,8 +7612,8 @@
         </w:r>
       </w:hyperlink>
     </w:p>
-    <w:bookmarkEnd w:id="143"/>
-    <w:bookmarkStart w:id="145" w:name="ref-wcml2026wiki"/>
+    <w:bookmarkEnd w:id="152"/>
+    <w:bookmarkStart w:id="154" w:name="ref-wcml2026wiki"/>
     <w:p>
       <w:pPr>
         <w:pStyle w:val="Bibliography"/>
@@ -7486,7 +7651,7 @@
       <w:r>
         <w:t xml:space="preserve"> </w:t>
       </w:r>
-      <w:hyperlink r:id="rId144">
+      <w:hyperlink r:id="rId153">
         <w:r>
           <w:rPr>
             <w:rStyle w:val="Hyperlink"/>
@@ -7495,9 +7660,9 @@
         </w:r>
       </w:hyperlink>
     </w:p>
-    <w:bookmarkEnd w:id="145"/>
-    <w:bookmarkEnd w:id="146"/>
-    <w:bookmarkEnd w:id="147"/>
+    <w:bookmarkEnd w:id="154"/>
+    <w:bookmarkEnd w:id="155"/>
+    <w:bookmarkEnd w:id="156"/>
     <w:sectPr>
       <w:footnotePr>
         <w:numRestart w:val="eachSect"/>

</xml_diff>

<commit_message>
Coûts : les ponts d'étagement présentés à part des cinq actions (4,5 + 8,2 G$)
Co-Authored-By: Claude Fable 5.1 <noreply@anthropic.com>
</commit_message>
<xml_diff>
--- a/livrables/rapport_corridor.docx
+++ b/livrables/rapport_corridor.docx
@@ -856,7 +856,7 @@
         <w:t xml:space="preserve"> </w:t>
       </w:r>
       <w:r>
-        <w:t xml:space="preserve">Le corridor en compte 924. Il faudra en sécuriser 533 qui n’ont pas de barrières complètes. Nous prévoyons aussi bâtir des ponts d’étagement afin d’éliminer le tiers des croisements, en priorité parmi les 102 situés en zone urbaine.</w:t>
+        <w:t xml:space="preserve">Le corridor en compte 924. Il faudra en sécuriser 533 qui n’ont pas de barrières complètes. Un programme distinct de ponts d’étagement, présenté à part, éliminerait le tiers des croisements, en priorité parmi les 102 situés en zone urbaine.</w:t>
       </w:r>
     </w:p>
     <w:p>
@@ -909,7 +909,7 @@
         <w:t xml:space="preserve"> </w:t>
       </w:r>
       <w:r>
-        <w:t xml:space="preserve">nous permettent de retenir une marge d’exploitation de 10 %, alignée sur la West Coast Main Line britannique, qui relie Londres à Manchester et Glasgow avec des trains pendulaires à 201 km/h sur des voies partagées avec les trains de marchandises. Nous estimons l’ordre de grandeur du coût de ces cinq actions à environ 13 G$ CA (section 9), dont près des deux tiers pour des ponts d’étagement qui ne sont pas nécessaires aux temps calculés ici.</w:t>
+        <w:t xml:space="preserve">nous permettent de retenir une marge d’exploitation de 10 %, alignée sur la West Coast Main Line britannique, qui relie Londres à Manchester et Glasgow avec des trains pendulaires à 201 km/h sur des voies partagées avec les trains de marchandises. Nous estimons l’ordre de grandeur du coût de ces cinq actions à environ 4,5 G$ CA (section 9). Un programme distinct d’élimination du tiers des croisements par des ponts d’étagement, qui n’est pas nécessaire aux temps calculés ici, s’y ajouterait pour environ 8 G$ CA.</w:t>
       </w:r>
     </w:p>
     <w:p>
@@ -4982,7 +4982,197 @@
         <w:t xml:space="preserve">)</w:t>
       </w:r>
       <w:r>
-        <w:t xml:space="preserve">. Nous retenons 50 M$ comme valeur moyenne de planification, soit 5,9 G$ CA. Nous proposons également 190 passages dénivelés pour remplacer le tiers des 569 traverses privées et de ferme, à 12 M$ chacun, soit 2,3 G$ CA ; aucun précédent public ne chiffre ce type d’ouvrage, et ce coût unitaire est une hypothèse de travail. À noter que ces deux postes, qui représentent près des deux tiers du total, ne sont pas nécessaires aux temps de parcours présentés ici. Ils s’inscrivent plutôt dans une volonté de sécurité et de meilleure cohabitation avec les riverains de la ligne.</w:t>
+        <w:t xml:space="preserve">. Nous retenons 50 M$ comme valeur moyenne de planification, soit 5,9 G$ CA. Nous proposons également 190 passages dénivelés pour remplacer le tiers des 569 traverses privées et de ferme, à 12 M$ chacun, soit 2,3 G$ CA ; aucun précédent public ne chiffre ce type d’ouvrage, et ce coût unitaire est une hypothèse de travail.</w:t>
+      </w:r>
+    </w:p>
+    <w:p>
+      <w:pPr>
+        <w:pStyle w:val="BodyText"/>
+      </w:pPr>
+      <w:r>
+        <w:t xml:space="preserve">Ces ouvrages forment un programme à part. Ils ne sont pas nécessaires aux temps de parcours présentés ici : les barrières complètes suffisent au plafond de 201 km/h. Ils s’inscrivent plutôt dans une volonté de sécurité et de meilleure cohabitation avec les riverains de la ligne, et ils peuvent se décider site par site, au rythme des budgets. Les deux tableaux qui suivent les présentent donc séparément.</w:t>
+      </w:r>
+    </w:p>
+    <w:p>
+      <w:pPr>
+        <w:pStyle w:val="BodyText"/>
+      </w:pPr>
+      <w:r>
+        <w:rPr>
+          <w:b/>
+          <w:bCs/>
+        </w:rPr>
+        <w:t xml:space="preserve">Les cinq actions nécessaires aux temps de parcours calculés :</w:t>
+      </w:r>
+    </w:p>
+    <w:tbl>
+      <w:tblPr>
+        <w:tblStyle w:val="Table"/>
+        <w:tblW w:type="auto" w:w="0"/>
+        <w:tblLook w:firstRow="1" w:lastRow="0" w:firstColumn="0" w:lastColumn="0" w:noHBand="0" w:noVBand="0" w:val="0020"/>
+      </w:tblPr>
+      <w:tblGrid>
+        <w:gridCol w:w="3960"/>
+        <w:gridCol w:w="3960"/>
+      </w:tblGrid>
+      <w:tr>
+        <w:trPr>
+          <w:tblHeader w:val="on"/>
+        </w:trPr>
+        <w:tc>
+          <w:tcPr/>
+          <w:p>
+            <w:pPr>
+              <w:pStyle w:val="Compact"/>
+            </w:pPr>
+            <w:r>
+              <w:t xml:space="preserve">Composante du projet (991 km de voies)</w:t>
+            </w:r>
+          </w:p>
+        </w:tc>
+        <w:tc>
+          <w:tcPr/>
+          <w:p>
+            <w:pPr>
+              <w:pStyle w:val="Compact"/>
+            </w:pPr>
+            <w:r>
+              <w:t xml:space="preserve">Coût estimé (G$ CA)</w:t>
+            </w:r>
+          </w:p>
+        </w:tc>
+      </w:tr>
+      <w:tr>
+        <w:tc>
+          <w:tcPr/>
+          <w:p>
+            <w:pPr>
+              <w:pStyle w:val="Compact"/>
+            </w:pPr>
+            <w:r>
+              <w:t xml:space="preserve">Rénovation de la voie et doublement, hors ouvrages d’art</w:t>
+            </w:r>
+          </w:p>
+        </w:tc>
+        <w:tc>
+          <w:tcPr/>
+          <w:p>
+            <w:pPr>
+              <w:pStyle w:val="Compact"/>
+            </w:pPr>
+            <w:r>
+              <w:t xml:space="preserve">1,0</w:t>
+            </w:r>
+          </w:p>
+        </w:tc>
+      </w:tr>
+      <w:tr>
+        <w:tc>
+          <w:tcPr/>
+          <w:p>
+            <w:pPr>
+              <w:pStyle w:val="Compact"/>
+            </w:pPr>
+            <w:r>
+              <w:t xml:space="preserve">Système de contrôle en cabine et signalisation</w:t>
+            </w:r>
+          </w:p>
+        </w:tc>
+        <w:tc>
+          <w:tcPr/>
+          <w:p>
+            <w:pPr>
+              <w:pStyle w:val="Compact"/>
+            </w:pPr>
+            <w:r>
+              <w:t xml:space="preserve">0,5</w:t>
+            </w:r>
+          </w:p>
+        </w:tc>
+      </w:tr>
+      <w:tr>
+        <w:tc>
+          <w:tcPr/>
+          <w:p>
+            <w:pPr>
+              <w:pStyle w:val="Compact"/>
+            </w:pPr>
+            <w:r>
+              <w:t xml:space="preserve">Trains pendulaires</w:t>
+            </w:r>
+          </w:p>
+        </w:tc>
+        <w:tc>
+          <w:tcPr/>
+          <w:p>
+            <w:pPr>
+              <w:pStyle w:val="Compact"/>
+            </w:pPr>
+            <w:r>
+              <w:t xml:space="preserve">2,7</w:t>
+            </w:r>
+          </w:p>
+        </w:tc>
+      </w:tr>
+      <w:tr>
+        <w:tc>
+          <w:tcPr/>
+          <w:p>
+            <w:pPr>
+              <w:pStyle w:val="Compact"/>
+            </w:pPr>
+            <w:r>
+              <w:t xml:space="preserve">Sécurisation de 533 croisements routiers</w:t>
+            </w:r>
+          </w:p>
+        </w:tc>
+        <w:tc>
+          <w:tcPr/>
+          <w:p>
+            <w:pPr>
+              <w:pStyle w:val="Compact"/>
+            </w:pPr>
+            <w:r>
+              <w:t xml:space="preserve">0,3</w:t>
+            </w:r>
+          </w:p>
+        </w:tc>
+      </w:tr>
+      <w:tr>
+        <w:tc>
+          <w:tcPr/>
+          <w:p>
+            <w:pPr>
+              <w:pStyle w:val="Compact"/>
+            </w:pPr>
+            <w:r>
+              <w:t xml:space="preserve">Total des cinq actions</w:t>
+            </w:r>
+          </w:p>
+        </w:tc>
+        <w:tc>
+          <w:tcPr/>
+          <w:p>
+            <w:pPr>
+              <w:pStyle w:val="Compact"/>
+            </w:pPr>
+            <w:r>
+              <w:t xml:space="preserve">4,5</w:t>
+            </w:r>
+          </w:p>
+        </w:tc>
+      </w:tr>
+    </w:tbl>
+    <w:p>
+      <w:pPr>
+        <w:pStyle w:val="BodyText"/>
+      </w:pPr>
+      <w:r>
+        <w:rPr>
+          <w:b/>
+          <w:bCs/>
+        </w:rPr>
+        <w:t xml:space="preserve">Le programme d’élimination des croisements, en plus :</w:t>
       </w:r>
     </w:p>
     <w:tbl>
@@ -5007,7 +5197,7 @@
               <w:pStyle w:val="Compact"/>
             </w:pPr>
             <w:r>
-              <w:t xml:space="preserve">Composante du projet (991 km de voies)</w:t>
+              <w:t xml:space="preserve">Programme de ponts d’étagement</w:t>
             </w:r>
           </w:p>
         </w:tc>
@@ -5031,18 +5221,18 @@
               <w:pStyle w:val="Compact"/>
             </w:pPr>
             <w:r>
-              <w:t xml:space="preserve">Rénovation de la voie et doublement, hors ouvrages d’art</w:t>
-            </w:r>
-          </w:p>
-        </w:tc>
-        <w:tc>
-          <w:tcPr/>
-          <w:p>
-            <w:pPr>
-              <w:pStyle w:val="Compact"/>
-            </w:pPr>
-            <w:r>
-              <w:t xml:space="preserve">1,0</w:t>
+              <w:t xml:space="preserve">118 ponts d’étagement, le tiers des croisements publics</w:t>
+            </w:r>
+          </w:p>
+        </w:tc>
+        <w:tc>
+          <w:tcPr/>
+          <w:p>
+            <w:pPr>
+              <w:pStyle w:val="Compact"/>
+            </w:pPr>
+            <w:r>
+              <w:t xml:space="preserve">5,9</w:t>
             </w:r>
           </w:p>
         </w:tc>
@@ -5055,18 +5245,18 @@
               <w:pStyle w:val="Compact"/>
             </w:pPr>
             <w:r>
-              <w:t xml:space="preserve">Système de contrôle en cabine et signalisation</w:t>
-            </w:r>
-          </w:p>
-        </w:tc>
-        <w:tc>
-          <w:tcPr/>
-          <w:p>
-            <w:pPr>
-              <w:pStyle w:val="Compact"/>
-            </w:pPr>
-            <w:r>
-              <w:t xml:space="preserve">0,5</w:t>
+              <w:t xml:space="preserve">190 passages dénivelés, le tiers des croisements privés et de ferme</w:t>
+            </w:r>
+          </w:p>
+        </w:tc>
+        <w:tc>
+          <w:tcPr/>
+          <w:p>
+            <w:pPr>
+              <w:pStyle w:val="Compact"/>
+            </w:pPr>
+            <w:r>
+              <w:t xml:space="preserve">2,3</w:t>
             </w:r>
           </w:p>
         </w:tc>
@@ -5079,119 +5269,31 @@
               <w:pStyle w:val="Compact"/>
             </w:pPr>
             <w:r>
-              <w:t xml:space="preserve">Trains pendulaires</w:t>
-            </w:r>
-          </w:p>
-        </w:tc>
-        <w:tc>
-          <w:tcPr/>
-          <w:p>
-            <w:pPr>
-              <w:pStyle w:val="Compact"/>
-            </w:pPr>
-            <w:r>
-              <w:t xml:space="preserve">2,7</w:t>
-            </w:r>
-          </w:p>
-        </w:tc>
-      </w:tr>
-      <w:tr>
-        <w:tc>
-          <w:tcPr/>
-          <w:p>
-            <w:pPr>
-              <w:pStyle w:val="Compact"/>
-            </w:pPr>
-            <w:r>
-              <w:t xml:space="preserve">Sécurisation de 533 croisements routiers</w:t>
-            </w:r>
-          </w:p>
-        </w:tc>
-        <w:tc>
-          <w:tcPr/>
-          <w:p>
-            <w:pPr>
-              <w:pStyle w:val="Compact"/>
-            </w:pPr>
-            <w:r>
-              <w:t xml:space="preserve">0,3</w:t>
-            </w:r>
-          </w:p>
-        </w:tc>
-      </w:tr>
-      <w:tr>
-        <w:tc>
-          <w:tcPr/>
-          <w:p>
-            <w:pPr>
-              <w:pStyle w:val="Compact"/>
-            </w:pPr>
-            <w:r>
-              <w:t xml:space="preserve">118 ponts d’étagement, le tiers des croisements publics</w:t>
-            </w:r>
-          </w:p>
-        </w:tc>
-        <w:tc>
-          <w:tcPr/>
-          <w:p>
-            <w:pPr>
-              <w:pStyle w:val="Compact"/>
-            </w:pPr>
-            <w:r>
-              <w:t xml:space="preserve">5,9</w:t>
-            </w:r>
-          </w:p>
-        </w:tc>
-      </w:tr>
-      <w:tr>
-        <w:tc>
-          <w:tcPr/>
-          <w:p>
-            <w:pPr>
-              <w:pStyle w:val="Compact"/>
-            </w:pPr>
-            <w:r>
-              <w:t xml:space="preserve">190 passages dénivelés, le tiers des croisements privés et de ferme</w:t>
-            </w:r>
-          </w:p>
-        </w:tc>
-        <w:tc>
-          <w:tcPr/>
-          <w:p>
-            <w:pPr>
-              <w:pStyle w:val="Compact"/>
-            </w:pPr>
-            <w:r>
-              <w:t xml:space="preserve">2,3</w:t>
-            </w:r>
-          </w:p>
-        </w:tc>
-      </w:tr>
-      <w:tr>
-        <w:tc>
-          <w:tcPr/>
-          <w:p>
-            <w:pPr>
-              <w:pStyle w:val="Compact"/>
-            </w:pPr>
-            <w:r>
-              <w:t xml:space="preserve">Total</w:t>
-            </w:r>
-          </w:p>
-        </w:tc>
-        <w:tc>
-          <w:tcPr/>
-          <w:p>
-            <w:pPr>
-              <w:pStyle w:val="Compact"/>
-            </w:pPr>
-            <w:r>
-              <w:t xml:space="preserve">12,7</w:t>
+              <w:t xml:space="preserve">Total du programme</w:t>
+            </w:r>
+          </w:p>
+        </w:tc>
+        <w:tc>
+          <w:tcPr/>
+          <w:p>
+            <w:pPr>
+              <w:pStyle w:val="Compact"/>
+            </w:pPr>
+            <w:r>
+              <w:t xml:space="preserve">8,2</w:t>
             </w:r>
           </w:p>
         </w:tc>
       </w:tr>
     </w:tbl>
+    <w:p>
+      <w:pPr>
+        <w:pStyle w:val="BodyText"/>
+      </w:pPr>
+      <w:r>
+        <w:t xml:space="preserve">Les deux ensemble représentent environ 12,7 G$ CA.</w:t>
+      </w:r>
+    </w:p>
     <w:bookmarkEnd w:id="40"/>
     <w:bookmarkStart w:id="41" w:name="Xa4bd7916351d7894a20762abaf29c5b3d1705b1"/>
     <w:p>

</xml_diff>

<commit_message>
Montréal-Québec par sous-section (Saint-Hilaire, Saint-Hyacinthe, Drummondville ; script 37, GTFS exo) ; tableaux : en-têtes pliables, plus de débordement
Co-Authored-By: Claude Fable 5.1 <noreply@anthropic.com>
</commit_message>
<xml_diff>
--- a/livrables/rapport_corridor.docx
+++ b/livrables/rapport_corridor.docx
@@ -3917,18 +3917,18 @@
               <w:pStyle w:val="Compact"/>
             </w:pPr>
             <w:r>
-              <w:t xml:space="preserve">Emprise optimisée (plafond 201 km/h)</w:t>
-            </w:r>
-          </w:p>
-        </w:tc>
-        <w:tc>
-          <w:tcPr/>
-          <w:p>
-            <w:pPr>
-              <w:pStyle w:val="Compact"/>
-            </w:pPr>
-            <w:r>
-              <w:t xml:space="preserve">Zéro passage à niveau (plafond 241 km/h)</w:t>
+              <w:t xml:space="preserve">Emprise optimisée (201 km/h)</w:t>
+            </w:r>
+          </w:p>
+        </w:tc>
+        <w:tc>
+          <w:tcPr/>
+          <w:p>
+            <w:pPr>
+              <w:pStyle w:val="Compact"/>
+            </w:pPr>
+            <w:r>
+              <w:t xml:space="preserve">Sans passage à niveau (241 km/h)</w:t>
             </w:r>
           </w:p>
         </w:tc>
@@ -5907,6 +5907,363 @@
           <w:b/>
           <w:bCs/>
         </w:rPr>
+        <w:t xml:space="preserve">Montréal-Québec, sous-section par sous-section.</w:t>
+      </w:r>
+      <w:r>
+        <w:t xml:space="preserve"> </w:t>
+      </w:r>
+      <w:r>
+        <w:t xml:space="preserve">Le trajet Montréal-Québec est celui où le gain est le plus grand. Le tableau qui suit le découpe aux gares de Saint-Hilaire, de Saint-Hyacinthe et de Drummondville. Chaque ligne va du départ d’une gare à l’arrivée à la suivante ; le total ajoute les deux minutes d’arrêt à Saint-Hyacinthe et à Drummondville.</w:t>
+      </w:r>
+    </w:p>
+    <w:tbl>
+      <w:tblPr>
+        <w:tblStyle w:val="Table"/>
+        <w:tblW w:type="pct" w:w="5000"/>
+        <w:tblLayout w:type="fixed"/>
+        <w:tblLook w:firstRow="1" w:lastRow="0" w:firstColumn="0" w:lastColumn="0" w:noHBand="0" w:noVBand="0" w:val="0020"/>
+      </w:tblPr>
+      <w:tblGrid>
+        <w:gridCol w:w="1980"/>
+        <w:gridCol w:w="1980"/>
+        <w:gridCol w:w="1980"/>
+        <w:gridCol w:w="1980"/>
+      </w:tblGrid>
+      <w:tr>
+        <w:trPr>
+          <w:tblHeader w:val="on"/>
+        </w:trPr>
+        <w:tc>
+          <w:tcPr/>
+          <w:p>
+            <w:pPr>
+              <w:pStyle w:val="Compact"/>
+            </w:pPr>
+            <w:r>
+              <w:t xml:space="preserve">Sous-section</w:t>
+            </w:r>
+          </w:p>
+        </w:tc>
+        <w:tc>
+          <w:tcPr/>
+          <w:p>
+            <w:pPr>
+              <w:pStyle w:val="Compact"/>
+            </w:pPr>
+            <w:r>
+              <w:t xml:space="preserve">Distance</w:t>
+            </w:r>
+          </w:p>
+        </w:tc>
+        <w:tc>
+          <w:tcPr/>
+          <w:p>
+            <w:pPr>
+              <w:pStyle w:val="Compact"/>
+            </w:pPr>
+            <w:r>
+              <w:t xml:space="preserve">Aujourd’hui</w:t>
+            </w:r>
+          </w:p>
+        </w:tc>
+        <w:tc>
+          <w:tcPr/>
+          <w:p>
+            <w:pPr>
+              <w:pStyle w:val="Compact"/>
+            </w:pPr>
+            <w:r>
+              <w:t xml:space="preserve">Emprise optimisée</w:t>
+            </w:r>
+          </w:p>
+        </w:tc>
+      </w:tr>
+      <w:tr>
+        <w:tc>
+          <w:tcPr/>
+          <w:p>
+            <w:pPr>
+              <w:pStyle w:val="Compact"/>
+            </w:pPr>
+            <w:r>
+              <w:t xml:space="preserve">Montréal à Saint-Hilaire</w:t>
+            </w:r>
+          </w:p>
+        </w:tc>
+        <w:tc>
+          <w:tcPr/>
+          <w:p>
+            <w:pPr>
+              <w:pStyle w:val="Compact"/>
+            </w:pPr>
+            <w:r>
+              <w:t xml:space="preserve">35 km</w:t>
+            </w:r>
+          </w:p>
+        </w:tc>
+        <w:tc>
+          <w:tcPr/>
+          <w:p>
+            <w:pPr>
+              <w:pStyle w:val="Compact"/>
+            </w:pPr>
+            <w:r>
+              <w:t xml:space="preserve">51 min (train de banlieue)</w:t>
+            </w:r>
+          </w:p>
+        </w:tc>
+        <w:tc>
+          <w:tcPr/>
+          <w:p>
+            <w:pPr>
+              <w:pStyle w:val="Compact"/>
+            </w:pPr>
+            <w:r>
+              <w:t xml:space="preserve">19 min</w:t>
+            </w:r>
+          </w:p>
+        </w:tc>
+      </w:tr>
+      <w:tr>
+        <w:tc>
+          <w:tcPr/>
+          <w:p>
+            <w:pPr>
+              <w:pStyle w:val="Compact"/>
+            </w:pPr>
+            <w:r>
+              <w:t xml:space="preserve">Saint-Hilaire à Saint-Hyacinthe</w:t>
+            </w:r>
+          </w:p>
+        </w:tc>
+        <w:tc>
+          <w:tcPr/>
+          <w:p>
+            <w:pPr>
+              <w:pStyle w:val="Compact"/>
+            </w:pPr>
+            <w:r>
+              <w:t xml:space="preserve">19 km</w:t>
+            </w:r>
+          </w:p>
+        </w:tc>
+        <w:tc>
+          <w:tcPr/>
+          <w:p>
+            <w:pPr>
+              <w:pStyle w:val="Compact"/>
+            </w:pPr>
+            <w:r>
+              <w:t xml:space="preserve">aucun train direct</w:t>
+            </w:r>
+          </w:p>
+        </w:tc>
+        <w:tc>
+          <w:tcPr/>
+          <w:p>
+            <w:pPr>
+              <w:pStyle w:val="Compact"/>
+            </w:pPr>
+            <w:r>
+              <w:t xml:space="preserve">10 min</w:t>
+            </w:r>
+          </w:p>
+        </w:tc>
+      </w:tr>
+      <w:tr>
+        <w:tc>
+          <w:tcPr/>
+          <w:p>
+            <w:pPr>
+              <w:pStyle w:val="Compact"/>
+            </w:pPr>
+            <w:r>
+              <w:t xml:space="preserve">Saint-Hyacinthe à Drummondville</w:t>
+            </w:r>
+          </w:p>
+        </w:tc>
+        <w:tc>
+          <w:tcPr/>
+          <w:p>
+            <w:pPr>
+              <w:pStyle w:val="Compact"/>
+            </w:pPr>
+            <w:r>
+              <w:t xml:space="preserve">47 km</w:t>
+            </w:r>
+          </w:p>
+        </w:tc>
+        <w:tc>
+          <w:tcPr/>
+          <w:p>
+            <w:pPr>
+              <w:pStyle w:val="Compact"/>
+            </w:pPr>
+            <w:r>
+              <w:t xml:space="preserve">30 min</w:t>
+            </w:r>
+          </w:p>
+        </w:tc>
+        <w:tc>
+          <w:tcPr/>
+          <w:p>
+            <w:pPr>
+              <w:pStyle w:val="Compact"/>
+            </w:pPr>
+            <w:r>
+              <w:t xml:space="preserve">20 min</w:t>
+            </w:r>
+          </w:p>
+        </w:tc>
+      </w:tr>
+      <w:tr>
+        <w:tc>
+          <w:tcPr/>
+          <w:p>
+            <w:pPr>
+              <w:pStyle w:val="Compact"/>
+            </w:pPr>
+            <w:r>
+              <w:t xml:space="preserve">Drummondville à Québec</w:t>
+            </w:r>
+          </w:p>
+        </w:tc>
+        <w:tc>
+          <w:tcPr/>
+          <w:p>
+            <w:pPr>
+              <w:pStyle w:val="Compact"/>
+            </w:pPr>
+            <w:r>
+              <w:t xml:space="preserve">170 km</w:t>
+            </w:r>
+          </w:p>
+        </w:tc>
+        <w:tc>
+          <w:tcPr/>
+          <w:p>
+            <w:pPr>
+              <w:pStyle w:val="Compact"/>
+            </w:pPr>
+            <w:r>
+              <w:t xml:space="preserve">2 h 08</w:t>
+            </w:r>
+          </w:p>
+        </w:tc>
+        <w:tc>
+          <w:tcPr/>
+          <w:p>
+            <w:pPr>
+              <w:pStyle w:val="Compact"/>
+            </w:pPr>
+            <w:r>
+              <w:t xml:space="preserve">1 h 23</w:t>
+            </w:r>
+          </w:p>
+        </w:tc>
+      </w:tr>
+      <w:tr>
+        <w:tc>
+          <w:tcPr/>
+          <w:p>
+            <w:pPr>
+              <w:pStyle w:val="Compact"/>
+            </w:pPr>
+            <w:r>
+              <w:t xml:space="preserve">Montréal à Québec, arrêts compris</w:t>
+            </w:r>
+          </w:p>
+        </w:tc>
+        <w:tc>
+          <w:tcPr/>
+          <w:p>
+            <w:pPr>
+              <w:pStyle w:val="Compact"/>
+            </w:pPr>
+            <w:r>
+              <w:t xml:space="preserve">270 km</w:t>
+            </w:r>
+          </w:p>
+        </w:tc>
+        <w:tc>
+          <w:tcPr/>
+          <w:p>
+            <w:pPr>
+              <w:pStyle w:val="Compact"/>
+            </w:pPr>
+            <w:r>
+              <w:t xml:space="preserve">3 h 22</w:t>
+            </w:r>
+          </w:p>
+        </w:tc>
+        <w:tc>
+          <w:tcPr/>
+          <w:p>
+            <w:pPr>
+              <w:pStyle w:val="Compact"/>
+            </w:pPr>
+            <w:r>
+              <w:t xml:space="preserve">2 h 16</w:t>
+            </w:r>
+          </w:p>
+        </w:tc>
+      </w:tr>
+    </w:tbl>
+    <w:p>
+      <w:pPr>
+        <w:pStyle w:val="BodyText"/>
+      </w:pPr>
+      <w:r>
+        <w:t xml:space="preserve">VIA ne s’arrête pas à Saint-Hilaire. Le temps d’aujourd’hui sur cette ligne est celui du train de banlieue exo, qui roule sur la même voie du CN jusqu’à son terminus de Mont-Saint-Hilaire avec cinq arrêts intermédiaires</w:t>
+      </w:r>
+      <w:r>
+        <w:t xml:space="preserve"> </w:t>
+      </w:r>
+      <w:r>
+        <w:t xml:space="preserve">(</w:t>
+      </w:r>
+      <w:hyperlink w:anchor="ref-exo2026gtfs">
+        <w:r>
+          <w:rPr>
+            <w:rStyle w:val="Hyperlink"/>
+          </w:rPr>
+          <w:t xml:space="preserve">exo</w:t>
+        </w:r>
+        <w:r>
+          <w:rPr>
+            <w:rStyle w:val="Hyperlink"/>
+          </w:rPr>
+          <w:t xml:space="preserve">, 2026</w:t>
+        </w:r>
+      </w:hyperlink>
+      <w:r>
+        <w:t xml:space="preserve">)</w:t>
+      </w:r>
+      <w:r>
+        <w:t xml:space="preserve"> </w:t>
+      </w:r>
+      <w:r>
+        <w:t xml:space="preserve">; le temps de l’emprise optimisée est un temps de passage, sans arrêt à Saint-Hilaire, qui comprend l’arrêt à Saint-Lambert. Pour le voyageur de VIA, Montréal-Saint-Hyacinthe passerait de 40 à 29 minutes. Le gros du gain se trouve entre Drummondville et Québec, sur la subdivision Drummondville, là où la voie est simple et la marge de l’horaire la plus forte. Le détail est dans l’annexe numérique (</w:t>
+      </w:r>
+      <w:r>
+        <w:rPr>
+          <w:rStyle w:val="VerbatimChar"/>
+        </w:rPr>
+        <w:t xml:space="preserve">sous_sections_montreal_quebec.csv</w:t>
+      </w:r>
+      <w:r>
+        <w:t xml:space="preserve">).</w:t>
+      </w:r>
+    </w:p>
+    <w:p>
+      <w:pPr>
+        <w:pStyle w:val="BodyText"/>
+      </w:pPr>
+      <w:r>
+        <w:rPr>
+          <w:b/>
+          <w:bCs/>
+        </w:rPr>
         <w:t xml:space="preserve">Sensibilités.</w:t>
       </w:r>
       <w:r>
@@ -6858,7 +7215,7 @@
       </w:r>
     </w:p>
     <w:bookmarkEnd w:id="53"/>
-    <w:bookmarkStart w:id="182" w:name="références"/>
+    <w:bookmarkStart w:id="184" w:name="références"/>
     <w:p>
       <w:pPr>
         <w:pStyle w:val="Heading1"/>
@@ -6867,7 +7224,7 @@
         <w:t xml:space="preserve">Références</w:t>
       </w:r>
     </w:p>
-    <w:bookmarkStart w:id="181" w:name="refs"/>
+    <w:bookmarkStart w:id="183" w:name="refs"/>
     <w:bookmarkStart w:id="55" w:name="ref-alstom2005pendolino"/>
     <w:p>
       <w:pPr>
@@ -7781,12 +8138,91 @@
       </w:r>
     </w:p>
     <w:bookmarkEnd w:id="93"/>
-    <w:bookmarkStart w:id="95" w:name="ref-ecfr213-347"/>
+    <w:bookmarkStart w:id="95" w:name="ref-exo2026gtfs"/>
     <w:p>
       <w:pPr>
         <w:pStyle w:val="Bibliography"/>
       </w:pPr>
       <w:r>
+        <w:t xml:space="preserve">exo</w:t>
+      </w:r>
+      <w:r>
+        <w:t xml:space="preserve">. (2026).</w:t>
+      </w:r>
+      <w:r>
+        <w:t xml:space="preserve"> </w:t>
+      </w:r>
+      <w:r>
+        <w:rPr>
+          <w:i/>
+          <w:iCs/>
+        </w:rPr>
+        <w:t xml:space="preserve">Données</w:t>
+      </w:r>
+      <w:r>
+        <w:rPr>
+          <w:i/>
+          <w:iCs/>
+        </w:rPr>
+        <w:t xml:space="preserve"> </w:t>
+      </w:r>
+      <w:r>
+        <w:rPr>
+          <w:i/>
+          <w:iCs/>
+        </w:rPr>
+        <w:t xml:space="preserve">GTFS</w:t>
+      </w:r>
+      <w:r>
+        <w:rPr>
+          <w:i/>
+          <w:iCs/>
+        </w:rPr>
+        <w:t xml:space="preserve"> </w:t>
+      </w:r>
+      <w:r>
+        <w:rPr>
+          <w:i/>
+          <w:iCs/>
+        </w:rPr>
+        <w:t xml:space="preserve">des trains de banlieue, ligne</w:t>
+      </w:r>
+      <w:r>
+        <w:rPr>
+          <w:i/>
+          <w:iCs/>
+        </w:rPr>
+        <w:t xml:space="preserve"> </w:t>
+      </w:r>
+      <w:r>
+        <w:rPr>
+          <w:i/>
+          <w:iCs/>
+        </w:rPr>
+        <w:t xml:space="preserve">Mont-Saint-Hilaire</w:t>
+      </w:r>
+      <w:r>
+        <w:t xml:space="preserve">. Jeu de données, version du 10 septembre 2026.</w:t>
+      </w:r>
+      <w:r>
+        <w:t xml:space="preserve"> </w:t>
+      </w:r>
+      <w:hyperlink r:id="rId94">
+        <w:r>
+          <w:rPr>
+            <w:rStyle w:val="Hyperlink"/>
+          </w:rPr>
+          <w:t xml:space="preserve">https://exo.quebec/xdata/trains/google_transit.zip</w:t>
+        </w:r>
+      </w:hyperlink>
+    </w:p>
+    <w:bookmarkEnd w:id="95"/>
+    <w:bookmarkStart w:id="97" w:name="ref-ecfr213-347"/>
+    <w:p>
+      <w:pPr>
+        <w:pStyle w:val="Bibliography"/>
+      </w:pPr>
+      <w:r>
         <w:t xml:space="preserve">Federal Railroad Administration. (s. d.-a).</w:t>
       </w:r>
       <w:r>
@@ -7805,7 +8241,7 @@
       <w:r>
         <w:t xml:space="preserve"> </w:t>
       </w:r>
-      <w:hyperlink r:id="rId94">
+      <w:hyperlink r:id="rId96">
         <w:r>
           <w:rPr>
             <w:rStyle w:val="Hyperlink"/>
@@ -7814,8 +8250,8 @@
         </w:r>
       </w:hyperlink>
     </w:p>
-    <w:bookmarkEnd w:id="95"/>
-    <w:bookmarkStart w:id="97" w:name="ref-fra-lrc-152"/>
+    <w:bookmarkEnd w:id="97"/>
+    <w:bookmarkStart w:id="99" w:name="ref-fra-lrc-152"/>
     <w:p>
       <w:pPr>
         <w:pStyle w:val="Bibliography"/>
@@ -7839,7 +8275,7 @@
       <w:r>
         <w:t xml:space="preserve"> </w:t>
       </w:r>
-      <w:hyperlink r:id="rId96">
+      <w:hyperlink r:id="rId98">
         <w:r>
           <w:rPr>
             <w:rStyle w:val="Hyperlink"/>
@@ -7848,8 +8284,8 @@
         </w:r>
       </w:hyperlink>
     </w:p>
-    <w:bookmarkEnd w:id="97"/>
-    <w:bookmarkStart w:id="99" w:name="ref-mdot2014tier1"/>
+    <w:bookmarkEnd w:id="99"/>
+    <w:bookmarkStart w:id="101" w:name="ref-mdot2014tier1"/>
     <w:p>
       <w:pPr>
         <w:pStyle w:val="Bibliography"/>
@@ -7873,7 +8309,7 @@
       <w:r>
         <w:t xml:space="preserve"> </w:t>
       </w:r>
-      <w:hyperlink r:id="rId98">
+      <w:hyperlink r:id="rId100">
         <w:r>
           <w:rPr>
             <w:rStyle w:val="Hyperlink"/>
@@ -7882,8 +8318,8 @@
         </w:r>
       </w:hyperlink>
     </w:p>
-    <w:bookmarkEnd w:id="99"/>
-    <w:bookmarkStart w:id="101" w:name="ref-constas2022etagement"/>
+    <w:bookmarkEnd w:id="101"/>
+    <w:bookmarkStart w:id="103" w:name="ref-constas2022etagement"/>
     <w:p>
       <w:pPr>
         <w:pStyle w:val="Bibliography"/>
@@ -7907,7 +8343,7 @@
       <w:r>
         <w:t xml:space="preserve"> </w:t>
       </w:r>
-      <w:hyperlink r:id="rId100">
+      <w:hyperlink r:id="rId102">
         <w:r>
           <w:rPr>
             <w:rStyle w:val="Hyperlink"/>
@@ -7916,8 +8352,8 @@
         </w:r>
       </w:hyperlink>
     </w:p>
-    <w:bookmarkEnd w:id="101"/>
-    <w:bookmarkStart w:id="103" w:name="ref-via2024requete"/>
+    <w:bookmarkEnd w:id="103"/>
+    <w:bookmarkStart w:id="105" w:name="ref-via2024requete"/>
     <w:p>
       <w:pPr>
         <w:pStyle w:val="Bibliography"/>
@@ -7969,7 +8405,7 @@
       <w:r>
         <w:t xml:space="preserve"> </w:t>
       </w:r>
-      <w:hyperlink r:id="rId102">
+      <w:hyperlink r:id="rId104">
         <w:r>
           <w:rPr>
             <w:rStyle w:val="Hyperlink"/>
@@ -7978,8 +8414,8 @@
         </w:r>
       </w:hyperlink>
     </w:p>
-    <w:bookmarkEnd w:id="103"/>
-    <w:bookmarkStart w:id="105" w:name="ref-levy2016amtrak"/>
+    <w:bookmarkEnd w:id="105"/>
+    <w:bookmarkStart w:id="107" w:name="ref-levy2016amtrak"/>
     <w:p>
       <w:pPr>
         <w:pStyle w:val="Bibliography"/>
@@ -8003,7 +8439,7 @@
       <w:r>
         <w:t xml:space="preserve"> </w:t>
       </w:r>
-      <w:hyperlink r:id="rId104">
+      <w:hyperlink r:id="rId106">
         <w:r>
           <w:rPr>
             <w:rStyle w:val="Hyperlink"/>
@@ -8012,8 +8448,8 @@
         </w:r>
       </w:hyperlink>
     </w:p>
-    <w:bookmarkEnd w:id="105"/>
-    <w:bookmarkStart w:id="107" w:name="ref-lorry2018sthyacinthe"/>
+    <w:bookmarkEnd w:id="107"/>
+    <w:bookmarkStart w:id="109" w:name="ref-lorry2018sthyacinthe"/>
     <w:p>
       <w:pPr>
         <w:pStyle w:val="Bibliography"/>
@@ -8037,7 +8473,7 @@
       <w:r>
         <w:t xml:space="preserve"> </w:t>
       </w:r>
-      <w:hyperlink r:id="rId106">
+      <w:hyperlink r:id="rId108">
         <w:r>
           <w:rPr>
             <w:rStyle w:val="Hyperlink"/>
@@ -8046,8 +8482,8 @@
         </w:r>
       </w:hyperlink>
     </w:p>
-    <w:bookmarkEnd w:id="107"/>
-    <w:bookmarkStart w:id="109" w:name="ref-ecotrain2011"/>
+    <w:bookmarkEnd w:id="109"/>
+    <w:bookmarkStart w:id="111" w:name="ref-ecotrain2011"/>
     <w:p>
       <w:pPr>
         <w:pStyle w:val="Bibliography"/>
@@ -8074,7 +8510,7 @@
       <w:r>
         <w:t xml:space="preserve"> </w:t>
       </w:r>
-      <w:hyperlink r:id="rId108">
+      <w:hyperlink r:id="rId110">
         <w:r>
           <w:rPr>
             <w:rStyle w:val="Hyperlink"/>
@@ -8083,8 +8519,8 @@
         </w:r>
       </w:hyperlink>
     </w:p>
-    <w:bookmarkEnd w:id="109"/>
-    <w:bookmarkStart w:id="111" w:name="ref-mtmd2026gaspesie"/>
+    <w:bookmarkEnd w:id="111"/>
+    <w:bookmarkStart w:id="113" w:name="ref-mtmd2026gaspesie"/>
     <w:p>
       <w:pPr>
         <w:pStyle w:val="Bibliography"/>
@@ -8108,7 +8544,7 @@
       <w:r>
         <w:t xml:space="preserve"> </w:t>
       </w:r>
-      <w:hyperlink r:id="rId110">
+      <w:hyperlink r:id="rId112">
         <w:r>
           <w:rPr>
             <w:rStyle w:val="Hyperlink"/>
@@ -8117,8 +8553,8 @@
         </w:r>
       </w:hyperlink>
     </w:p>
-    <w:bookmarkEnd w:id="111"/>
-    <w:bookmarkStart w:id="113" w:name="ref-mtmd2026quebeccentral"/>
+    <w:bookmarkEnd w:id="113"/>
+    <w:bookmarkStart w:id="115" w:name="ref-mtmd2026quebeccentral"/>
     <w:p>
       <w:pPr>
         <w:pStyle w:val="Bibliography"/>
@@ -8142,7 +8578,7 @@
       <w:r>
         <w:t xml:space="preserve"> </w:t>
       </w:r>
-      <w:hyperlink r:id="rId112">
+      <w:hyperlink r:id="rId114">
         <w:r>
           <w:rPr>
             <w:rStyle w:val="Hyperlink"/>
@@ -8151,8 +8587,8 @@
         </w:r>
       </w:hyperlink>
     </w:p>
-    <w:bookmarkEnd w:id="113"/>
-    <w:bookmarkStart w:id="115" w:name="ref-nao2006wcml"/>
+    <w:bookmarkEnd w:id="115"/>
+    <w:bookmarkStart w:id="117" w:name="ref-nao2006wcml"/>
     <w:p>
       <w:pPr>
         <w:pStyle w:val="Bibliography"/>
@@ -8193,7 +8629,7 @@
       <w:r>
         <w:t xml:space="preserve"> </w:t>
       </w:r>
-      <w:hyperlink r:id="rId114">
+      <w:hyperlink r:id="rId116">
         <w:r>
           <w:rPr>
             <w:rStyle w:val="Hyperlink"/>
@@ -8202,8 +8638,8 @@
         </w:r>
       </w:hyperlink>
     </w:p>
-    <w:bookmarkEnd w:id="115"/>
-    <w:bookmarkStart w:id="117" w:name="ref-otc2016circulation"/>
+    <w:bookmarkEnd w:id="117"/>
+    <w:bookmarkStart w:id="119" w:name="ref-otc2016circulation"/>
     <w:p>
       <w:pPr>
         <w:pStyle w:val="Bibliography"/>
@@ -8227,7 +8663,7 @@
       <w:r>
         <w:t xml:space="preserve"> </w:t>
       </w:r>
-      <w:hyperlink r:id="rId116">
+      <w:hyperlink r:id="rId118">
         <w:r>
           <w:rPr>
             <w:rStyle w:val="Hyperlink"/>
@@ -8236,8 +8672,8 @@
         </w:r>
       </w:hyperlink>
     </w:p>
-    <w:bookmarkEnd w:id="117"/>
-    <w:bookmarkStart w:id="119" w:name="ref-orr2021cadre"/>
+    <w:bookmarkEnd w:id="119"/>
+    <w:bookmarkStart w:id="121" w:name="ref-orr2021cadre"/>
     <w:p>
       <w:pPr>
         <w:pStyle w:val="Bibliography"/>
@@ -8264,7 +8700,7 @@
       <w:r>
         <w:t xml:space="preserve"> </w:t>
       </w:r>
-      <w:hyperlink r:id="rId118">
+      <w:hyperlink r:id="rId120">
         <w:r>
           <w:rPr>
             <w:rStyle w:val="Hyperlink"/>
@@ -8273,8 +8709,8 @@
         </w:r>
       </w:hyperlink>
     </w:p>
-    <w:bookmarkEnd w:id="119"/>
-    <w:bookmarkStart w:id="121" w:name="ref-orr2024tps"/>
+    <w:bookmarkEnd w:id="121"/>
+    <w:bookmarkStart w:id="123" w:name="ref-orr2024tps"/>
     <w:p>
       <w:pPr>
         <w:pStyle w:val="Bibliography"/>
@@ -8298,7 +8734,7 @@
       <w:r>
         <w:t xml:space="preserve"> </w:t>
       </w:r>
-      <w:hyperlink r:id="rId120">
+      <w:hyperlink r:id="rId122">
         <w:r>
           <w:rPr>
             <w:rStyle w:val="Hyperlink"/>
@@ -8307,8 +8743,8 @@
         </w:r>
       </w:hyperlink>
     </w:p>
-    <w:bookmarkEnd w:id="121"/>
-    <w:bookmarkStart w:id="123" w:name="ref-orr2025wcml"/>
+    <w:bookmarkEnd w:id="123"/>
+    <w:bookmarkStart w:id="125" w:name="ref-orr2025wcml"/>
     <w:p>
       <w:pPr>
         <w:pStyle w:val="Bibliography"/>
@@ -8377,7 +8813,7 @@
       <w:r>
         <w:t xml:space="preserve"> </w:t>
       </w:r>
-      <w:hyperlink r:id="rId122">
+      <w:hyperlink r:id="rId124">
         <w:r>
           <w:rPr>
             <w:rStyle w:val="Hyperlink"/>
@@ -8386,8 +8822,8 @@
         </w:r>
       </w:hyperlink>
     </w:p>
-    <w:bookmarkEnd w:id="123"/>
-    <w:bookmarkStart w:id="125" w:name="ref-osm2026geofabrik"/>
+    <w:bookmarkEnd w:id="125"/>
+    <w:bookmarkStart w:id="127" w:name="ref-osm2026geofabrik"/>
     <w:p>
       <w:pPr>
         <w:pStyle w:val="Bibliography"/>
@@ -8453,7 +8889,7 @@
       <w:r>
         <w:t xml:space="preserve"> </w:t>
       </w:r>
-      <w:hyperlink r:id="rId124">
+      <w:hyperlink r:id="rId126">
         <w:r>
           <w:rPr>
             <w:rStyle w:val="Hyperlink"/>
@@ -8462,8 +8898,8 @@
         </w:r>
       </w:hyperlink>
     </w:p>
-    <w:bookmarkEnd w:id="125"/>
-    <w:bookmarkStart w:id="127" w:name="ref-ltc1996art138"/>
+    <w:bookmarkEnd w:id="127"/>
+    <w:bookmarkStart w:id="129" w:name="ref-ltc1996art138"/>
     <w:p>
       <w:pPr>
         <w:pStyle w:val="Bibliography"/>
@@ -8508,7 +8944,7 @@
       <w:r>
         <w:t xml:space="preserve"> </w:t>
       </w:r>
-      <w:hyperlink r:id="rId126">
+      <w:hyperlink r:id="rId128">
         <w:r>
           <w:rPr>
             <w:rStyle w:val="Hyperlink"/>
@@ -8517,8 +8953,8 @@
         </w:r>
       </w:hyperlink>
     </w:p>
-    <w:bookmarkEnd w:id="127"/>
-    <w:bookmarkStart w:id="129" w:name="ref-railwaysact1993"/>
+    <w:bookmarkEnd w:id="129"/>
+    <w:bookmarkStart w:id="131" w:name="ref-railwaysact1993"/>
     <w:p>
       <w:pPr>
         <w:pStyle w:val="Bibliography"/>
@@ -8542,7 +8978,7 @@
       <w:r>
         <w:t xml:space="preserve"> </w:t>
       </w:r>
-      <w:hyperlink r:id="rId128">
+      <w:hyperlink r:id="rId130">
         <w:r>
           <w:rPr>
             <w:rStyle w:val="Hyperlink"/>
@@ -8551,8 +8987,8 @@
         </w:r>
       </w:hyperlink>
     </w:p>
-    <w:bookmarkEnd w:id="129"/>
-    <w:bookmarkStart w:id="131" w:name="ref-rfli2026tpr"/>
+    <w:bookmarkEnd w:id="131"/>
+    <w:bookmarkStart w:id="133" w:name="ref-rfli2026tpr"/>
     <w:p>
       <w:pPr>
         <w:pStyle w:val="Bibliography"/>
@@ -8576,7 +9012,7 @@
       <w:r>
         <w:t xml:space="preserve"> </w:t>
       </w:r>
-      <w:hyperlink r:id="rId130">
+      <w:hyperlink r:id="rId132">
         <w:r>
           <w:rPr>
             <w:rStyle w:val="Hyperlink"/>
@@ -8585,8 +9021,8 @@
         </w:r>
       </w:hyperlink>
     </w:p>
-    <w:bookmarkEnd w:id="131"/>
-    <w:bookmarkStart w:id="133" w:name="ref-schittenhelm2011"/>
+    <w:bookmarkEnd w:id="133"/>
+    <w:bookmarkStart w:id="135" w:name="ref-schittenhelm2011"/>
     <w:p>
       <w:pPr>
         <w:pStyle w:val="Bibliography"/>
@@ -8610,7 +9046,7 @@
       <w:r>
         <w:t xml:space="preserve"> </w:t>
       </w:r>
-      <w:hyperlink r:id="rId132">
+      <w:hyperlink r:id="rId134">
         <w:r>
           <w:rPr>
             <w:rStyle w:val="Hyperlink"/>
@@ -8619,8 +9055,8 @@
         </w:r>
       </w:hyperlink>
     </w:p>
-    <w:bookmarkEnd w:id="133"/>
-    <w:bookmarkStart w:id="135" w:name="ref-schreiber2024downeaster"/>
+    <w:bookmarkEnd w:id="135"/>
+    <w:bookmarkStart w:id="137" w:name="ref-schreiber2024downeaster"/>
     <w:p>
       <w:pPr>
         <w:pStyle w:val="Bibliography"/>
@@ -8644,7 +9080,7 @@
       <w:r>
         <w:t xml:space="preserve"> </w:t>
       </w:r>
-      <w:hyperlink r:id="rId134">
+      <w:hyperlink r:id="rId136">
         <w:r>
           <w:rPr>
             <w:rStyle w:val="Hyperlink"/>
@@ -8653,8 +9089,8 @@
         </w:r>
       </w:hyperlink>
     </w:p>
-    <w:bookmarkEnd w:id="135"/>
-    <w:bookmarkStart w:id="137" w:name="ref-siemens2024chargerwsdot"/>
+    <w:bookmarkEnd w:id="137"/>
+    <w:bookmarkStart w:id="139" w:name="ref-siemens2024chargerwsdot"/>
     <w:p>
       <w:pPr>
         <w:pStyle w:val="Bibliography"/>
@@ -8678,7 +9114,7 @@
       <w:r>
         <w:t xml:space="preserve"> </w:t>
       </w:r>
-      <w:hyperlink r:id="rId136">
+      <w:hyperlink r:id="rId138">
         <w:r>
           <w:rPr>
             <w:rStyle w:val="Hyperlink"/>
@@ -8687,8 +9123,8 @@
         </w:r>
       </w:hyperlink>
     </w:p>
-    <w:bookmarkEnd w:id="137"/>
-    <w:bookmarkStart w:id="139" w:name="ref-sncf2023drr"/>
+    <w:bookmarkEnd w:id="139"/>
+    <w:bookmarkStart w:id="141" w:name="ref-sncf2023drr"/>
     <w:p>
       <w:pPr>
         <w:pStyle w:val="Bibliography"/>
@@ -8712,7 +9148,7 @@
       <w:r>
         <w:t xml:space="preserve"> </w:t>
       </w:r>
-      <w:hyperlink r:id="rId138">
+      <w:hyperlink r:id="rId140">
         <w:r>
           <w:rPr>
             <w:rStyle w:val="Hyperlink"/>
@@ -8721,8 +9157,8 @@
         </w:r>
       </w:hyperlink>
     </w:p>
-    <w:bookmarkEnd w:id="139"/>
-    <w:bookmarkStart w:id="141" w:name="ref-sogin2013doublement"/>
+    <w:bookmarkEnd w:id="141"/>
+    <w:bookmarkStart w:id="143" w:name="ref-sogin2013doublement"/>
     <w:p>
       <w:pPr>
         <w:pStyle w:val="Bibliography"/>
@@ -8746,7 +9182,7 @@
       <w:r>
         <w:t xml:space="preserve"> </w:t>
       </w:r>
-      <w:hyperlink r:id="rId140">
+      <w:hyperlink r:id="rId142">
         <w:r>
           <w:rPr>
             <w:rStyle w:val="Hyperlink"/>
@@ -8755,8 +9191,8 @@
         </w:r>
       </w:hyperlink>
     </w:p>
-    <w:bookmarkEnd w:id="141"/>
-    <w:bookmarkStart w:id="143" w:name="ref-trafikverket2025jnb"/>
+    <w:bookmarkEnd w:id="143"/>
+    <w:bookmarkStart w:id="145" w:name="ref-trafikverket2025jnb"/>
     <w:p>
       <w:pPr>
         <w:pStyle w:val="Bibliography"/>
@@ -8780,7 +9216,7 @@
       <w:r>
         <w:t xml:space="preserve"> </w:t>
       </w:r>
-      <w:hyperlink r:id="rId142">
+      <w:hyperlink r:id="rId144">
         <w:r>
           <w:rPr>
             <w:rStyle w:val="Hyperlink"/>
@@ -8789,8 +9225,8 @@
         </w:r>
       </w:hyperlink>
     </w:p>
-    <w:bookmarkEnd w:id="143"/>
-    <w:bookmarkStart w:id="145" w:name="ref-tc2022rrts"/>
+    <w:bookmarkEnd w:id="145"/>
+    <w:bookmarkStart w:id="147" w:name="ref-tc2022rrts"/>
     <w:p>
       <w:pPr>
         <w:pStyle w:val="Bibliography"/>
@@ -8828,7 +9264,7 @@
       <w:r>
         <w:t xml:space="preserve"> </w:t>
       </w:r>
-      <w:hyperlink r:id="rId144">
+      <w:hyperlink r:id="rId146">
         <w:r>
           <w:rPr>
             <w:rStyle w:val="Hyperlink"/>
@@ -8837,8 +9273,8 @@
         </w:r>
       </w:hyperlink>
     </w:p>
-    <w:bookmarkEnd w:id="145"/>
-    <w:bookmarkStart w:id="147" w:name="ref-tc2023inventairepn"/>
+    <w:bookmarkEnd w:id="147"/>
+    <w:bookmarkStart w:id="149" w:name="ref-tc2023inventairepn"/>
     <w:p>
       <w:pPr>
         <w:pStyle w:val="Bibliography"/>
@@ -8862,7 +9298,7 @@
       <w:r>
         <w:t xml:space="preserve"> </w:t>
       </w:r>
-      <w:hyperlink r:id="rId146">
+      <w:hyperlink r:id="rId148">
         <w:r>
           <w:rPr>
             <w:rStyle w:val="Hyperlink"/>
@@ -8871,8 +9307,8 @@
         </w:r>
       </w:hyperlink>
     </w:p>
-    <w:bookmarkEnd w:id="147"/>
-    <w:bookmarkStart w:id="149" w:name="ref-tc2025gcp"/>
+    <w:bookmarkEnd w:id="149"/>
+    <w:bookmarkStart w:id="151" w:name="ref-tc2025gcp"/>
     <w:p>
       <w:pPr>
         <w:pStyle w:val="Bibliography"/>
@@ -8980,7 +9416,7 @@
       <w:r>
         <w:t xml:space="preserve"> </w:t>
       </w:r>
-      <w:hyperlink r:id="rId148">
+      <w:hyperlink r:id="rId150">
         <w:r>
           <w:rPr>
             <w:rStyle w:val="Hyperlink"/>
@@ -8989,8 +9425,8 @@
         </w:r>
       </w:hyperlink>
     </w:p>
-    <w:bookmarkEnd w:id="149"/>
-    <w:bookmarkStart w:id="151" w:name="ref-cror2025"/>
+    <w:bookmarkEnd w:id="151"/>
+    <w:bookmarkStart w:id="153" w:name="ref-cror2025"/>
     <w:p>
       <w:pPr>
         <w:pStyle w:val="Bibliography"/>
@@ -9014,7 +9450,7 @@
       <w:r>
         <w:t xml:space="preserve"> </w:t>
       </w:r>
-      <w:hyperlink r:id="rId150">
+      <w:hyperlink r:id="rId152">
         <w:r>
           <w:rPr>
             <w:rStyle w:val="Hyperlink"/>
@@ -9023,8 +9459,8 @@
         </w:r>
       </w:hyperlink>
     </w:p>
-    <w:bookmarkEnd w:id="151"/>
-    <w:bookmarkStart w:id="152" w:name="ref-uic2000f451"/>
+    <w:bookmarkEnd w:id="153"/>
+    <w:bookmarkStart w:id="154" w:name="ref-uic2000f451"/>
     <w:p>
       <w:pPr>
         <w:pStyle w:val="Bibliography"/>
@@ -9049,8 +9485,8 @@
         <w:t xml:space="preserve">[Fiche UIC 451-1/F/4, 4e \'ed.]. UIC.</w:t>
       </w:r>
     </w:p>
-    <w:bookmarkEnd w:id="152"/>
-    <w:bookmarkStart w:id="154" w:name="ref-fra2000acela"/>
+    <w:bookmarkEnd w:id="154"/>
+    <w:bookmarkStart w:id="156" w:name="ref-fra2000acela"/>
     <w:p>
       <w:pPr>
         <w:pStyle w:val="Bibliography"/>
@@ -9074,7 +9510,7 @@
       <w:r>
         <w:t xml:space="preserve"> </w:t>
       </w:r>
-      <w:hyperlink r:id="rId153">
+      <w:hyperlink r:id="rId155">
         <w:r>
           <w:rPr>
             <w:rStyle w:val="Hyperlink"/>
@@ -9083,8 +9519,8 @@
         </w:r>
       </w:hyperlink>
     </w:p>
-    <w:bookmarkEnd w:id="154"/>
-    <w:bookmarkStart w:id="156" w:name="ref-fra2010ptc"/>
+    <w:bookmarkEnd w:id="156"/>
+    <w:bookmarkStart w:id="158" w:name="ref-fra2010ptc"/>
     <w:p>
       <w:pPr>
         <w:pStyle w:val="Bibliography"/>
@@ -9108,7 +9544,7 @@
       <w:r>
         <w:t xml:space="preserve"> </w:t>
       </w:r>
-      <w:hyperlink r:id="rId155">
+      <w:hyperlink r:id="rId157">
         <w:r>
           <w:rPr>
             <w:rStyle w:val="Hyperlink"/>
@@ -9117,8 +9553,8 @@
         </w:r>
       </w:hyperlink>
     </w:p>
-    <w:bookmarkEnd w:id="156"/>
-    <w:bookmarkStart w:id="158" w:name="ref-fra2023brightlineptc"/>
+    <w:bookmarkEnd w:id="158"/>
+    <w:bookmarkStart w:id="160" w:name="ref-fra2023brightlineptc"/>
     <w:p>
       <w:pPr>
         <w:pStyle w:val="Bibliography"/>
@@ -9142,7 +9578,7 @@
       <w:r>
         <w:t xml:space="preserve"> </w:t>
       </w:r>
-      <w:hyperlink r:id="rId157">
+      <w:hyperlink r:id="rId159">
         <w:r>
           <w:rPr>
             <w:rStyle w:val="Hyperlink"/>
@@ -9151,8 +9587,8 @@
         </w:r>
       </w:hyperlink>
     </w:p>
-    <w:bookmarkEnd w:id="158"/>
-    <w:bookmarkStart w:id="160" w:name="ref-cfr236-0"/>
+    <w:bookmarkEnd w:id="160"/>
+    <w:bookmarkStart w:id="162" w:name="ref-cfr236-0"/>
     <w:p>
       <w:pPr>
         <w:pStyle w:val="Bibliography"/>
@@ -9176,7 +9612,7 @@
       <w:r>
         <w:t xml:space="preserve"> </w:t>
       </w:r>
-      <w:hyperlink r:id="rId159">
+      <w:hyperlink r:id="rId161">
         <w:r>
           <w:rPr>
             <w:rStyle w:val="Hyperlink"/>
@@ -9185,8 +9621,8 @@
         </w:r>
       </w:hyperlink>
     </w:p>
-    <w:bookmarkEnd w:id="160"/>
-    <w:bookmarkStart w:id="162" w:name="ref-via2009lrc"/>
+    <w:bookmarkEnd w:id="162"/>
+    <w:bookmarkStart w:id="164" w:name="ref-via2009lrc"/>
     <w:p>
       <w:pPr>
         <w:pStyle w:val="Bibliography"/>
@@ -9231,7 +9667,7 @@
       <w:r>
         <w:t xml:space="preserve"> </w:t>
       </w:r>
-      <w:hyperlink r:id="rId161">
+      <w:hyperlink r:id="rId163">
         <w:r>
           <w:rPr>
             <w:rStyle w:val="Hyperlink"/>
@@ -9240,8 +9676,8 @@
         </w:r>
       </w:hyperlink>
     </w:p>
-    <w:bookmarkEnd w:id="162"/>
-    <w:bookmarkStart w:id="164" w:name="ref-viarail2024corridor"/>
+    <w:bookmarkEnd w:id="164"/>
+    <w:bookmarkStart w:id="166" w:name="ref-viarail2024corridor"/>
     <w:p>
       <w:pPr>
         <w:pStyle w:val="Bibliography"/>
@@ -9265,7 +9701,7 @@
       <w:r>
         <w:t xml:space="preserve"> </w:t>
       </w:r>
-      <w:hyperlink r:id="rId163">
+      <w:hyperlink r:id="rId165">
         <w:r>
           <w:rPr>
             <w:rStyle w:val="Hyperlink"/>
@@ -9274,8 +9710,8 @@
         </w:r>
       </w:hyperlink>
     </w:p>
-    <w:bookmarkEnd w:id="164"/>
-    <w:bookmarkStart w:id="166" w:name="ref-via2025rapportannuel"/>
+    <w:bookmarkEnd w:id="166"/>
+    <w:bookmarkStart w:id="168" w:name="ref-via2025rapportannuel"/>
     <w:p>
       <w:pPr>
         <w:pStyle w:val="Bibliography"/>
@@ -9299,7 +9735,7 @@
       <w:r>
         <w:t xml:space="preserve"> </w:t>
       </w:r>
-      <w:hyperlink r:id="rId165">
+      <w:hyperlink r:id="rId167">
         <w:r>
           <w:rPr>
             <w:rStyle w:val="Hyperlink"/>
@@ -9308,8 +9744,8 @@
         </w:r>
       </w:hyperlink>
     </w:p>
-    <w:bookmarkEnd w:id="166"/>
-    <w:bookmarkStart w:id="168" w:name="ref-via2025t1"/>
+    <w:bookmarkEnd w:id="168"/>
+    <w:bookmarkStart w:id="170" w:name="ref-via2025t1"/>
     <w:p>
       <w:pPr>
         <w:pStyle w:val="Bibliography"/>
@@ -9333,7 +9769,7 @@
       <w:r>
         <w:t xml:space="preserve"> </w:t>
       </w:r>
-      <w:hyperlink r:id="rId167">
+      <w:hyperlink r:id="rId169">
         <w:r>
           <w:rPr>
             <w:rStyle w:val="Hyperlink"/>
@@ -9342,8 +9778,8 @@
         </w:r>
       </w:hyperlink>
     </w:p>
-    <w:bookmarkEnd w:id="168"/>
-    <w:bookmarkStart w:id="170" w:name="ref-viarail2026gtfs"/>
+    <w:bookmarkEnd w:id="170"/>
+    <w:bookmarkStart w:id="172" w:name="ref-viarail2026gtfs"/>
     <w:p>
       <w:pPr>
         <w:pStyle w:val="Bibliography"/>
@@ -9409,7 +9845,7 @@
       <w:r>
         <w:t xml:space="preserve"> </w:t>
       </w:r>
-      <w:hyperlink r:id="rId169">
+      <w:hyperlink r:id="rId171">
         <w:r>
           <w:rPr>
             <w:rStyle w:val="Hyperlink"/>
@@ -9418,8 +9854,8 @@
         </w:r>
       </w:hyperlink>
     </w:p>
-    <w:bookmarkEnd w:id="170"/>
-    <w:bookmarkStart w:id="172" w:name="ref-wikipedia2026class390"/>
+    <w:bookmarkEnd w:id="172"/>
+    <w:bookmarkStart w:id="174" w:name="ref-wikipedia2026class390"/>
     <w:p>
       <w:pPr>
         <w:pStyle w:val="Bibliography"/>
@@ -9443,7 +9879,7 @@
       <w:r>
         <w:t xml:space="preserve"> </w:t>
       </w:r>
-      <w:hyperlink r:id="rId171">
+      <w:hyperlink r:id="rId173">
         <w:r>
           <w:rPr>
             <w:rStyle w:val="Hyperlink"/>
@@ -9452,8 +9888,8 @@
         </w:r>
       </w:hyperlink>
     </w:p>
-    <w:bookmarkEnd w:id="172"/>
-    <w:bookmarkStart w:id="174" w:name="ref-wikipedia2026newpendolino"/>
+    <w:bookmarkEnd w:id="174"/>
+    <w:bookmarkStart w:id="176" w:name="ref-wikipedia2026newpendolino"/>
     <w:p>
       <w:pPr>
         <w:pStyle w:val="Bibliography"/>
@@ -9477,7 +9913,7 @@
       <w:r>
         <w:t xml:space="preserve"> </w:t>
       </w:r>
-      <w:hyperlink r:id="rId173">
+      <w:hyperlink r:id="rId175">
         <w:r>
           <w:rPr>
             <w:rStyle w:val="Hyperlink"/>
@@ -9486,8 +9922,8 @@
         </w:r>
       </w:hyperlink>
     </w:p>
-    <w:bookmarkEnd w:id="174"/>
-    <w:bookmarkStart w:id="176" w:name="ref-wikipedia2026charger"/>
+    <w:bookmarkEnd w:id="176"/>
+    <w:bookmarkStart w:id="178" w:name="ref-wikipedia2026charger"/>
     <w:p>
       <w:pPr>
         <w:pStyle w:val="Bibliography"/>
@@ -9511,7 +9947,7 @@
       <w:r>
         <w:t xml:space="preserve"> </w:t>
       </w:r>
-      <w:hyperlink r:id="rId175">
+      <w:hyperlink r:id="rId177">
         <w:r>
           <w:rPr>
             <w:rStyle w:val="Hyperlink"/>
@@ -9520,8 +9956,8 @@
         </w:r>
       </w:hyperlink>
     </w:p>
-    <w:bookmarkEnd w:id="176"/>
-    <w:bookmarkStart w:id="178" w:name="ref-wikipedia2026venture"/>
+    <w:bookmarkEnd w:id="178"/>
+    <w:bookmarkStart w:id="180" w:name="ref-wikipedia2026venture"/>
     <w:p>
       <w:pPr>
         <w:pStyle w:val="Bibliography"/>
@@ -9545,7 +9981,7 @@
       <w:r>
         <w:t xml:space="preserve"> </w:t>
       </w:r>
-      <w:hyperlink r:id="rId177">
+      <w:hyperlink r:id="rId179">
         <w:r>
           <w:rPr>
             <w:rStyle w:val="Hyperlink"/>
@@ -9554,8 +9990,8 @@
         </w:r>
       </w:hyperlink>
     </w:p>
-    <w:bookmarkEnd w:id="178"/>
-    <w:bookmarkStart w:id="180" w:name="ref-wcml2026wiki"/>
+    <w:bookmarkEnd w:id="180"/>
+    <w:bookmarkStart w:id="182" w:name="ref-wcml2026wiki"/>
     <w:p>
       <w:pPr>
         <w:pStyle w:val="Bibliography"/>
@@ -9593,7 +10029,7 @@
       <w:r>
         <w:t xml:space="preserve"> </w:t>
       </w:r>
-      <w:hyperlink r:id="rId179">
+      <w:hyperlink r:id="rId181">
         <w:r>
           <w:rPr>
             <w:rStyle w:val="Hyperlink"/>
@@ -9602,9 +10038,9 @@
         </w:r>
       </w:hyperlink>
     </w:p>
-    <w:bookmarkEnd w:id="180"/>
-    <w:bookmarkEnd w:id="181"/>
     <w:bookmarkEnd w:id="182"/>
+    <w:bookmarkEnd w:id="183"/>
+    <w:bookmarkEnd w:id="184"/>
     <w:sectPr>
       <w:footnotePr>
         <w:numRestart w:val="eachSect"/>

</xml_diff>

<commit_message>
Crédits : Vision Transport seul ; table Montréal-Québec en temps cumulés depuis Montréal ; signalisation : priorité aux trains de passagers et ponctualité
Co-Authored-By: Claude Fable 5.1 <noreply@anthropic.com>
</commit_message>
<xml_diff>
--- a/livrables/rapport_corridor.docx
+++ b/livrables/rapport_corridor.docx
@@ -778,7 +778,7 @@
         <w:t xml:space="preserve"> </w:t>
       </w:r>
       <w:r>
-        <w:t xml:space="preserve">Grâce à l’installation d’un système de contrôle de train en cabine comme celui déjà utilisé aux États-Unis, la distance nécessaire entre les trains sera de beaucoup réduite, ce qui favorisera la cohabitation. Ce système autorise une vitesse maximale de 201 km/h (125 mi/h) quand la voie le permet.</w:t>
+        <w:t xml:space="preserve">Grâce à l’installation d’un système de contrôle de train en cabine comme celui déjà utilisé aux États-Unis, la distance nécessaire entre les trains sera de beaucoup réduite, ce qui favorisera la cohabitation et permettra de donner la priorité aux trains de passagers, dont dépend leur ponctualité. Ce système autorise une vitesse maximale de 201 km/h (125 mi/h) quand la voie le permet.</w:t>
       </w:r>
     </w:p>
     <w:p>
@@ -2880,7 +2880,7 @@
         <w:t xml:space="preserve"> </w:t>
       </w:r>
       <w:r>
-        <w:t xml:space="preserve">La signalisation joue dans deux des facteurs de gain de ce rapport, et il faut les distinguer pour ne rien compter deux fois. Le premier rôle est la vitesse : le contrôle en cabine est la condition, avec les passages à niveau sécurisés, du passage de la classe actuelle (153 km/h) à 201 km/h. C’est ce que le rapport mesure sous « changement de classe ». Le deuxième rôle est la capacité : le contrôle en cabine, installé avec des cantons plus courts (les tronçons qu’un seul train peut occuper), rapproche les trains et libère de la place pour la cohabitation avec le fret. La simulation d’un corridor nord-américain partagé montre que ce levier ajoute plusieurs trains par jour</w:t>
+        <w:t xml:space="preserve">La signalisation joue dans deux des facteurs de gain de ce rapport, et il faut les distinguer pour ne rien compter deux fois. Le premier rôle est la vitesse : le contrôle en cabine est la condition, avec les passages à niveau sécurisés, du passage de la classe actuelle (153 km/h) à 201 km/h. C’est ce que le rapport mesure sous « changement de classe ». Le deuxième rôle est la capacité : le contrôle en cabine, installé avec des cantons plus courts (les tronçons qu’un seul train peut occuper), rapproche les trains et libère de la place pour la cohabitation avec le fret ; c’est cette place qui permet de donner la priorité aux trains de passagers, donc de tenir l’horaire. La simulation d’un corridor nord-américain partagé montre que ce levier ajoute plusieurs trains par jour</w:t>
       </w:r>
       <w:r>
         <w:t xml:space="preserve"> </w:t>
@@ -5907,20 +5907,19 @@
           <w:b/>
           <w:bCs/>
         </w:rPr>
-        <w:t xml:space="preserve">Montréal-Québec, sous-section par sous-section.</w:t>
-      </w:r>
-      <w:r>
-        <w:t xml:space="preserve"> </w:t>
-      </w:r>
-      <w:r>
-        <w:t xml:space="preserve">Le trajet Montréal-Québec est celui où le gain est le plus grand. Le tableau qui suit le découpe aux gares de Saint-Hilaire, de Saint-Hyacinthe et de Drummondville. Chaque ligne va du départ d’une gare à l’arrivée à la suivante ; le total ajoute les deux minutes d’arrêt à Saint-Hyacinthe et à Drummondville.</w:t>
+        <w:t xml:space="preserve">Montréal-Québec, gare par gare.</w:t>
+      </w:r>
+      <w:r>
+        <w:t xml:space="preserve"> </w:t>
+      </w:r>
+      <w:r>
+        <w:t xml:space="preserve">Le trajet Montréal-Québec est celui où le gain est le plus grand. Le tableau qui suit donne le temps depuis Montréal jusqu’aux gares de Saint-Hilaire, de Saint-Hyacinthe et de Drummondville, puis jusqu’à Québec, arrêts intermédiaires compris.</w:t>
       </w:r>
     </w:p>
     <w:tbl>
       <w:tblPr>
         <w:tblStyle w:val="Table"/>
-        <w:tblW w:type="pct" w:w="5000"/>
-        <w:tblLayout w:type="fixed"/>
+        <w:tblW w:type="auto" w:w="0"/>
         <w:tblLook w:firstRow="1" w:lastRow="0" w:firstColumn="0" w:lastColumn="0" w:noHBand="0" w:noVBand="0" w:val="0020"/>
       </w:tblPr>
       <w:tblGrid>
@@ -5940,7 +5939,7 @@
               <w:pStyle w:val="Compact"/>
             </w:pPr>
             <w:r>
-              <w:t xml:space="preserve">Sous-section</w:t>
+              <w:t xml:space="preserve">Depuis Montréal jusqu’à</w:t>
             </w:r>
           </w:p>
         </w:tc>
@@ -5986,7 +5985,7 @@
               <w:pStyle w:val="Compact"/>
             </w:pPr>
             <w:r>
-              <w:t xml:space="preserve">Montréal à Saint-Hilaire</w:t>
+              <w:t xml:space="preserve">Saint-Hilaire</w:t>
             </w:r>
           </w:p>
         </w:tc>
@@ -6032,40 +6031,40 @@
               <w:pStyle w:val="Compact"/>
             </w:pPr>
             <w:r>
-              <w:t xml:space="preserve">Saint-Hilaire à Saint-Hyacinthe</w:t>
-            </w:r>
-          </w:p>
-        </w:tc>
-        <w:tc>
-          <w:tcPr/>
-          <w:p>
-            <w:pPr>
-              <w:pStyle w:val="Compact"/>
-            </w:pPr>
-            <w:r>
-              <w:t xml:space="preserve">19 km</w:t>
-            </w:r>
-          </w:p>
-        </w:tc>
-        <w:tc>
-          <w:tcPr/>
-          <w:p>
-            <w:pPr>
-              <w:pStyle w:val="Compact"/>
-            </w:pPr>
-            <w:r>
-              <w:t xml:space="preserve">aucun train direct</w:t>
-            </w:r>
-          </w:p>
-        </w:tc>
-        <w:tc>
-          <w:tcPr/>
-          <w:p>
-            <w:pPr>
-              <w:pStyle w:val="Compact"/>
-            </w:pPr>
-            <w:r>
-              <w:t xml:space="preserve">10 min</w:t>
+              <w:t xml:space="preserve">Saint-Hyacinthe</w:t>
+            </w:r>
+          </w:p>
+        </w:tc>
+        <w:tc>
+          <w:tcPr/>
+          <w:p>
+            <w:pPr>
+              <w:pStyle w:val="Compact"/>
+            </w:pPr>
+            <w:r>
+              <w:t xml:space="preserve">53 km</w:t>
+            </w:r>
+          </w:p>
+        </w:tc>
+        <w:tc>
+          <w:tcPr/>
+          <w:p>
+            <w:pPr>
+              <w:pStyle w:val="Compact"/>
+            </w:pPr>
+            <w:r>
+              <w:t xml:space="preserve">40 min</w:t>
+            </w:r>
+          </w:p>
+        </w:tc>
+        <w:tc>
+          <w:tcPr/>
+          <w:p>
+            <w:pPr>
+              <w:pStyle w:val="Compact"/>
+            </w:pPr>
+            <w:r>
+              <w:t xml:space="preserve">29 min</w:t>
             </w:r>
           </w:p>
         </w:tc>
@@ -6078,40 +6077,40 @@
               <w:pStyle w:val="Compact"/>
             </w:pPr>
             <w:r>
-              <w:t xml:space="preserve">Saint-Hyacinthe à Drummondville</w:t>
-            </w:r>
-          </w:p>
-        </w:tc>
-        <w:tc>
-          <w:tcPr/>
-          <w:p>
-            <w:pPr>
-              <w:pStyle w:val="Compact"/>
-            </w:pPr>
-            <w:r>
-              <w:t xml:space="preserve">47 km</w:t>
-            </w:r>
-          </w:p>
-        </w:tc>
-        <w:tc>
-          <w:tcPr/>
-          <w:p>
-            <w:pPr>
-              <w:pStyle w:val="Compact"/>
-            </w:pPr>
-            <w:r>
-              <w:t xml:space="preserve">30 min</w:t>
-            </w:r>
-          </w:p>
-        </w:tc>
-        <w:tc>
-          <w:tcPr/>
-          <w:p>
-            <w:pPr>
-              <w:pStyle w:val="Compact"/>
-            </w:pPr>
-            <w:r>
-              <w:t xml:space="preserve">20 min</w:t>
+              <w:t xml:space="preserve">Drummondville</w:t>
+            </w:r>
+          </w:p>
+        </w:tc>
+        <w:tc>
+          <w:tcPr/>
+          <w:p>
+            <w:pPr>
+              <w:pStyle w:val="Compact"/>
+            </w:pPr>
+            <w:r>
+              <w:t xml:space="preserve">100 km</w:t>
+            </w:r>
+          </w:p>
+        </w:tc>
+        <w:tc>
+          <w:tcPr/>
+          <w:p>
+            <w:pPr>
+              <w:pStyle w:val="Compact"/>
+            </w:pPr>
+            <w:r>
+              <w:t xml:space="preserve">1 h 17</w:t>
+            </w:r>
+          </w:p>
+        </w:tc>
+        <w:tc>
+          <w:tcPr/>
+          <w:p>
+            <w:pPr>
+              <w:pStyle w:val="Compact"/>
+            </w:pPr>
+            <w:r>
+              <w:t xml:space="preserve">51 min</w:t>
             </w:r>
           </w:p>
         </w:tc>
@@ -6124,53 +6123,7 @@
               <w:pStyle w:val="Compact"/>
             </w:pPr>
             <w:r>
-              <w:t xml:space="preserve">Drummondville à Québec</w:t>
-            </w:r>
-          </w:p>
-        </w:tc>
-        <w:tc>
-          <w:tcPr/>
-          <w:p>
-            <w:pPr>
-              <w:pStyle w:val="Compact"/>
-            </w:pPr>
-            <w:r>
-              <w:t xml:space="preserve">170 km</w:t>
-            </w:r>
-          </w:p>
-        </w:tc>
-        <w:tc>
-          <w:tcPr/>
-          <w:p>
-            <w:pPr>
-              <w:pStyle w:val="Compact"/>
-            </w:pPr>
-            <w:r>
-              <w:t xml:space="preserve">2 h 08</w:t>
-            </w:r>
-          </w:p>
-        </w:tc>
-        <w:tc>
-          <w:tcPr/>
-          <w:p>
-            <w:pPr>
-              <w:pStyle w:val="Compact"/>
-            </w:pPr>
-            <w:r>
-              <w:t xml:space="preserve">1 h 23</w:t>
-            </w:r>
-          </w:p>
-        </w:tc>
-      </w:tr>
-      <w:tr>
-        <w:tc>
-          <w:tcPr/>
-          <w:p>
-            <w:pPr>
-              <w:pStyle w:val="Compact"/>
-            </w:pPr>
-            <w:r>
-              <w:t xml:space="preserve">Montréal à Québec, arrêts compris</w:t>
+              <w:t xml:space="preserve">Québec</w:t>
             </w:r>
           </w:p>
         </w:tc>
@@ -6243,7 +6196,7 @@
         <w:t xml:space="preserve"> </w:t>
       </w:r>
       <w:r>
-        <w:t xml:space="preserve">; le temps de l’emprise optimisée est un temps de passage, sans arrêt à Saint-Hilaire, qui comprend l’arrêt à Saint-Lambert. Pour le voyageur de VIA, Montréal-Saint-Hyacinthe passerait de 40 à 29 minutes. Le gros du gain se trouve entre Drummondville et Québec, sur la subdivision Drummondville, là où la voie est simple et la marge de l’horaire la plus forte. Le détail est dans l’annexe numérique (</w:t>
+        <w:t xml:space="preserve">; le temps de l’emprise optimisée est un temps de passage, sans arrêt à Saint-Hilaire, qui comprend l’arrêt à Saint-Lambert. Le gros du gain se trouve entre Drummondville et Québec, sur la subdivision Drummondville, là où la voie est simple et la marge de l’horaire la plus forte : ce segment passerait de 2 h 08 à 1 h 23. Le détail est dans l’annexe numérique (</w:t>
       </w:r>
       <w:r>
         <w:rPr>
@@ -7139,7 +7092,7 @@
         <w:t xml:space="preserve"> </w:t>
       </w:r>
       <w:r>
-        <w:t xml:space="preserve">François Rebello, pour Vision Transport.</w:t>
+        <w:t xml:space="preserve">Vision Transport.</w:t>
       </w:r>
     </w:p>
     <w:p>

</xml_diff>

<commit_message>
Saint-Hilaire : même service de banlieue (5 arrêts) avant et après, 51 → 35 min ; le 19 min devient un temps de passage en note
Co-Authored-By: Claude Fable 5.1 <noreply@anthropic.com>
</commit_message>
<xml_diff>
--- a/livrables/rapport_corridor.docx
+++ b/livrables/rapport_corridor.docx
@@ -5919,7 +5919,8 @@
     <w:tbl>
       <w:tblPr>
         <w:tblStyle w:val="Table"/>
-        <w:tblW w:type="auto" w:w="0"/>
+        <w:tblW w:type="pct" w:w="5000"/>
+        <w:tblLayout w:type="fixed"/>
         <w:tblLook w:firstRow="1" w:lastRow="0" w:firstColumn="0" w:lastColumn="0" w:noHBand="0" w:noVBand="0" w:val="0020"/>
       </w:tblPr>
       <w:tblGrid>
@@ -6007,18 +6008,18 @@
               <w:pStyle w:val="Compact"/>
             </w:pPr>
             <w:r>
-              <w:t xml:space="preserve">51 min (train de banlieue)</w:t>
-            </w:r>
-          </w:p>
-        </w:tc>
-        <w:tc>
-          <w:tcPr/>
-          <w:p>
-            <w:pPr>
-              <w:pStyle w:val="Compact"/>
-            </w:pPr>
-            <w:r>
-              <w:t xml:space="preserve">19 min</w:t>
+              <w:t xml:space="preserve">51 min (train de banlieue, 5 arrêts)</w:t>
+            </w:r>
+          </w:p>
+        </w:tc>
+        <w:tc>
+          <w:tcPr/>
+          <w:p>
+            <w:pPr>
+              <w:pStyle w:val="Compact"/>
+            </w:pPr>
+            <w:r>
+              <w:t xml:space="preserve">35 min (mêmes arrêts)</w:t>
             </w:r>
           </w:p>
         </w:tc>
@@ -6167,7 +6168,7 @@
         <w:pStyle w:val="BodyText"/>
       </w:pPr>
       <w:r>
-        <w:t xml:space="preserve">VIA ne s’arrête pas à Saint-Hilaire. Le temps d’aujourd’hui sur cette ligne est celui du train de banlieue exo, qui roule sur la même voie du CN jusqu’à son terminus de Mont-Saint-Hilaire avec cinq arrêts intermédiaires</w:t>
+        <w:t xml:space="preserve">VIA ne s’arrête pas à Saint-Hilaire. La ligne compare donc le train de banlieue exo, qui roule sur la même voie du CN jusqu’à son terminus de Mont-Saint-Hilaire avec cinq arrêts intermédiaires</w:t>
       </w:r>
       <w:r>
         <w:t xml:space="preserve"> </w:t>
@@ -6193,10 +6194,7 @@
         <w:t xml:space="preserve">)</w:t>
       </w:r>
       <w:r>
-        <w:t xml:space="preserve"> </w:t>
-      </w:r>
-      <w:r>
-        <w:t xml:space="preserve">; le temps de l’emprise optimisée est un temps de passage, sans arrêt à Saint-Hilaire, qui comprend l’arrêt à Saint-Lambert. Le gros du gain se trouve entre Drummondville et Québec, sur la subdivision Drummondville, là où la voie est simple et la marge de l’horaire la plus forte : ce segment passerait de 2 h 08 à 1 h 23. Le détail est dans l’annexe numérique (</w:t>
+        <w:t xml:space="preserve">, au même service avec les mêmes arrêts sur l’emprise optimisée, avec une rame pendulaire. Un train de VIA qui passerait sans s’arrêter y serait en 19 minutes. Le gros du gain se trouve entre Drummondville et Québec, sur la subdivision Drummondville, là où la voie est simple et la marge de l’horaire la plus forte : ce segment passerait de 2 h 08 à 1 h 23. Le détail est dans l’annexe numérique (</w:t>
       </w:r>
       <w:r>
         <w:rPr>

</xml_diff>

<commit_message>
Plus de renvoi aux fichiers CSV dans le texte : renvoi au visualiseur joint
Co-Authored-By: Claude Fable 5.1 <noreply@anthropic.com>
</commit_message>
<xml_diff>
--- a/livrables/rapport_corridor.docx
+++ b/livrables/rapport_corridor.docx
@@ -3329,7 +3329,7 @@
         <w:pStyle w:val="BodyText"/>
       </w:pPr>
       <w:r>
-        <w:t xml:space="preserve">Les 833 passages des deux dernières lignes se trouvent là où le train peut physiquement dépasser 153 km/h : ce sont eux qu’il faut sceller. Parmi eux, 300 ont déjà un système complet de feux, cloches et barrières ; il faudra y ajouter les bras de sortie, les terre-pleins et la détection d’obstacle. Les 533 autres partent de plus loin : 475 n’ont aucune protection automatique, et 58 ont des feux et des cloches sans barrières. Enfin, 77 des 833 sont en zone urbaine et coûteront plus cher que les autres. Les 91 passages de la première ligne sont dans des sections où les courbes plafonnent de toute façon le train sous 153 km/h ; le régime actuel y suffit. L’inventaire complet, passage par passage, est dans l’annexe numérique.</w:t>
+        <w:t xml:space="preserve">Les 833 passages des deux dernières lignes se trouvent là où le train peut physiquement dépasser 153 km/h : ce sont eux qu’il faut sceller. Parmi eux, 300 ont déjà un système complet de feux, cloches et barrières ; il faudra y ajouter les bras de sortie, les terre-pleins et la détection d’obstacle. Les 533 autres partent de plus loin : 475 n’ont aucune protection automatique, et 58 ont des feux et des cloches sans barrières. Enfin, 77 des 833 sont en zone urbaine et coûteront plus cher que les autres. Les 91 passages de la première ligne sont dans des sections où les courbes plafonnent de toute façon le train sous 153 km/h ; le régime actuel y suffit. L’inventaire complet, passage par passage, est dans le visualiseur de données joint.</w:t>
       </w:r>
     </w:p>
     <w:p>
@@ -5874,28 +5874,7 @@
         <w:pStyle w:val="BodyText"/>
       </w:pPr>
       <w:r>
-        <w:t xml:space="preserve">Les tranches sont des attributions qui somment au gain, pas des mesures indépendantes. La signalisation apparaît dans deux postes : comme condition du changement de classe, où son effet sur la vitesse est mesuré, et comme levier de capacité dans la cohabitation, où son effet n’est pas isolé de celui du doublement et de l’arbitrage. Le pendulaire et les zones urbaines sont comptés sous la classe actuelle (153 km/h) ; le changement de classe est ce que l’interurbain rapporte en plus une fois le plafond porté à 201 km/h. Les temps de base sans marge et la méthode d’attribution sont dans l’annexe numérique (</w:t>
-      </w:r>
-      <w:r>
-        <w:rPr>
-          <w:rStyle w:val="VerbatimChar"/>
-        </w:rPr>
-        <w:t xml:space="preserve">temps_scenario_2.csv</w:t>
-      </w:r>
-      <w:r>
-        <w:t xml:space="preserve">,</w:t>
-      </w:r>
-      <w:r>
-        <w:t xml:space="preserve"> </w:t>
-      </w:r>
-      <w:r>
-        <w:rPr>
-          <w:rStyle w:val="VerbatimChar"/>
-        </w:rPr>
-        <w:t xml:space="preserve">decomposition_gains.csv</w:t>
-      </w:r>
-      <w:r>
-        <w:t xml:space="preserve">).</w:t>
+        <w:t xml:space="preserve">Les tranches sont des attributions qui somment au gain, pas des mesures indépendantes. La signalisation apparaît dans deux postes : comme condition du changement de classe, où son effet sur la vitesse est mesuré, et comme levier de capacité dans la cohabitation, où son effet n’est pas isolé de celui du doublement et de l’arbitrage. Le pendulaire et les zones urbaines sont comptés sous la classe actuelle (153 km/h) ; le changement de classe est ce que l’interurbain rapporte en plus une fois le plafond porté à 201 km/h. Les temps de base sans marge et la méthode d’attribution sont dans le visualiseur de données joint.</w:t>
       </w:r>
     </w:p>
     <w:p>
@@ -6194,16 +6173,7 @@
         <w:t xml:space="preserve">)</w:t>
       </w:r>
       <w:r>
-        <w:t xml:space="preserve">, au même service avec les mêmes arrêts sur l’emprise optimisée, avec une rame pendulaire. Un train de VIA qui passerait sans s’arrêter y serait en 19 minutes. Le gros du gain se trouve entre Drummondville et Québec, sur la subdivision Drummondville, là où la voie est simple et la marge de l’horaire la plus forte : ce segment passerait de 2 h 08 à 1 h 23. Le détail est dans l’annexe numérique (</w:t>
-      </w:r>
-      <w:r>
-        <w:rPr>
-          <w:rStyle w:val="VerbatimChar"/>
-        </w:rPr>
-        <w:t xml:space="preserve">sous_sections_montreal_quebec.csv</w:t>
-      </w:r>
-      <w:r>
-        <w:t xml:space="preserve">).</w:t>
+        <w:t xml:space="preserve">, au même service avec les mêmes arrêts sur l’emprise optimisée, avec une rame pendulaire. Un train de VIA qui passerait sans s’arrêter y serait en 19 minutes. Le gros du gain se trouve entre Drummondville et Québec, sur la subdivision Drummondville, là où la voie est simple et la marge de l’horaire la plus forte : ce segment passerait de 2 h 08 à 1 h 23.</w:t>
       </w:r>
     </w:p>
     <w:p>

</xml_diff>

<commit_message>
Annexe : note expliquant la classe 5* (90 mi/h en classe 5, 100 mi/h pour les LRC)
Co-Authored-By: Claude Fable 5.1 <noreply@anthropic.com>
</commit_message>
<xml_diff>
--- a/livrables/rapport_corridor.docx
+++ b/livrables/rapport_corridor.docx
@@ -7004,6 +7004,14 @@
       </w:pPr>
       <w:r>
         <w:t xml:space="preserve">Il faut également souligner qu’au Canada, le réseau ferroviaire est encore loin d’exploiter tout le potentiel associé à une infrastructure répondant aux exigences d’une voie de classe 6 ou 7, car seule la classe 5* est permise au Canada, permettant notamment des vitesses pouvant atteindre environ 100 mi/h pour les trains de voyageurs, selon les conditions et normes applicables. Pour les trains de marchandises, les vitesses demeurent nécessairement plus faibles.</w:t>
+      </w:r>
+    </w:p>
+    <w:p>
+      <w:pPr>
+        <w:pStyle w:val="BodyText"/>
+      </w:pPr>
+      <w:r>
+        <w:t xml:space="preserve">* La classe 5 permet 90 mi/h aux trains de voyageurs. La classe 5* porte cette limite à 100 mi/h pour les trains de type LRC.</w:t>
       </w:r>
     </w:p>
     <w:p>

</xml_diff>